<commit_message>
Add Sections 4 and 5: technical goals, community impact and ethics
Section 4 defines three measurable goals (sign recognition with
abstention, confirmed multilingual speech, offline embedded integration)
and a responsibilities table with names left to be assigned. Section 5
covers community impact and the main ethical issues, citing the ADA and
the IEEE Code of Ethics, and commits to contacting the ASL community at
NJIT. Updates the combined proposal, bibliography and project notes.

Co-Authored-By: Claude Opus 5.5 <noreply@anthropic.com>
Claude-Session: https://claude.ai/code/session_01Ghe1P8BgNsyGdHuD4xCbdv
</commit_message>
<xml_diff>
--- a/docs/ECE_414_Proposal_Draft.docx
+++ b/docs/ECE_414_Proposal_Draft.docx
@@ -2987,6 +2987,2044 @@
           <w:sz w:val="24"/>
           <w:szCs w:val="24"/>
         </w:rPr>
+        <w:t xml:space="preserve">4. Technical Goals</w:t>
+      </w:r>
+    </w:p>
+    <w:p>
+      <w:pPr>
+        <w:spacing w:after="120" w:line="360"/>
+        <w:ind w:firstLine="720"/>
+        <w:jc w:val="both"/>
+      </w:pPr>
+      <w:r>
+        <w:rPr>
+          <w:rFonts w:ascii="Times New Roman" w:cs="Times New Roman" w:eastAsia="Times New Roman" w:hAnsi="Times New Roman"/>
+          <w:sz w:val="24"/>
+          <w:szCs w:val="24"/>
+        </w:rPr>
+        <w:t xml:space="preserve">The project has three technical goals. Each has a measurable target that will be used to validate the prototype, consistent with the design targets in Table 1. Table 3 lists the team members responsible for each goal.</w:t>
+      </w:r>
+    </w:p>
+    <w:p>
+      <w:pPr>
+        <w:pStyle w:val="IntroSubsection"/>
+        <w:keepNext/>
+        <w:spacing w:after="100" w:before="200"/>
+      </w:pPr>
+      <w:r>
+        <w:rPr>
+          <w:rFonts w:ascii="Times New Roman" w:cs="Times New Roman" w:eastAsia="Times New Roman" w:hAnsi="Times New Roman"/>
+          <w:b/>
+          <w:bCs/>
+          <w:sz w:val="24"/>
+          <w:szCs w:val="24"/>
+        </w:rPr>
+        <w:t xml:space="preserve">4.1 Goal 1: Sign Recognition with Abstention</w:t>
+      </w:r>
+    </w:p>
+    <w:p>
+      <w:pPr>
+        <w:spacing w:after="120" w:line="360"/>
+        <w:ind w:firstLine="720"/>
+        <w:jc w:val="both"/>
+      </w:pPr>
+      <w:r>
+        <w:rPr>
+          <w:rFonts w:ascii="Times New Roman" w:cs="Times New Roman" w:eastAsia="Times New Roman" w:hAnsi="Times New Roman"/>
+          <w:sz w:val="24"/>
+          <w:szCs w:val="24"/>
+        </w:rPr>
+        <w:t xml:space="preserve">The first goal is to recognize a vocabulary of 100–250 ASL signs, chosen for the service-counter setting, from body and hand landmarks captured by a single RGB camera. The target is at least 75% top-1 and 90% top-5 accuracy on signers not seen during training, measured on the ASL Citizen test split and on our own recordings [2]. The recognizer must also produce reliable confidence scores so that the device can abstain on uncertain signs. We will therefore report both the accuracy on the signs the device accepts and the share of signs it accepts, using risk–coverage analysis [14]. This goal covers vocabulary selection, landmark extraction, rest-pose segmentation, model training and confidence calibration.</w:t>
+      </w:r>
+    </w:p>
+    <w:p>
+      <w:pPr>
+        <w:pStyle w:val="IntroSubsection"/>
+        <w:keepNext/>
+        <w:spacing w:after="100" w:before="200"/>
+      </w:pPr>
+      <w:r>
+        <w:rPr>
+          <w:rFonts w:ascii="Times New Roman" w:cs="Times New Roman" w:eastAsia="Times New Roman" w:hAnsi="Times New Roman"/>
+          <w:b/>
+          <w:bCs/>
+          <w:sz w:val="24"/>
+          <w:szCs w:val="24"/>
+        </w:rPr>
+        <w:t xml:space="preserve">4.2 Goal 2: Confirmed Multilingual Speech and Two-Way Conversation</w:t>
+      </w:r>
+    </w:p>
+    <w:p>
+      <w:pPr>
+        <w:spacing w:after="120" w:line="360"/>
+        <w:ind w:firstLine="720"/>
+        <w:jc w:val="both"/>
+      </w:pPr>
+      <w:r>
+        <w:rPr>
+          <w:rFonts w:ascii="Times New Roman" w:cs="Times New Roman" w:eastAsia="Times New Roman" w:hAnsi="Times New Roman"/>
+          <w:sz w:val="24"/>
+          <w:szCs w:val="24"/>
+        </w:rPr>
+        <w:t xml:space="preserve">The second goal is to turn recognized signs into an English sentence, let the user confirm or edit it on the touchscreen, translate it into Turkish or Spanish when selected, and speak it aloud. In the other direction, the hearing person's speech is converted into English text on the same screen. The target is less than 1.2 s from the user's confirmation to the start of speech. Translation quality will be checked on a fixed test set of service-counter phrases, rated by native Turkish and Spanish speakers.</w:t>
+      </w:r>
+    </w:p>
+    <w:p>
+      <w:pPr>
+        <w:pStyle w:val="IntroSubsection"/>
+        <w:keepNext/>
+        <w:spacing w:after="100" w:before="200"/>
+      </w:pPr>
+      <w:r>
+        <w:rPr>
+          <w:rFonts w:ascii="Times New Roman" w:cs="Times New Roman" w:eastAsia="Times New Roman" w:hAnsi="Times New Roman"/>
+          <w:b/>
+          <w:bCs/>
+          <w:sz w:val="24"/>
+          <w:szCs w:val="24"/>
+        </w:rPr>
+        <w:t xml:space="preserve">4.3 Goal 3: Offline Embedded Integration</w:t>
+      </w:r>
+    </w:p>
+    <w:p>
+      <w:pPr>
+        <w:spacing w:after="120" w:line="360"/>
+        <w:ind w:firstLine="720"/>
+        <w:jc w:val="both"/>
+      </w:pPr>
+      <w:r>
+        <w:rPr>
+          <w:rFonts w:ascii="Times New Roman" w:cs="Times New Roman" w:eastAsia="Times New Roman" w:hAnsi="Times New Roman"/>
+          <w:sz w:val="24"/>
+          <w:szCs w:val="24"/>
+        </w:rPr>
+        <w:t xml:space="preserve">The third goal is to run the complete system on an NVIDIA Jetson Orin Nano in a portable enclosure with a camera, touchscreen, microphone and speaker, without any network connection. The targets are landmark extraction and recognition at no less than 15 frames per second, all models fitting within the module's 8 GB of memory, and a full conversation working with networking disabled. We will also measure the device's power draw in watts to guide the choice of power supply.</w:t>
+      </w:r>
+    </w:p>
+    <w:p>
+      <w:pPr>
+        <w:keepNext/>
+        <w:spacing w:after="120" w:before="240"/>
+        <w:jc w:val="center"/>
+      </w:pPr>
+      <w:r>
+        <w:rPr>
+          <w:rFonts w:ascii="Times New Roman" w:cs="Times New Roman" w:eastAsia="Times New Roman" w:hAnsi="Times New Roman"/>
+          <w:b/>
+          <w:bCs/>
+          <w:sz w:val="20"/>
+          <w:szCs w:val="20"/>
+        </w:rPr>
+        <w:t xml:space="preserve">Table 3. </w:t>
+      </w:r>
+      <w:r>
+        <w:rPr>
+          <w:rFonts w:ascii="Times New Roman" w:cs="Times New Roman" w:eastAsia="Times New Roman" w:hAnsi="Times New Roman"/>
+          <w:sz w:val="20"/>
+          <w:szCs w:val="20"/>
+        </w:rPr>
+        <w:t xml:space="preserve">Team responsibilities for the technical goals. Each member leads one area and supports another, so every goal has at least two people familiar with it.</w:t>
+      </w:r>
+    </w:p>
+    <w:tbl>
+      <w:tblPr>
+        <w:tblW w:type="dxa" w:w="9360"/>
+        <w:tblBorders>
+          <w:top w:val="single" w:color="auto" w:sz="4"/>
+          <w:left w:val="single" w:color="auto" w:sz="4"/>
+          <w:bottom w:val="single" w:color="auto" w:sz="4"/>
+          <w:right w:val="single" w:color="auto" w:sz="4"/>
+          <w:insideH w:val="single" w:color="auto" w:sz="4"/>
+          <w:insideV w:val="single" w:color="auto" w:sz="4"/>
+        </w:tblBorders>
+      </w:tblPr>
+      <w:tblGrid>
+        <w:gridCol w:w="1900"/>
+        <w:gridCol w:w="1300"/>
+        <w:gridCol w:w="1300"/>
+        <w:gridCol w:w="4860"/>
+      </w:tblGrid>
+      <w:tr>
+        <w:trPr>
+          <w:cantSplit/>
+          <w:tblHeader/>
+        </w:trPr>
+        <w:tc>
+          <w:tcPr>
+            <w:tcW w:type="dxa" w:w="1900"/>
+            <w:tcBorders>
+              <w:top w:val="single" w:color="000000" w:sz="12"/>
+              <w:left w:val="none" w:color="FFFFFF" w:sz="0"/>
+              <w:bottom w:val="single" w:color="000000" w:sz="4"/>
+              <w:right w:val="none" w:color="FFFFFF" w:sz="0"/>
+            </w:tcBorders>
+            <w:tcMar>
+              <w:top w:type="dxa" w:w="80"/>
+              <w:left w:type="dxa" w:w="80"/>
+              <w:bottom w:type="dxa" w:w="80"/>
+              <w:right w:type="dxa" w:w="80"/>
+            </w:tcMar>
+          </w:tcPr>
+          <w:p>
+            <w:pPr>
+              <w:keepNext/>
+            </w:pPr>
+            <w:r>
+              <w:rPr>
+                <w:rFonts w:ascii="Times New Roman" w:cs="Times New Roman" w:eastAsia="Times New Roman" w:hAnsi="Times New Roman"/>
+                <w:b/>
+                <w:bCs/>
+                <w:i w:val="false"/>
+                <w:iCs w:val="false"/>
+                <w:sz w:val="20"/>
+                <w:szCs w:val="20"/>
+              </w:rPr>
+              <w:t xml:space="preserve">Goal</w:t>
+            </w:r>
+          </w:p>
+        </w:tc>
+        <w:tc>
+          <w:tcPr>
+            <w:tcW w:type="dxa" w:w="1300"/>
+            <w:tcBorders>
+              <w:top w:val="single" w:color="000000" w:sz="12"/>
+              <w:left w:val="none" w:color="FFFFFF" w:sz="0"/>
+              <w:bottom w:val="single" w:color="000000" w:sz="4"/>
+              <w:right w:val="none" w:color="FFFFFF" w:sz="0"/>
+            </w:tcBorders>
+            <w:tcMar>
+              <w:top w:type="dxa" w:w="80"/>
+              <w:left w:type="dxa" w:w="80"/>
+              <w:bottom w:type="dxa" w:w="80"/>
+              <w:right w:type="dxa" w:w="80"/>
+            </w:tcMar>
+          </w:tcPr>
+          <w:p>
+            <w:pPr>
+              <w:keepNext/>
+            </w:pPr>
+            <w:r>
+              <w:rPr>
+                <w:rFonts w:ascii="Times New Roman" w:cs="Times New Roman" w:eastAsia="Times New Roman" w:hAnsi="Times New Roman"/>
+                <w:b/>
+                <w:bCs/>
+                <w:i w:val="false"/>
+                <w:iCs w:val="false"/>
+                <w:sz w:val="20"/>
+                <w:szCs w:val="20"/>
+              </w:rPr>
+              <w:t xml:space="preserve">Lead</w:t>
+            </w:r>
+          </w:p>
+        </w:tc>
+        <w:tc>
+          <w:tcPr>
+            <w:tcW w:type="dxa" w:w="1300"/>
+            <w:tcBorders>
+              <w:top w:val="single" w:color="000000" w:sz="12"/>
+              <w:left w:val="none" w:color="FFFFFF" w:sz="0"/>
+              <w:bottom w:val="single" w:color="000000" w:sz="4"/>
+              <w:right w:val="none" w:color="FFFFFF" w:sz="0"/>
+            </w:tcBorders>
+            <w:tcMar>
+              <w:top w:type="dxa" w:w="80"/>
+              <w:left w:type="dxa" w:w="80"/>
+              <w:bottom w:type="dxa" w:w="80"/>
+              <w:right w:type="dxa" w:w="80"/>
+            </w:tcMar>
+          </w:tcPr>
+          <w:p>
+            <w:pPr>
+              <w:keepNext/>
+            </w:pPr>
+            <w:r>
+              <w:rPr>
+                <w:rFonts w:ascii="Times New Roman" w:cs="Times New Roman" w:eastAsia="Times New Roman" w:hAnsi="Times New Roman"/>
+                <w:b/>
+                <w:bCs/>
+                <w:i w:val="false"/>
+                <w:iCs w:val="false"/>
+                <w:sz w:val="20"/>
+                <w:szCs w:val="20"/>
+              </w:rPr>
+              <w:t xml:space="preserve">Support</w:t>
+            </w:r>
+          </w:p>
+        </w:tc>
+        <w:tc>
+          <w:tcPr>
+            <w:tcW w:type="dxa" w:w="4860"/>
+            <w:tcBorders>
+              <w:top w:val="single" w:color="000000" w:sz="12"/>
+              <w:left w:val="none" w:color="FFFFFF" w:sz="0"/>
+              <w:bottom w:val="single" w:color="000000" w:sz="4"/>
+              <w:right w:val="none" w:color="FFFFFF" w:sz="0"/>
+            </w:tcBorders>
+            <w:tcMar>
+              <w:top w:type="dxa" w:w="80"/>
+              <w:left w:type="dxa" w:w="80"/>
+              <w:bottom w:type="dxa" w:w="80"/>
+              <w:right w:type="dxa" w:w="80"/>
+            </w:tcMar>
+          </w:tcPr>
+          <w:p>
+            <w:pPr>
+              <w:keepNext/>
+            </w:pPr>
+            <w:r>
+              <w:rPr>
+                <w:rFonts w:ascii="Times New Roman" w:cs="Times New Roman" w:eastAsia="Times New Roman" w:hAnsi="Times New Roman"/>
+                <w:b/>
+                <w:bCs/>
+                <w:i w:val="false"/>
+                <w:iCs w:val="false"/>
+                <w:sz w:val="20"/>
+                <w:szCs w:val="20"/>
+              </w:rPr>
+              <w:t xml:space="preserve">Main tasks</w:t>
+            </w:r>
+          </w:p>
+        </w:tc>
+      </w:tr>
+      <w:tr>
+        <w:trPr>
+          <w:cantSplit/>
+          <w:tblHeader w:val="false"/>
+        </w:trPr>
+        <w:tc>
+          <w:tcPr>
+            <w:tcW w:type="dxa" w:w="1900"/>
+            <w:tcBorders>
+              <w:top w:val="single" w:color="000000" w:sz="4"/>
+              <w:left w:val="none" w:color="FFFFFF" w:sz="0"/>
+              <w:bottom w:val="none" w:color="FFFFFF" w:sz="0"/>
+              <w:right w:val="none" w:color="FFFFFF" w:sz="0"/>
+            </w:tcBorders>
+            <w:tcMar>
+              <w:top w:type="dxa" w:w="50"/>
+              <w:left w:type="dxa" w:w="80"/>
+              <w:bottom w:type="dxa" w:w="50"/>
+              <w:right w:type="dxa" w:w="80"/>
+            </w:tcMar>
+          </w:tcPr>
+          <w:p>
+            <w:pPr>
+              <w:keepNext/>
+            </w:pPr>
+            <w:r>
+              <w:rPr>
+                <w:rFonts w:ascii="Times New Roman" w:cs="Times New Roman" w:eastAsia="Times New Roman" w:hAnsi="Times New Roman"/>
+                <w:b w:val="false"/>
+                <w:bCs w:val="false"/>
+                <w:i w:val="false"/>
+                <w:iCs w:val="false"/>
+                <w:sz w:val="20"/>
+                <w:szCs w:val="20"/>
+              </w:rPr>
+              <w:t xml:space="preserve">1. Sign recognition</w:t>
+            </w:r>
+          </w:p>
+        </w:tc>
+        <w:tc>
+          <w:tcPr>
+            <w:tcW w:type="dxa" w:w="1300"/>
+            <w:tcBorders>
+              <w:top w:val="single" w:color="000000" w:sz="4"/>
+              <w:left w:val="none" w:color="FFFFFF" w:sz="0"/>
+              <w:bottom w:val="none" w:color="FFFFFF" w:sz="0"/>
+              <w:right w:val="none" w:color="FFFFFF" w:sz="0"/>
+            </w:tcBorders>
+            <w:tcMar>
+              <w:top w:type="dxa" w:w="50"/>
+              <w:left w:type="dxa" w:w="80"/>
+              <w:bottom w:type="dxa" w:w="50"/>
+              <w:right w:type="dxa" w:w="80"/>
+            </w:tcMar>
+          </w:tcPr>
+          <w:p>
+            <w:pPr>
+              <w:keepNext/>
+            </w:pPr>
+            <w:r>
+              <w:rPr>
+                <w:rFonts w:ascii="Times New Roman" w:cs="Times New Roman" w:eastAsia="Times New Roman" w:hAnsi="Times New Roman"/>
+                <w:b w:val="false"/>
+                <w:bCs w:val="false"/>
+                <w:i w:val="false"/>
+                <w:iCs w:val="false"/>
+                <w:sz w:val="20"/>
+                <w:szCs w:val="20"/>
+              </w:rPr>
+              <w:t xml:space="preserve">To be assigned</w:t>
+            </w:r>
+          </w:p>
+        </w:tc>
+        <w:tc>
+          <w:tcPr>
+            <w:tcW w:type="dxa" w:w="1300"/>
+            <w:tcBorders>
+              <w:top w:val="single" w:color="000000" w:sz="4"/>
+              <w:left w:val="none" w:color="FFFFFF" w:sz="0"/>
+              <w:bottom w:val="none" w:color="FFFFFF" w:sz="0"/>
+              <w:right w:val="none" w:color="FFFFFF" w:sz="0"/>
+            </w:tcBorders>
+            <w:tcMar>
+              <w:top w:type="dxa" w:w="50"/>
+              <w:left w:type="dxa" w:w="80"/>
+              <w:bottom w:type="dxa" w:w="50"/>
+              <w:right w:type="dxa" w:w="80"/>
+            </w:tcMar>
+          </w:tcPr>
+          <w:p>
+            <w:pPr>
+              <w:keepNext/>
+            </w:pPr>
+            <w:r>
+              <w:rPr>
+                <w:rFonts w:ascii="Times New Roman" w:cs="Times New Roman" w:eastAsia="Times New Roman" w:hAnsi="Times New Roman"/>
+                <w:b w:val="false"/>
+                <w:bCs w:val="false"/>
+                <w:i w:val="false"/>
+                <w:iCs w:val="false"/>
+                <w:sz w:val="20"/>
+                <w:szCs w:val="20"/>
+              </w:rPr>
+              <w:t xml:space="preserve">To be assigned</w:t>
+            </w:r>
+          </w:p>
+        </w:tc>
+        <w:tc>
+          <w:tcPr>
+            <w:tcW w:type="dxa" w:w="4860"/>
+            <w:tcBorders>
+              <w:top w:val="single" w:color="000000" w:sz="4"/>
+              <w:left w:val="none" w:color="FFFFFF" w:sz="0"/>
+              <w:bottom w:val="none" w:color="FFFFFF" w:sz="0"/>
+              <w:right w:val="none" w:color="FFFFFF" w:sz="0"/>
+            </w:tcBorders>
+            <w:tcMar>
+              <w:top w:type="dxa" w:w="50"/>
+              <w:left w:type="dxa" w:w="80"/>
+              <w:bottom w:type="dxa" w:w="50"/>
+              <w:right w:type="dxa" w:w="80"/>
+            </w:tcMar>
+          </w:tcPr>
+          <w:p>
+            <w:pPr>
+              <w:keepNext/>
+            </w:pPr>
+            <w:r>
+              <w:rPr>
+                <w:rFonts w:ascii="Times New Roman" w:cs="Times New Roman" w:eastAsia="Times New Roman" w:hAnsi="Times New Roman"/>
+                <w:b w:val="false"/>
+                <w:bCs w:val="false"/>
+                <w:i w:val="false"/>
+                <w:iCs w:val="false"/>
+                <w:sz w:val="20"/>
+                <w:szCs w:val="20"/>
+              </w:rPr>
+              <w:t xml:space="preserve">Vocabulary selection, landmark extraction, rest-pose segmentation, model training, confidence calibration, accuracy evaluation</w:t>
+            </w:r>
+          </w:p>
+        </w:tc>
+      </w:tr>
+      <w:tr>
+        <w:trPr>
+          <w:cantSplit/>
+          <w:tblHeader w:val="false"/>
+        </w:trPr>
+        <w:tc>
+          <w:tcPr>
+            <w:tcW w:type="dxa" w:w="1900"/>
+            <w:tcBorders>
+              <w:top w:val="none" w:color="FFFFFF" w:sz="0"/>
+              <w:left w:val="none" w:color="FFFFFF" w:sz="0"/>
+              <w:bottom w:val="none" w:color="FFFFFF" w:sz="0"/>
+              <w:right w:val="none" w:color="FFFFFF" w:sz="0"/>
+            </w:tcBorders>
+            <w:tcMar>
+              <w:top w:type="dxa" w:w="50"/>
+              <w:left w:type="dxa" w:w="80"/>
+              <w:bottom w:type="dxa" w:w="50"/>
+              <w:right w:type="dxa" w:w="80"/>
+            </w:tcMar>
+          </w:tcPr>
+          <w:p>
+            <w:pPr>
+              <w:keepNext/>
+            </w:pPr>
+            <w:r>
+              <w:rPr>
+                <w:rFonts w:ascii="Times New Roman" w:cs="Times New Roman" w:eastAsia="Times New Roman" w:hAnsi="Times New Roman"/>
+                <w:b w:val="false"/>
+                <w:bCs w:val="false"/>
+                <w:i w:val="false"/>
+                <w:iCs w:val="false"/>
+                <w:sz w:val="20"/>
+                <w:szCs w:val="20"/>
+              </w:rPr>
+              <w:t xml:space="preserve">2. Language and speech</w:t>
+            </w:r>
+          </w:p>
+        </w:tc>
+        <w:tc>
+          <w:tcPr>
+            <w:tcW w:type="dxa" w:w="1300"/>
+            <w:tcBorders>
+              <w:top w:val="none" w:color="FFFFFF" w:sz="0"/>
+              <w:left w:val="none" w:color="FFFFFF" w:sz="0"/>
+              <w:bottom w:val="none" w:color="FFFFFF" w:sz="0"/>
+              <w:right w:val="none" w:color="FFFFFF" w:sz="0"/>
+            </w:tcBorders>
+            <w:tcMar>
+              <w:top w:type="dxa" w:w="50"/>
+              <w:left w:type="dxa" w:w="80"/>
+              <w:bottom w:type="dxa" w:w="50"/>
+              <w:right w:type="dxa" w:w="80"/>
+            </w:tcMar>
+          </w:tcPr>
+          <w:p>
+            <w:pPr>
+              <w:keepNext/>
+            </w:pPr>
+            <w:r>
+              <w:rPr>
+                <w:rFonts w:ascii="Times New Roman" w:cs="Times New Roman" w:eastAsia="Times New Roman" w:hAnsi="Times New Roman"/>
+                <w:b w:val="false"/>
+                <w:bCs w:val="false"/>
+                <w:i w:val="false"/>
+                <w:iCs w:val="false"/>
+                <w:sz w:val="20"/>
+                <w:szCs w:val="20"/>
+              </w:rPr>
+              <w:t xml:space="preserve">To be assigned</w:t>
+            </w:r>
+          </w:p>
+        </w:tc>
+        <w:tc>
+          <w:tcPr>
+            <w:tcW w:type="dxa" w:w="1300"/>
+            <w:tcBorders>
+              <w:top w:val="none" w:color="FFFFFF" w:sz="0"/>
+              <w:left w:val="none" w:color="FFFFFF" w:sz="0"/>
+              <w:bottom w:val="none" w:color="FFFFFF" w:sz="0"/>
+              <w:right w:val="none" w:color="FFFFFF" w:sz="0"/>
+            </w:tcBorders>
+            <w:tcMar>
+              <w:top w:type="dxa" w:w="50"/>
+              <w:left w:type="dxa" w:w="80"/>
+              <w:bottom w:type="dxa" w:w="50"/>
+              <w:right w:type="dxa" w:w="80"/>
+            </w:tcMar>
+          </w:tcPr>
+          <w:p>
+            <w:pPr>
+              <w:keepNext/>
+            </w:pPr>
+            <w:r>
+              <w:rPr>
+                <w:rFonts w:ascii="Times New Roman" w:cs="Times New Roman" w:eastAsia="Times New Roman" w:hAnsi="Times New Roman"/>
+                <w:b w:val="false"/>
+                <w:bCs w:val="false"/>
+                <w:i w:val="false"/>
+                <w:iCs w:val="false"/>
+                <w:sz w:val="20"/>
+                <w:szCs w:val="20"/>
+              </w:rPr>
+              <w:t xml:space="preserve">To be assigned</w:t>
+            </w:r>
+          </w:p>
+        </w:tc>
+        <w:tc>
+          <w:tcPr>
+            <w:tcW w:type="dxa" w:w="4860"/>
+            <w:tcBorders>
+              <w:top w:val="none" w:color="FFFFFF" w:sz="0"/>
+              <w:left w:val="none" w:color="FFFFFF" w:sz="0"/>
+              <w:bottom w:val="none" w:color="FFFFFF" w:sz="0"/>
+              <w:right w:val="none" w:color="FFFFFF" w:sz="0"/>
+            </w:tcBorders>
+            <w:tcMar>
+              <w:top w:type="dxa" w:w="50"/>
+              <w:left w:type="dxa" w:w="80"/>
+              <w:bottom w:type="dxa" w:w="50"/>
+              <w:right w:type="dxa" w:w="80"/>
+            </w:tcMar>
+          </w:tcPr>
+          <w:p>
+            <w:pPr>
+              <w:keepNext/>
+            </w:pPr>
+            <w:r>
+              <w:rPr>
+                <w:rFonts w:ascii="Times New Roman" w:cs="Times New Roman" w:eastAsia="Times New Roman" w:hAnsi="Times New Roman"/>
+                <w:b w:val="false"/>
+                <w:bCs w:val="false"/>
+                <w:i w:val="false"/>
+                <w:iCs w:val="false"/>
+                <w:sz w:val="20"/>
+                <w:szCs w:val="20"/>
+              </w:rPr>
+              <w:t xml:space="preserve">Sentence builder, touchscreen interface, translation, text-to-speech, speech recognition, latency measurement</w:t>
+            </w:r>
+          </w:p>
+        </w:tc>
+      </w:tr>
+      <w:tr>
+        <w:trPr>
+          <w:cantSplit/>
+          <w:tblHeader w:val="false"/>
+        </w:trPr>
+        <w:tc>
+          <w:tcPr>
+            <w:tcW w:type="dxa" w:w="1900"/>
+            <w:tcBorders>
+              <w:top w:val="none" w:color="FFFFFF" w:sz="0"/>
+              <w:left w:val="none" w:color="FFFFFF" w:sz="0"/>
+              <w:bottom w:val="none" w:color="FFFFFF" w:sz="0"/>
+              <w:right w:val="none" w:color="FFFFFF" w:sz="0"/>
+            </w:tcBorders>
+            <w:tcMar>
+              <w:top w:type="dxa" w:w="50"/>
+              <w:left w:type="dxa" w:w="80"/>
+              <w:bottom w:type="dxa" w:w="50"/>
+              <w:right w:type="dxa" w:w="80"/>
+            </w:tcMar>
+          </w:tcPr>
+          <w:p>
+            <w:pPr>
+              <w:keepNext/>
+            </w:pPr>
+            <w:r>
+              <w:rPr>
+                <w:rFonts w:ascii="Times New Roman" w:cs="Times New Roman" w:eastAsia="Times New Roman" w:hAnsi="Times New Roman"/>
+                <w:b w:val="false"/>
+                <w:bCs w:val="false"/>
+                <w:i w:val="false"/>
+                <w:iCs w:val="false"/>
+                <w:sz w:val="20"/>
+                <w:szCs w:val="20"/>
+              </w:rPr>
+              <w:t xml:space="preserve">3. Embedded integration</w:t>
+            </w:r>
+          </w:p>
+        </w:tc>
+        <w:tc>
+          <w:tcPr>
+            <w:tcW w:type="dxa" w:w="1300"/>
+            <w:tcBorders>
+              <w:top w:val="none" w:color="FFFFFF" w:sz="0"/>
+              <w:left w:val="none" w:color="FFFFFF" w:sz="0"/>
+              <w:bottom w:val="none" w:color="FFFFFF" w:sz="0"/>
+              <w:right w:val="none" w:color="FFFFFF" w:sz="0"/>
+            </w:tcBorders>
+            <w:tcMar>
+              <w:top w:type="dxa" w:w="50"/>
+              <w:left w:type="dxa" w:w="80"/>
+              <w:bottom w:type="dxa" w:w="50"/>
+              <w:right w:type="dxa" w:w="80"/>
+            </w:tcMar>
+          </w:tcPr>
+          <w:p>
+            <w:pPr>
+              <w:keepNext/>
+            </w:pPr>
+            <w:r>
+              <w:rPr>
+                <w:rFonts w:ascii="Times New Roman" w:cs="Times New Roman" w:eastAsia="Times New Roman" w:hAnsi="Times New Roman"/>
+                <w:b w:val="false"/>
+                <w:bCs w:val="false"/>
+                <w:i w:val="false"/>
+                <w:iCs w:val="false"/>
+                <w:sz w:val="20"/>
+                <w:szCs w:val="20"/>
+              </w:rPr>
+              <w:t xml:space="preserve">To be assigned</w:t>
+            </w:r>
+          </w:p>
+        </w:tc>
+        <w:tc>
+          <w:tcPr>
+            <w:tcW w:type="dxa" w:w="1300"/>
+            <w:tcBorders>
+              <w:top w:val="none" w:color="FFFFFF" w:sz="0"/>
+              <w:left w:val="none" w:color="FFFFFF" w:sz="0"/>
+              <w:bottom w:val="none" w:color="FFFFFF" w:sz="0"/>
+              <w:right w:val="none" w:color="FFFFFF" w:sz="0"/>
+            </w:tcBorders>
+            <w:tcMar>
+              <w:top w:type="dxa" w:w="50"/>
+              <w:left w:type="dxa" w:w="80"/>
+              <w:bottom w:type="dxa" w:w="50"/>
+              <w:right w:type="dxa" w:w="80"/>
+            </w:tcMar>
+          </w:tcPr>
+          <w:p>
+            <w:pPr>
+              <w:keepNext/>
+            </w:pPr>
+            <w:r>
+              <w:rPr>
+                <w:rFonts w:ascii="Times New Roman" w:cs="Times New Roman" w:eastAsia="Times New Roman" w:hAnsi="Times New Roman"/>
+                <w:b w:val="false"/>
+                <w:bCs w:val="false"/>
+                <w:i w:val="false"/>
+                <w:iCs w:val="false"/>
+                <w:sz w:val="20"/>
+                <w:szCs w:val="20"/>
+              </w:rPr>
+              <w:t xml:space="preserve">To be assigned</w:t>
+            </w:r>
+          </w:p>
+        </w:tc>
+        <w:tc>
+          <w:tcPr>
+            <w:tcW w:type="dxa" w:w="4860"/>
+            <w:tcBorders>
+              <w:top w:val="none" w:color="FFFFFF" w:sz="0"/>
+              <w:left w:val="none" w:color="FFFFFF" w:sz="0"/>
+              <w:bottom w:val="none" w:color="FFFFFF" w:sz="0"/>
+              <w:right w:val="none" w:color="FFFFFF" w:sz="0"/>
+            </w:tcBorders>
+            <w:tcMar>
+              <w:top w:type="dxa" w:w="50"/>
+              <w:left w:type="dxa" w:w="80"/>
+              <w:bottom w:type="dxa" w:w="50"/>
+              <w:right w:type="dxa" w:w="80"/>
+            </w:tcMar>
+          </w:tcPr>
+          <w:p>
+            <w:pPr>
+              <w:keepNext/>
+            </w:pPr>
+            <w:r>
+              <w:rPr>
+                <w:rFonts w:ascii="Times New Roman" w:cs="Times New Roman" w:eastAsia="Times New Roman" w:hAnsi="Times New Roman"/>
+                <w:b w:val="false"/>
+                <w:bCs w:val="false"/>
+                <w:i w:val="false"/>
+                <w:iCs w:val="false"/>
+                <w:sz w:val="20"/>
+                <w:szCs w:val="20"/>
+              </w:rPr>
+              <w:t xml:space="preserve">Hardware purchase and setup, enclosure, deployment on the Jetson Orin Nano, frame-rate and power measurement</w:t>
+            </w:r>
+          </w:p>
+        </w:tc>
+      </w:tr>
+      <w:tr>
+        <w:trPr>
+          <w:cantSplit/>
+          <w:tblHeader w:val="false"/>
+        </w:trPr>
+        <w:tc>
+          <w:tcPr>
+            <w:tcW w:type="dxa" w:w="1900"/>
+            <w:tcBorders>
+              <w:top w:val="none" w:color="FFFFFF" w:sz="0"/>
+              <w:left w:val="none" w:color="FFFFFF" w:sz="0"/>
+              <w:bottom w:val="single" w:color="000000" w:sz="12"/>
+              <w:right w:val="none" w:color="FFFFFF" w:sz="0"/>
+            </w:tcBorders>
+            <w:tcMar>
+              <w:top w:type="dxa" w:w="50"/>
+              <w:left w:type="dxa" w:w="80"/>
+              <w:bottom w:type="dxa" w:w="50"/>
+              <w:right w:type="dxa" w:w="80"/>
+            </w:tcMar>
+          </w:tcPr>
+          <w:p>
+            <w:pPr>
+              <w:keepNext w:val="false"/>
+            </w:pPr>
+            <w:r>
+              <w:rPr>
+                <w:rFonts w:ascii="Times New Roman" w:cs="Times New Roman" w:eastAsia="Times New Roman" w:hAnsi="Times New Roman"/>
+                <w:b w:val="false"/>
+                <w:bCs w:val="false"/>
+                <w:i w:val="false"/>
+                <w:iCs w:val="false"/>
+                <w:sz w:val="20"/>
+                <w:szCs w:val="20"/>
+              </w:rPr>
+              <w:t xml:space="preserve">Project-wide</w:t>
+            </w:r>
+          </w:p>
+        </w:tc>
+        <w:tc>
+          <w:tcPr>
+            <w:tcW w:type="dxa" w:w="1300"/>
+            <w:tcBorders>
+              <w:top w:val="none" w:color="FFFFFF" w:sz="0"/>
+              <w:left w:val="none" w:color="FFFFFF" w:sz="0"/>
+              <w:bottom w:val="single" w:color="000000" w:sz="12"/>
+              <w:right w:val="none" w:color="FFFFFF" w:sz="0"/>
+            </w:tcBorders>
+            <w:tcMar>
+              <w:top w:type="dxa" w:w="50"/>
+              <w:left w:type="dxa" w:w="80"/>
+              <w:bottom w:type="dxa" w:w="50"/>
+              <w:right w:type="dxa" w:w="80"/>
+            </w:tcMar>
+          </w:tcPr>
+          <w:p>
+            <w:pPr>
+              <w:keepNext w:val="false"/>
+            </w:pPr>
+            <w:r>
+              <w:rPr>
+                <w:rFonts w:ascii="Times New Roman" w:cs="Times New Roman" w:eastAsia="Times New Roman" w:hAnsi="Times New Roman"/>
+                <w:b w:val="false"/>
+                <w:bCs w:val="false"/>
+                <w:i w:val="false"/>
+                <w:iCs w:val="false"/>
+                <w:sz w:val="20"/>
+                <w:szCs w:val="20"/>
+              </w:rPr>
+              <w:t xml:space="preserve">To be assigned</w:t>
+            </w:r>
+          </w:p>
+        </w:tc>
+        <w:tc>
+          <w:tcPr>
+            <w:tcW w:type="dxa" w:w="1300"/>
+            <w:tcBorders>
+              <w:top w:val="none" w:color="FFFFFF" w:sz="0"/>
+              <w:left w:val="none" w:color="FFFFFF" w:sz="0"/>
+              <w:bottom w:val="single" w:color="000000" w:sz="12"/>
+              <w:right w:val="none" w:color="FFFFFF" w:sz="0"/>
+            </w:tcBorders>
+            <w:tcMar>
+              <w:top w:type="dxa" w:w="50"/>
+              <w:left w:type="dxa" w:w="80"/>
+              <w:bottom w:type="dxa" w:w="50"/>
+              <w:right w:type="dxa" w:w="80"/>
+            </w:tcMar>
+          </w:tcPr>
+          <w:p>
+            <w:pPr>
+              <w:keepNext w:val="false"/>
+            </w:pPr>
+            <w:r>
+              <w:rPr>
+                <w:rFonts w:ascii="Times New Roman" w:cs="Times New Roman" w:eastAsia="Times New Roman" w:hAnsi="Times New Roman"/>
+                <w:b w:val="false"/>
+                <w:bCs w:val="false"/>
+                <w:i w:val="false"/>
+                <w:iCs w:val="false"/>
+                <w:sz w:val="20"/>
+                <w:szCs w:val="20"/>
+              </w:rPr>
+              <w:t xml:space="preserve">To be assigned</w:t>
+            </w:r>
+          </w:p>
+        </w:tc>
+        <w:tc>
+          <w:tcPr>
+            <w:tcW w:type="dxa" w:w="4860"/>
+            <w:tcBorders>
+              <w:top w:val="none" w:color="FFFFFF" w:sz="0"/>
+              <w:left w:val="none" w:color="FFFFFF" w:sz="0"/>
+              <w:bottom w:val="single" w:color="000000" w:sz="12"/>
+              <w:right w:val="none" w:color="FFFFFF" w:sz="0"/>
+            </w:tcBorders>
+            <w:tcMar>
+              <w:top w:type="dxa" w:w="50"/>
+              <w:left w:type="dxa" w:w="80"/>
+              <w:bottom w:type="dxa" w:w="50"/>
+              <w:right w:type="dxa" w:w="80"/>
+            </w:tcMar>
+          </w:tcPr>
+          <w:p>
+            <w:pPr>
+              <w:keepNext w:val="false"/>
+            </w:pPr>
+            <w:r>
+              <w:rPr>
+                <w:rFonts w:ascii="Times New Roman" w:cs="Times New Roman" w:eastAsia="Times New Roman" w:hAnsi="Times New Roman"/>
+                <w:b w:val="false"/>
+                <w:bCs w:val="false"/>
+                <w:i w:val="false"/>
+                <w:iCs w:val="false"/>
+                <w:sz w:val="20"/>
+                <w:szCs w:val="20"/>
+              </w:rPr>
+              <w:t xml:space="preserve">Schedule, reports, user testing with Deaf ASL users, documentation</w:t>
+            </w:r>
+          </w:p>
+        </w:tc>
+      </w:tr>
+    </w:tbl>
+    <w:p>
+      <w:pPr>
+        <w:spacing w:after="240"/>
+      </w:pPr>
+    </w:p>
+    <w:p>
+      <w:pPr>
+        <w:pStyle w:val="IntroSection"/>
+        <w:keepNext/>
+        <w:spacing w:after="120" w:before="240"/>
+      </w:pPr>
+      <w:r>
+        <w:rPr>
+          <w:rFonts w:ascii="Times New Roman" w:cs="Times New Roman" w:eastAsia="Times New Roman" w:hAnsi="Times New Roman"/>
+          <w:b/>
+          <w:bCs/>
+          <w:sz w:val="24"/>
+          <w:szCs w:val="24"/>
+        </w:rPr>
+        <w:t xml:space="preserve">5. Projected Community Impact and Relevant Ethical Issues</w:t>
+      </w:r>
+    </w:p>
+    <w:p>
+      <w:pPr>
+        <w:pStyle w:val="IntroSubsection"/>
+        <w:keepNext/>
+        <w:spacing w:after="100" w:before="200"/>
+      </w:pPr>
+      <w:r>
+        <w:rPr>
+          <w:rFonts w:ascii="Times New Roman" w:cs="Times New Roman" w:eastAsia="Times New Roman" w:hAnsi="Times New Roman"/>
+          <w:b/>
+          <w:bCs/>
+          <w:sz w:val="24"/>
+          <w:szCs w:val="24"/>
+        </w:rPr>
+        <w:t xml:space="preserve">5.1 Community Impact</w:t>
+      </w:r>
+    </w:p>
+    <w:p>
+      <w:pPr>
+        <w:spacing w:after="120" w:line="360"/>
+        <w:ind w:firstLine="720"/>
+        <w:jc w:val="both"/>
+      </w:pPr>
+      <w:r>
+        <w:rPr>
+          <w:rFonts w:ascii="Times New Roman" w:cs="Times New Roman" w:eastAsia="Times New Roman" w:hAnsi="Times New Roman"/>
+          <w:sz w:val="24"/>
+          <w:szCs w:val="24"/>
+        </w:rPr>
+        <w:t xml:space="preserve">The main beneficiaries are Deaf ASL users, whose need for interpreters often goes unmet [1]. The device lets them communicate independently in everyday exchanges, such as at a store counter, a bank or a front desk, or while waiting for an interpreter, instead of writing notes or relying on family members to interpret. Because the spoken output can be in English, Turkish or Spanish, it also serves hearing staff and family members who speak these languages, which matters in multilingual communities such as those in New Jersey.</w:t>
+      </w:r>
+    </w:p>
+    <w:p>
+      <w:pPr>
+        <w:spacing w:after="120" w:line="360"/>
+        <w:ind w:firstLine="720"/>
+        <w:jc w:val="both"/>
+      </w:pPr>
+      <w:r>
+        <w:rPr>
+          <w:rFonts w:ascii="Times New Roman" w:cs="Times New Roman" w:eastAsia="Times New Roman" w:hAnsi="Times New Roman"/>
+          <w:sz w:val="24"/>
+          <w:szCs w:val="24"/>
+        </w:rPr>
+        <w:t xml:space="preserve">Businesses and public services benefit as well. Under the Americans with Disabilities Act (ADA), businesses and nonprofits that serve the public must communicate effectively with people who have communication disabilities [22]. The device does not replace an interpreter when one is required, but it can support short, routine exchanges for which an interpreter is rarely available at short notice. Because it runs offline, it can also be used in rural areas and in places without reliable internet access.</w:t>
+      </w:r>
+    </w:p>
+    <w:p>
+      <w:pPr>
+        <w:spacing w:after="120" w:line="360"/>
+        <w:ind w:firstLine="720"/>
+        <w:jc w:val="both"/>
+      </w:pPr>
+      <w:r>
+        <w:rPr>
+          <w:rFonts w:ascii="Times New Roman" w:cs="Times New Roman" w:eastAsia="Times New Roman" w:hAnsi="Times New Roman"/>
+          <w:sz w:val="24"/>
+          <w:szCs w:val="24"/>
+        </w:rPr>
+        <w:t xml:space="preserve">The design also has environmental benefits. Running on a low-power embedded module instead of cloud servers reduces energy use and avoids continuous video upload. Because the device is built from off-the-shelf, replaceable parts and open-source software, it can be repaired and upgraded rather than discarded.</w:t>
+      </w:r>
+    </w:p>
+    <w:p>
+      <w:pPr>
+        <w:pStyle w:val="IntroSubsection"/>
+        <w:keepNext/>
+        <w:spacing w:after="100" w:before="200"/>
+      </w:pPr>
+      <w:r>
+        <w:rPr>
+          <w:rFonts w:ascii="Times New Roman" w:cs="Times New Roman" w:eastAsia="Times New Roman" w:hAnsi="Times New Roman"/>
+          <w:b/>
+          <w:bCs/>
+          <w:sz w:val="24"/>
+          <w:szCs w:val="24"/>
+        </w:rPr>
+        <w:t xml:space="preserve">5.2 Ethical Issues</w:t>
+      </w:r>
+    </w:p>
+    <w:p>
+      <w:pPr>
+        <w:spacing w:after="120" w:line="360"/>
+        <w:ind w:firstLine="720"/>
+        <w:jc w:val="both"/>
+      </w:pPr>
+      <w:r>
+        <w:rPr>
+          <w:rFonts w:ascii="Times New Roman" w:cs="Times New Roman" w:eastAsia="Times New Roman" w:hAnsi="Times New Roman"/>
+          <w:sz w:val="24"/>
+          <w:szCs w:val="24"/>
+        </w:rPr>
+        <w:t xml:space="preserve">We follow the IEEE Code of Ethics, which asks engineers to hold paramount the safety, health and welfare of the public, to protect the privacy of others, to avoid harm, to treat all persons fairly, and to be honest and realistic in stating claims [23]. Table 4 summarizes the main ethical issues for this project and our response to each.</w:t>
+      </w:r>
+    </w:p>
+    <w:p>
+      <w:pPr>
+        <w:keepNext/>
+        <w:spacing w:after="120" w:before="240"/>
+        <w:jc w:val="center"/>
+      </w:pPr>
+      <w:r>
+        <w:rPr>
+          <w:rFonts w:ascii="Times New Roman" w:cs="Times New Roman" w:eastAsia="Times New Roman" w:hAnsi="Times New Roman"/>
+          <w:b/>
+          <w:bCs/>
+          <w:sz w:val="20"/>
+          <w:szCs w:val="20"/>
+        </w:rPr>
+        <w:t xml:space="preserve">Table 4. </w:t>
+      </w:r>
+      <w:r>
+        <w:rPr>
+          <w:rFonts w:ascii="Times New Roman" w:cs="Times New Roman" w:eastAsia="Times New Roman" w:hAnsi="Times New Roman"/>
+          <w:sz w:val="20"/>
+          <w:szCs w:val="20"/>
+        </w:rPr>
+        <w:t xml:space="preserve">Ethical issues and how the project addresses them.</w:t>
+      </w:r>
+    </w:p>
+    <w:tbl>
+      <w:tblPr>
+        <w:tblW w:type="dxa" w:w="9360"/>
+        <w:tblBorders>
+          <w:top w:val="single" w:color="auto" w:sz="4"/>
+          <w:left w:val="single" w:color="auto" w:sz="4"/>
+          <w:bottom w:val="single" w:color="auto" w:sz="4"/>
+          <w:right w:val="single" w:color="auto" w:sz="4"/>
+          <w:insideH w:val="single" w:color="auto" w:sz="4"/>
+          <w:insideV w:val="single" w:color="auto" w:sz="4"/>
+        </w:tblBorders>
+      </w:tblPr>
+      <w:tblGrid>
+        <w:gridCol w:w="1900"/>
+        <w:gridCol w:w="3500"/>
+        <w:gridCol w:w="3960"/>
+      </w:tblGrid>
+      <w:tr>
+        <w:trPr>
+          <w:cantSplit/>
+          <w:tblHeader/>
+        </w:trPr>
+        <w:tc>
+          <w:tcPr>
+            <w:tcW w:type="dxa" w:w="1900"/>
+            <w:tcBorders>
+              <w:top w:val="single" w:color="000000" w:sz="12"/>
+              <w:left w:val="none" w:color="FFFFFF" w:sz="0"/>
+              <w:bottom w:val="single" w:color="000000" w:sz="4"/>
+              <w:right w:val="none" w:color="FFFFFF" w:sz="0"/>
+            </w:tcBorders>
+            <w:tcMar>
+              <w:top w:type="dxa" w:w="80"/>
+              <w:left w:type="dxa" w:w="80"/>
+              <w:bottom w:type="dxa" w:w="80"/>
+              <w:right w:type="dxa" w:w="80"/>
+            </w:tcMar>
+          </w:tcPr>
+          <w:p>
+            <w:pPr>
+              <w:keepNext/>
+            </w:pPr>
+            <w:r>
+              <w:rPr>
+                <w:rFonts w:ascii="Times New Roman" w:cs="Times New Roman" w:eastAsia="Times New Roman" w:hAnsi="Times New Roman"/>
+                <w:b/>
+                <w:bCs/>
+                <w:i w:val="false"/>
+                <w:iCs w:val="false"/>
+                <w:sz w:val="20"/>
+                <w:szCs w:val="20"/>
+              </w:rPr>
+              <w:t xml:space="preserve">Issue</w:t>
+            </w:r>
+          </w:p>
+        </w:tc>
+        <w:tc>
+          <w:tcPr>
+            <w:tcW w:type="dxa" w:w="3500"/>
+            <w:tcBorders>
+              <w:top w:val="single" w:color="000000" w:sz="12"/>
+              <w:left w:val="none" w:color="FFFFFF" w:sz="0"/>
+              <w:bottom w:val="single" w:color="000000" w:sz="4"/>
+              <w:right w:val="none" w:color="FFFFFF" w:sz="0"/>
+            </w:tcBorders>
+            <w:tcMar>
+              <w:top w:type="dxa" w:w="80"/>
+              <w:left w:type="dxa" w:w="80"/>
+              <w:bottom w:type="dxa" w:w="80"/>
+              <w:right w:type="dxa" w:w="80"/>
+            </w:tcMar>
+          </w:tcPr>
+          <w:p>
+            <w:pPr>
+              <w:keepNext/>
+            </w:pPr>
+            <w:r>
+              <w:rPr>
+                <w:rFonts w:ascii="Times New Roman" w:cs="Times New Roman" w:eastAsia="Times New Roman" w:hAnsi="Times New Roman"/>
+                <w:b/>
+                <w:bCs/>
+                <w:i w:val="false"/>
+                <w:iCs w:val="false"/>
+                <w:sz w:val="20"/>
+                <w:szCs w:val="20"/>
+              </w:rPr>
+              <w:t xml:space="preserve">Risk</w:t>
+            </w:r>
+          </w:p>
+        </w:tc>
+        <w:tc>
+          <w:tcPr>
+            <w:tcW w:type="dxa" w:w="3960"/>
+            <w:tcBorders>
+              <w:top w:val="single" w:color="000000" w:sz="12"/>
+              <w:left w:val="none" w:color="FFFFFF" w:sz="0"/>
+              <w:bottom w:val="single" w:color="000000" w:sz="4"/>
+              <w:right w:val="none" w:color="FFFFFF" w:sz="0"/>
+            </w:tcBorders>
+            <w:tcMar>
+              <w:top w:type="dxa" w:w="80"/>
+              <w:left w:type="dxa" w:w="80"/>
+              <w:bottom w:type="dxa" w:w="80"/>
+              <w:right w:type="dxa" w:w="80"/>
+            </w:tcMar>
+          </w:tcPr>
+          <w:p>
+            <w:pPr>
+              <w:keepNext/>
+            </w:pPr>
+            <w:r>
+              <w:rPr>
+                <w:rFonts w:ascii="Times New Roman" w:cs="Times New Roman" w:eastAsia="Times New Roman" w:hAnsi="Times New Roman"/>
+                <w:b/>
+                <w:bCs/>
+                <w:i w:val="false"/>
+                <w:iCs w:val="false"/>
+                <w:sz w:val="20"/>
+                <w:szCs w:val="20"/>
+              </w:rPr>
+              <w:t xml:space="preserve">Our response</w:t>
+            </w:r>
+          </w:p>
+        </w:tc>
+      </w:tr>
+      <w:tr>
+        <w:trPr>
+          <w:cantSplit/>
+          <w:tblHeader w:val="false"/>
+        </w:trPr>
+        <w:tc>
+          <w:tcPr>
+            <w:tcW w:type="dxa" w:w="1900"/>
+            <w:tcBorders>
+              <w:top w:val="single" w:color="000000" w:sz="4"/>
+              <w:left w:val="none" w:color="FFFFFF" w:sz="0"/>
+              <w:bottom w:val="none" w:color="FFFFFF" w:sz="0"/>
+              <w:right w:val="none" w:color="FFFFFF" w:sz="0"/>
+            </w:tcBorders>
+            <w:tcMar>
+              <w:top w:type="dxa" w:w="50"/>
+              <w:left w:type="dxa" w:w="80"/>
+              <w:bottom w:type="dxa" w:w="50"/>
+              <w:right w:type="dxa" w:w="80"/>
+            </w:tcMar>
+          </w:tcPr>
+          <w:p>
+            <w:pPr>
+              <w:keepNext/>
+            </w:pPr>
+            <w:r>
+              <w:rPr>
+                <w:rFonts w:ascii="Times New Roman" w:cs="Times New Roman" w:eastAsia="Times New Roman" w:hAnsi="Times New Roman"/>
+                <w:b w:val="false"/>
+                <w:bCs w:val="false"/>
+                <w:i w:val="false"/>
+                <w:iCs w:val="false"/>
+                <w:sz w:val="20"/>
+                <w:szCs w:val="20"/>
+              </w:rPr>
+              <w:t xml:space="preserve">Replacing interpreters</w:t>
+            </w:r>
+          </w:p>
+        </w:tc>
+        <w:tc>
+          <w:tcPr>
+            <w:tcW w:type="dxa" w:w="3500"/>
+            <w:tcBorders>
+              <w:top w:val="single" w:color="000000" w:sz="4"/>
+              <w:left w:val="none" w:color="FFFFFF" w:sz="0"/>
+              <w:bottom w:val="none" w:color="FFFFFF" w:sz="0"/>
+              <w:right w:val="none" w:color="FFFFFF" w:sz="0"/>
+            </w:tcBorders>
+            <w:tcMar>
+              <w:top w:type="dxa" w:w="50"/>
+              <w:left w:type="dxa" w:w="80"/>
+              <w:bottom w:type="dxa" w:w="50"/>
+              <w:right w:type="dxa" w:w="80"/>
+            </w:tcMar>
+          </w:tcPr>
+          <w:p>
+            <w:pPr>
+              <w:keepNext/>
+            </w:pPr>
+            <w:r>
+              <w:rPr>
+                <w:rFonts w:ascii="Times New Roman" w:cs="Times New Roman" w:eastAsia="Times New Roman" w:hAnsi="Times New Roman"/>
+                <w:b w:val="false"/>
+                <w:bCs w:val="false"/>
+                <w:i w:val="false"/>
+                <w:iCs w:val="false"/>
+                <w:sz w:val="20"/>
+                <w:szCs w:val="20"/>
+              </w:rPr>
+              <w:t xml:space="preserve">Organizations could use the device to avoid providing a required interpreter, weakening Deaf users' legal rights</w:t>
+            </w:r>
+          </w:p>
+        </w:tc>
+        <w:tc>
+          <w:tcPr>
+            <w:tcW w:type="dxa" w:w="3960"/>
+            <w:tcBorders>
+              <w:top w:val="single" w:color="000000" w:sz="4"/>
+              <w:left w:val="none" w:color="FFFFFF" w:sz="0"/>
+              <w:bottom w:val="none" w:color="FFFFFF" w:sz="0"/>
+              <w:right w:val="none" w:color="FFFFFF" w:sz="0"/>
+            </w:tcBorders>
+            <w:tcMar>
+              <w:top w:type="dxa" w:w="50"/>
+              <w:left w:type="dxa" w:w="80"/>
+              <w:bottom w:type="dxa" w:w="50"/>
+              <w:right w:type="dxa" w:w="80"/>
+            </w:tcMar>
+          </w:tcPr>
+          <w:p>
+            <w:pPr>
+              <w:keepNext/>
+            </w:pPr>
+            <w:r>
+              <w:rPr>
+                <w:rFonts w:ascii="Times New Roman" w:cs="Times New Roman" w:eastAsia="Times New Roman" w:hAnsi="Times New Roman"/>
+                <w:b w:val="false"/>
+                <w:bCs w:val="false"/>
+                <w:i w:val="false"/>
+                <w:iCs w:val="false"/>
+                <w:sz w:val="20"/>
+                <w:szCs w:val="20"/>
+              </w:rPr>
+              <w:t xml:space="preserve">Present and label the device as an aid for when no interpreter is available, in all documentation and on its start screen</w:t>
+            </w:r>
+          </w:p>
+        </w:tc>
+      </w:tr>
+      <w:tr>
+        <w:trPr>
+          <w:cantSplit/>
+          <w:tblHeader w:val="false"/>
+        </w:trPr>
+        <w:tc>
+          <w:tcPr>
+            <w:tcW w:type="dxa" w:w="1900"/>
+            <w:tcBorders>
+              <w:top w:val="none" w:color="FFFFFF" w:sz="0"/>
+              <w:left w:val="none" w:color="FFFFFF" w:sz="0"/>
+              <w:bottom w:val="none" w:color="FFFFFF" w:sz="0"/>
+              <w:right w:val="none" w:color="FFFFFF" w:sz="0"/>
+            </w:tcBorders>
+            <w:tcMar>
+              <w:top w:type="dxa" w:w="50"/>
+              <w:left w:type="dxa" w:w="80"/>
+              <w:bottom w:type="dxa" w:w="50"/>
+              <w:right w:type="dxa" w:w="80"/>
+            </w:tcMar>
+          </w:tcPr>
+          <w:p>
+            <w:pPr>
+              <w:keepNext/>
+            </w:pPr>
+            <w:r>
+              <w:rPr>
+                <w:rFonts w:ascii="Times New Roman" w:cs="Times New Roman" w:eastAsia="Times New Roman" w:hAnsi="Times New Roman"/>
+                <w:b w:val="false"/>
+                <w:bCs w:val="false"/>
+                <w:i w:val="false"/>
+                <w:iCs w:val="false"/>
+                <w:sz w:val="20"/>
+                <w:szCs w:val="20"/>
+              </w:rPr>
+              <w:t xml:space="preserve">Wrong translations</w:t>
+            </w:r>
+          </w:p>
+        </w:tc>
+        <w:tc>
+          <w:tcPr>
+            <w:tcW w:type="dxa" w:w="3500"/>
+            <w:tcBorders>
+              <w:top w:val="none" w:color="FFFFFF" w:sz="0"/>
+              <w:left w:val="none" w:color="FFFFFF" w:sz="0"/>
+              <w:bottom w:val="none" w:color="FFFFFF" w:sz="0"/>
+              <w:right w:val="none" w:color="FFFFFF" w:sz="0"/>
+            </w:tcBorders>
+            <w:tcMar>
+              <w:top w:type="dxa" w:w="50"/>
+              <w:left w:type="dxa" w:w="80"/>
+              <w:bottom w:type="dxa" w:w="50"/>
+              <w:right w:type="dxa" w:w="80"/>
+            </w:tcMar>
+          </w:tcPr>
+          <w:p>
+            <w:pPr>
+              <w:keepNext/>
+            </w:pPr>
+            <w:r>
+              <w:rPr>
+                <w:rFonts w:ascii="Times New Roman" w:cs="Times New Roman" w:eastAsia="Times New Roman" w:hAnsi="Times New Roman"/>
+                <w:b w:val="false"/>
+                <w:bCs w:val="false"/>
+                <w:i w:val="false"/>
+                <w:iCs w:val="false"/>
+                <w:sz w:val="20"/>
+                <w:szCs w:val="20"/>
+              </w:rPr>
+              <w:t xml:space="preserve">A mistranslation in a medical, legal or financial exchange can cause harm</w:t>
+            </w:r>
+          </w:p>
+        </w:tc>
+        <w:tc>
+          <w:tcPr>
+            <w:tcW w:type="dxa" w:w="3960"/>
+            <w:tcBorders>
+              <w:top w:val="none" w:color="FFFFFF" w:sz="0"/>
+              <w:left w:val="none" w:color="FFFFFF" w:sz="0"/>
+              <w:bottom w:val="none" w:color="FFFFFF" w:sz="0"/>
+              <w:right w:val="none" w:color="FFFFFF" w:sz="0"/>
+            </w:tcBorders>
+            <w:tcMar>
+              <w:top w:type="dxa" w:w="50"/>
+              <w:left w:type="dxa" w:w="80"/>
+              <w:bottom w:type="dxa" w:w="50"/>
+              <w:right w:type="dxa" w:w="80"/>
+            </w:tcMar>
+          </w:tcPr>
+          <w:p>
+            <w:pPr>
+              <w:keepNext/>
+            </w:pPr>
+            <w:r>
+              <w:rPr>
+                <w:rFonts w:ascii="Times New Roman" w:cs="Times New Roman" w:eastAsia="Times New Roman" w:hAnsi="Times New Roman"/>
+                <w:b w:val="false"/>
+                <w:bCs w:val="false"/>
+                <w:i w:val="false"/>
+                <w:iCs w:val="false"/>
+                <w:sz w:val="20"/>
+                <w:szCs w:val="20"/>
+              </w:rPr>
+              <w:t xml:space="preserve">Nothing is spoken without user confirmation; the device abstains when unsure; high-stakes settings are out of scope</w:t>
+            </w:r>
+          </w:p>
+        </w:tc>
+      </w:tr>
+      <w:tr>
+        <w:trPr>
+          <w:cantSplit/>
+          <w:tblHeader w:val="false"/>
+        </w:trPr>
+        <w:tc>
+          <w:tcPr>
+            <w:tcW w:type="dxa" w:w="1900"/>
+            <w:tcBorders>
+              <w:top w:val="none" w:color="FFFFFF" w:sz="0"/>
+              <w:left w:val="none" w:color="FFFFFF" w:sz="0"/>
+              <w:bottom w:val="none" w:color="FFFFFF" w:sz="0"/>
+              <w:right w:val="none" w:color="FFFFFF" w:sz="0"/>
+            </w:tcBorders>
+            <w:tcMar>
+              <w:top w:type="dxa" w:w="50"/>
+              <w:left w:type="dxa" w:w="80"/>
+              <w:bottom w:type="dxa" w:w="50"/>
+              <w:right w:type="dxa" w:w="80"/>
+            </w:tcMar>
+          </w:tcPr>
+          <w:p>
+            <w:pPr>
+              <w:keepNext/>
+            </w:pPr>
+            <w:r>
+              <w:rPr>
+                <w:rFonts w:ascii="Times New Roman" w:cs="Times New Roman" w:eastAsia="Times New Roman" w:hAnsi="Times New Roman"/>
+                <w:b w:val="false"/>
+                <w:bCs w:val="false"/>
+                <w:i w:val="false"/>
+                <w:iCs w:val="false"/>
+                <w:sz w:val="20"/>
+                <w:szCs w:val="20"/>
+              </w:rPr>
+              <w:t xml:space="preserve">Unequal performance</w:t>
+            </w:r>
+          </w:p>
+        </w:tc>
+        <w:tc>
+          <w:tcPr>
+            <w:tcW w:type="dxa" w:w="3500"/>
+            <w:tcBorders>
+              <w:top w:val="none" w:color="FFFFFF" w:sz="0"/>
+              <w:left w:val="none" w:color="FFFFFF" w:sz="0"/>
+              <w:bottom w:val="none" w:color="FFFFFF" w:sz="0"/>
+              <w:right w:val="none" w:color="FFFFFF" w:sz="0"/>
+            </w:tcBorders>
+            <w:tcMar>
+              <w:top w:type="dxa" w:w="50"/>
+              <w:left w:type="dxa" w:w="80"/>
+              <w:bottom w:type="dxa" w:w="50"/>
+              <w:right w:type="dxa" w:w="80"/>
+            </w:tcMar>
+          </w:tcPr>
+          <w:p>
+            <w:pPr>
+              <w:keepNext/>
+            </w:pPr>
+            <w:r>
+              <w:rPr>
+                <w:rFonts w:ascii="Times New Roman" w:cs="Times New Roman" w:eastAsia="Times New Roman" w:hAnsi="Times New Roman"/>
+                <w:b w:val="false"/>
+                <w:bCs w:val="false"/>
+                <w:i w:val="false"/>
+                <w:iCs w:val="false"/>
+                <w:sz w:val="20"/>
+                <w:szCs w:val="20"/>
+              </w:rPr>
+              <w:t xml:space="preserve">Accuracy may be lower for some signers because of signing style, handedness, skin tone or lighting</w:t>
+            </w:r>
+          </w:p>
+        </w:tc>
+        <w:tc>
+          <w:tcPr>
+            <w:tcW w:type="dxa" w:w="3960"/>
+            <w:tcBorders>
+              <w:top w:val="none" w:color="FFFFFF" w:sz="0"/>
+              <w:left w:val="none" w:color="FFFFFF" w:sz="0"/>
+              <w:bottom w:val="none" w:color="FFFFFF" w:sz="0"/>
+              <w:right w:val="none" w:color="FFFFFF" w:sz="0"/>
+            </w:tcBorders>
+            <w:tcMar>
+              <w:top w:type="dxa" w:w="50"/>
+              <w:left w:type="dxa" w:w="80"/>
+              <w:bottom w:type="dxa" w:w="50"/>
+              <w:right w:type="dxa" w:w="80"/>
+            </w:tcMar>
+          </w:tcPr>
+          <w:p>
+            <w:pPr>
+              <w:keepNext/>
+            </w:pPr>
+            <w:r>
+              <w:rPr>
+                <w:rFonts w:ascii="Times New Roman" w:cs="Times New Roman" w:eastAsia="Times New Roman" w:hAnsi="Times New Roman"/>
+                <w:b w:val="false"/>
+                <w:bCs w:val="false"/>
+                <w:i w:val="false"/>
+                <w:iCs w:val="false"/>
+                <w:sz w:val="20"/>
+                <w:szCs w:val="20"/>
+              </w:rPr>
+              <w:t xml:space="preserve">Test with diverse signers and report accuracy for each signer, along with known limits</w:t>
+            </w:r>
+          </w:p>
+        </w:tc>
+      </w:tr>
+      <w:tr>
+        <w:trPr>
+          <w:cantSplit/>
+          <w:tblHeader w:val="false"/>
+        </w:trPr>
+        <w:tc>
+          <w:tcPr>
+            <w:tcW w:type="dxa" w:w="1900"/>
+            <w:tcBorders>
+              <w:top w:val="none" w:color="FFFFFF" w:sz="0"/>
+              <w:left w:val="none" w:color="FFFFFF" w:sz="0"/>
+              <w:bottom w:val="none" w:color="FFFFFF" w:sz="0"/>
+              <w:right w:val="none" w:color="FFFFFF" w:sz="0"/>
+            </w:tcBorders>
+            <w:tcMar>
+              <w:top w:type="dxa" w:w="50"/>
+              <w:left w:type="dxa" w:w="80"/>
+              <w:bottom w:type="dxa" w:w="50"/>
+              <w:right w:type="dxa" w:w="80"/>
+            </w:tcMar>
+          </w:tcPr>
+          <w:p>
+            <w:pPr>
+              <w:keepNext/>
+            </w:pPr>
+            <w:r>
+              <w:rPr>
+                <w:rFonts w:ascii="Times New Roman" w:cs="Times New Roman" w:eastAsia="Times New Roman" w:hAnsi="Times New Roman"/>
+                <w:b w:val="false"/>
+                <w:bCs w:val="false"/>
+                <w:i w:val="false"/>
+                <w:iCs w:val="false"/>
+                <w:sz w:val="20"/>
+                <w:szCs w:val="20"/>
+              </w:rPr>
+              <w:t xml:space="preserve">Privacy</w:t>
+            </w:r>
+          </w:p>
+        </w:tc>
+        <w:tc>
+          <w:tcPr>
+            <w:tcW w:type="dxa" w:w="3500"/>
+            <w:tcBorders>
+              <w:top w:val="none" w:color="FFFFFF" w:sz="0"/>
+              <w:left w:val="none" w:color="FFFFFF" w:sz="0"/>
+              <w:bottom w:val="none" w:color="FFFFFF" w:sz="0"/>
+              <w:right w:val="none" w:color="FFFFFF" w:sz="0"/>
+            </w:tcBorders>
+            <w:tcMar>
+              <w:top w:type="dxa" w:w="50"/>
+              <w:left w:type="dxa" w:w="80"/>
+              <w:bottom w:type="dxa" w:w="50"/>
+              <w:right w:type="dxa" w:w="80"/>
+            </w:tcMar>
+          </w:tcPr>
+          <w:p>
+            <w:pPr>
+              <w:keepNext/>
+            </w:pPr>
+            <w:r>
+              <w:rPr>
+                <w:rFonts w:ascii="Times New Roman" w:cs="Times New Roman" w:eastAsia="Times New Roman" w:hAnsi="Times New Roman"/>
+                <w:b w:val="false"/>
+                <w:bCs w:val="false"/>
+                <w:i w:val="false"/>
+                <w:iCs w:val="false"/>
+                <w:sz w:val="20"/>
+                <w:szCs w:val="20"/>
+              </w:rPr>
+              <w:t xml:space="preserve">The camera captures users' faces and bodies, and the microphone records the reply</w:t>
+            </w:r>
+          </w:p>
+        </w:tc>
+        <w:tc>
+          <w:tcPr>
+            <w:tcW w:type="dxa" w:w="3960"/>
+            <w:tcBorders>
+              <w:top w:val="none" w:color="FFFFFF" w:sz="0"/>
+              <w:left w:val="none" w:color="FFFFFF" w:sz="0"/>
+              <w:bottom w:val="none" w:color="FFFFFF" w:sz="0"/>
+              <w:right w:val="none" w:color="FFFFFF" w:sz="0"/>
+            </w:tcBorders>
+            <w:tcMar>
+              <w:top w:type="dxa" w:w="50"/>
+              <w:left w:type="dxa" w:w="80"/>
+              <w:bottom w:type="dxa" w:w="50"/>
+              <w:right w:type="dxa" w:w="80"/>
+            </w:tcMar>
+          </w:tcPr>
+          <w:p>
+            <w:pPr>
+              <w:keepNext/>
+            </w:pPr>
+            <w:r>
+              <w:rPr>
+                <w:rFonts w:ascii="Times New Roman" w:cs="Times New Roman" w:eastAsia="Times New Roman" w:hAnsi="Times New Roman"/>
+                <w:b w:val="false"/>
+                <w:bCs w:val="false"/>
+                <w:i w:val="false"/>
+                <w:iCs w:val="false"/>
+                <w:sz w:val="20"/>
+                <w:szCs w:val="20"/>
+              </w:rPr>
+              <w:t xml:space="preserve">All processing stays on the device; no video or audio is stored or transmitted</w:t>
+            </w:r>
+          </w:p>
+        </w:tc>
+      </w:tr>
+      <w:tr>
+        <w:trPr>
+          <w:cantSplit/>
+          <w:tblHeader w:val="false"/>
+        </w:trPr>
+        <w:tc>
+          <w:tcPr>
+            <w:tcW w:type="dxa" w:w="1900"/>
+            <w:tcBorders>
+              <w:top w:val="none" w:color="FFFFFF" w:sz="0"/>
+              <w:left w:val="none" w:color="FFFFFF" w:sz="0"/>
+              <w:bottom w:val="none" w:color="FFFFFF" w:sz="0"/>
+              <w:right w:val="none" w:color="FFFFFF" w:sz="0"/>
+            </w:tcBorders>
+            <w:tcMar>
+              <w:top w:type="dxa" w:w="50"/>
+              <w:left w:type="dxa" w:w="80"/>
+              <w:bottom w:type="dxa" w:w="50"/>
+              <w:right w:type="dxa" w:w="80"/>
+            </w:tcMar>
+          </w:tcPr>
+          <w:p>
+            <w:pPr>
+              <w:keepNext/>
+            </w:pPr>
+            <w:r>
+              <w:rPr>
+                <w:rFonts w:ascii="Times New Roman" w:cs="Times New Roman" w:eastAsia="Times New Roman" w:hAnsi="Times New Roman"/>
+                <w:b w:val="false"/>
+                <w:bCs w:val="false"/>
+                <w:i w:val="false"/>
+                <w:iCs w:val="false"/>
+                <w:sz w:val="20"/>
+                <w:szCs w:val="20"/>
+              </w:rPr>
+              <w:t xml:space="preserve">Data consent</w:t>
+            </w:r>
+          </w:p>
+        </w:tc>
+        <w:tc>
+          <w:tcPr>
+            <w:tcW w:type="dxa" w:w="3500"/>
+            <w:tcBorders>
+              <w:top w:val="none" w:color="FFFFFF" w:sz="0"/>
+              <w:left w:val="none" w:color="FFFFFF" w:sz="0"/>
+              <w:bottom w:val="none" w:color="FFFFFF" w:sz="0"/>
+              <w:right w:val="none" w:color="FFFFFF" w:sz="0"/>
+            </w:tcBorders>
+            <w:tcMar>
+              <w:top w:type="dxa" w:w="50"/>
+              <w:left w:type="dxa" w:w="80"/>
+              <w:bottom w:type="dxa" w:w="50"/>
+              <w:right w:type="dxa" w:w="80"/>
+            </w:tcMar>
+          </w:tcPr>
+          <w:p>
+            <w:pPr>
+              <w:keepNext/>
+            </w:pPr>
+            <w:r>
+              <w:rPr>
+                <w:rFonts w:ascii="Times New Roman" w:cs="Times New Roman" w:eastAsia="Times New Roman" w:hAnsi="Times New Roman"/>
+                <w:b w:val="false"/>
+                <w:bCs w:val="false"/>
+                <w:i w:val="false"/>
+                <w:iCs w:val="false"/>
+                <w:sz w:val="20"/>
+                <w:szCs w:val="20"/>
+              </w:rPr>
+              <w:t xml:space="preserve">Training data come from real people</w:t>
+            </w:r>
+          </w:p>
+        </w:tc>
+        <w:tc>
+          <w:tcPr>
+            <w:tcW w:type="dxa" w:w="3960"/>
+            <w:tcBorders>
+              <w:top w:val="none" w:color="FFFFFF" w:sz="0"/>
+              <w:left w:val="none" w:color="FFFFFF" w:sz="0"/>
+              <w:bottom w:val="none" w:color="FFFFFF" w:sz="0"/>
+              <w:right w:val="none" w:color="FFFFFF" w:sz="0"/>
+            </w:tcBorders>
+            <w:tcMar>
+              <w:top w:type="dxa" w:w="50"/>
+              <w:left w:type="dxa" w:w="80"/>
+              <w:bottom w:type="dxa" w:w="50"/>
+              <w:right w:type="dxa" w:w="80"/>
+            </w:tcMar>
+          </w:tcPr>
+          <w:p>
+            <w:pPr>
+              <w:keepNext/>
+            </w:pPr>
+            <w:r>
+              <w:rPr>
+                <w:rFonts w:ascii="Times New Roman" w:cs="Times New Roman" w:eastAsia="Times New Roman" w:hAnsi="Times New Roman"/>
+                <w:b w:val="false"/>
+                <w:bCs w:val="false"/>
+                <w:i w:val="false"/>
+                <w:iCs w:val="false"/>
+                <w:sz w:val="20"/>
+                <w:szCs w:val="20"/>
+              </w:rPr>
+              <w:t xml:space="preserve">Use consent-based datasets such as ASL Citizen; obtain written consent for any recordings we make</w:t>
+            </w:r>
+          </w:p>
+        </w:tc>
+      </w:tr>
+      <w:tr>
+        <w:trPr>
+          <w:cantSplit/>
+          <w:tblHeader w:val="false"/>
+        </w:trPr>
+        <w:tc>
+          <w:tcPr>
+            <w:tcW w:type="dxa" w:w="1900"/>
+            <w:tcBorders>
+              <w:top w:val="none" w:color="FFFFFF" w:sz="0"/>
+              <w:left w:val="none" w:color="FFFFFF" w:sz="0"/>
+              <w:bottom w:val="none" w:color="FFFFFF" w:sz="0"/>
+              <w:right w:val="none" w:color="FFFFFF" w:sz="0"/>
+            </w:tcBorders>
+            <w:tcMar>
+              <w:top w:type="dxa" w:w="50"/>
+              <w:left w:type="dxa" w:w="80"/>
+              <w:bottom w:type="dxa" w:w="50"/>
+              <w:right w:type="dxa" w:w="80"/>
+            </w:tcMar>
+          </w:tcPr>
+          <w:p>
+            <w:pPr>
+              <w:keepNext/>
+            </w:pPr>
+            <w:r>
+              <w:rPr>
+                <w:rFonts w:ascii="Times New Roman" w:cs="Times New Roman" w:eastAsia="Times New Roman" w:hAnsi="Times New Roman"/>
+                <w:b w:val="false"/>
+                <w:bCs w:val="false"/>
+                <w:i w:val="false"/>
+                <w:iCs w:val="false"/>
+                <w:sz w:val="20"/>
+                <w:szCs w:val="20"/>
+              </w:rPr>
+              <w:t xml:space="preserve">Deaf involvement</w:t>
+            </w:r>
+          </w:p>
+        </w:tc>
+        <w:tc>
+          <w:tcPr>
+            <w:tcW w:type="dxa" w:w="3500"/>
+            <w:tcBorders>
+              <w:top w:val="none" w:color="FFFFFF" w:sz="0"/>
+              <w:left w:val="none" w:color="FFFFFF" w:sz="0"/>
+              <w:bottom w:val="none" w:color="FFFFFF" w:sz="0"/>
+              <w:right w:val="none" w:color="FFFFFF" w:sz="0"/>
+            </w:tcBorders>
+            <w:tcMar>
+              <w:top w:type="dxa" w:w="50"/>
+              <w:left w:type="dxa" w:w="80"/>
+              <w:bottom w:type="dxa" w:w="50"/>
+              <w:right w:type="dxa" w:w="80"/>
+            </w:tcMar>
+          </w:tcPr>
+          <w:p>
+            <w:pPr>
+              <w:keepNext/>
+            </w:pPr>
+            <w:r>
+              <w:rPr>
+                <w:rFonts w:ascii="Times New Roman" w:cs="Times New Roman" w:eastAsia="Times New Roman" w:hAnsi="Times New Roman"/>
+                <w:b w:val="false"/>
+                <w:bCs w:val="false"/>
+                <w:i w:val="false"/>
+                <w:iCs w:val="false"/>
+                <w:sz w:val="20"/>
+                <w:szCs w:val="20"/>
+              </w:rPr>
+              <w:t xml:space="preserve">Hearing-led projects that profit from ASL are the community's top concern</w:t>
+            </w:r>
+          </w:p>
+        </w:tc>
+        <w:tc>
+          <w:tcPr>
+            <w:tcW w:type="dxa" w:w="3960"/>
+            <w:tcBorders>
+              <w:top w:val="none" w:color="FFFFFF" w:sz="0"/>
+              <w:left w:val="none" w:color="FFFFFF" w:sz="0"/>
+              <w:bottom w:val="none" w:color="FFFFFF" w:sz="0"/>
+              <w:right w:val="none" w:color="FFFFFF" w:sz="0"/>
+            </w:tcBorders>
+            <w:tcMar>
+              <w:top w:type="dxa" w:w="50"/>
+              <w:left w:type="dxa" w:w="80"/>
+              <w:bottom w:type="dxa" w:w="50"/>
+              <w:right w:type="dxa" w:w="80"/>
+            </w:tcMar>
+          </w:tcPr>
+          <w:p>
+            <w:pPr>
+              <w:keepNext/>
+            </w:pPr>
+            <w:r>
+              <w:rPr>
+                <w:rFonts w:ascii="Times New Roman" w:cs="Times New Roman" w:eastAsia="Times New Roman" w:hAnsi="Times New Roman"/>
+                <w:b w:val="false"/>
+                <w:bCs w:val="false"/>
+                <w:i w:val="false"/>
+                <w:iCs w:val="false"/>
+                <w:sz w:val="20"/>
+                <w:szCs w:val="20"/>
+              </w:rPr>
+              <w:t xml:space="preserve">Involve Deaf ASL users in vocabulary selection and testing, and credit their contributions</w:t>
+            </w:r>
+          </w:p>
+        </w:tc>
+      </w:tr>
+      <w:tr>
+        <w:trPr>
+          <w:cantSplit/>
+          <w:tblHeader w:val="false"/>
+        </w:trPr>
+        <w:tc>
+          <w:tcPr>
+            <w:tcW w:type="dxa" w:w="1900"/>
+            <w:tcBorders>
+              <w:top w:val="none" w:color="FFFFFF" w:sz="0"/>
+              <w:left w:val="none" w:color="FFFFFF" w:sz="0"/>
+              <w:bottom w:val="none" w:color="FFFFFF" w:sz="0"/>
+              <w:right w:val="none" w:color="FFFFFF" w:sz="0"/>
+            </w:tcBorders>
+            <w:tcMar>
+              <w:top w:type="dxa" w:w="50"/>
+              <w:left w:type="dxa" w:w="80"/>
+              <w:bottom w:type="dxa" w:w="50"/>
+              <w:right w:type="dxa" w:w="80"/>
+            </w:tcMar>
+          </w:tcPr>
+          <w:p>
+            <w:pPr>
+              <w:keepNext/>
+            </w:pPr>
+            <w:r>
+              <w:rPr>
+                <w:rFonts w:ascii="Times New Roman" w:cs="Times New Roman" w:eastAsia="Times New Roman" w:hAnsi="Times New Roman"/>
+                <w:b w:val="false"/>
+                <w:bCs w:val="false"/>
+                <w:i w:val="false"/>
+                <w:iCs w:val="false"/>
+                <w:sz w:val="20"/>
+                <w:szCs w:val="20"/>
+              </w:rPr>
+              <w:t xml:space="preserve">Scope and honesty</w:t>
+            </w:r>
+          </w:p>
+        </w:tc>
+        <w:tc>
+          <w:tcPr>
+            <w:tcW w:type="dxa" w:w="3500"/>
+            <w:tcBorders>
+              <w:top w:val="none" w:color="FFFFFF" w:sz="0"/>
+              <w:left w:val="none" w:color="FFFFFF" w:sz="0"/>
+              <w:bottom w:val="none" w:color="FFFFFF" w:sz="0"/>
+              <w:right w:val="none" w:color="FFFFFF" w:sz="0"/>
+            </w:tcBorders>
+            <w:tcMar>
+              <w:top w:type="dxa" w:w="50"/>
+              <w:left w:type="dxa" w:w="80"/>
+              <w:bottom w:type="dxa" w:w="50"/>
+              <w:right w:type="dxa" w:w="80"/>
+            </w:tcMar>
+          </w:tcPr>
+          <w:p>
+            <w:pPr>
+              <w:keepNext/>
+            </w:pPr>
+            <w:r>
+              <w:rPr>
+                <w:rFonts w:ascii="Times New Roman" w:cs="Times New Roman" w:eastAsia="Times New Roman" w:hAnsi="Times New Roman"/>
+                <w:b w:val="false"/>
+                <w:bCs w:val="false"/>
+                <w:i w:val="false"/>
+                <w:iCs w:val="false"/>
+                <w:sz w:val="20"/>
+                <w:szCs w:val="20"/>
+              </w:rPr>
+              <w:t xml:space="preserve">Users may expect full ASL translation</w:t>
+            </w:r>
+          </w:p>
+        </w:tc>
+        <w:tc>
+          <w:tcPr>
+            <w:tcW w:type="dxa" w:w="3960"/>
+            <w:tcBorders>
+              <w:top w:val="none" w:color="FFFFFF" w:sz="0"/>
+              <w:left w:val="none" w:color="FFFFFF" w:sz="0"/>
+              <w:bottom w:val="none" w:color="FFFFFF" w:sz="0"/>
+              <w:right w:val="none" w:color="FFFFFF" w:sz="0"/>
+            </w:tcBorders>
+            <w:tcMar>
+              <w:top w:type="dxa" w:w="50"/>
+              <w:left w:type="dxa" w:w="80"/>
+              <w:bottom w:type="dxa" w:w="50"/>
+              <w:right w:type="dxa" w:w="80"/>
+            </w:tcMar>
+          </w:tcPr>
+          <w:p>
+            <w:pPr>
+              <w:keepNext/>
+            </w:pPr>
+            <w:r>
+              <w:rPr>
+                <w:rFonts w:ascii="Times New Roman" w:cs="Times New Roman" w:eastAsia="Times New Roman" w:hAnsi="Times New Roman"/>
+                <w:b w:val="false"/>
+                <w:bCs w:val="false"/>
+                <w:i w:val="false"/>
+                <w:iCs w:val="false"/>
+                <w:sz w:val="20"/>
+                <w:szCs w:val="20"/>
+              </w:rPr>
+              <w:t xml:space="preserve">State plainly that the device recognizes individual signs and does not capture facial grammar</w:t>
+            </w:r>
+          </w:p>
+        </w:tc>
+      </w:tr>
+      <w:tr>
+        <w:trPr>
+          <w:cantSplit/>
+          <w:tblHeader w:val="false"/>
+        </w:trPr>
+        <w:tc>
+          <w:tcPr>
+            <w:tcW w:type="dxa" w:w="1900"/>
+            <w:tcBorders>
+              <w:top w:val="none" w:color="FFFFFF" w:sz="0"/>
+              <w:left w:val="none" w:color="FFFFFF" w:sz="0"/>
+              <w:bottom w:val="single" w:color="000000" w:sz="12"/>
+              <w:right w:val="none" w:color="FFFFFF" w:sz="0"/>
+            </w:tcBorders>
+            <w:tcMar>
+              <w:top w:type="dxa" w:w="50"/>
+              <w:left w:type="dxa" w:w="80"/>
+              <w:bottom w:type="dxa" w:w="50"/>
+              <w:right w:type="dxa" w:w="80"/>
+            </w:tcMar>
+          </w:tcPr>
+          <w:p>
+            <w:pPr>
+              <w:keepNext w:val="false"/>
+            </w:pPr>
+            <w:r>
+              <w:rPr>
+                <w:rFonts w:ascii="Times New Roman" w:cs="Times New Roman" w:eastAsia="Times New Roman" w:hAnsi="Times New Roman"/>
+                <w:b w:val="false"/>
+                <w:bCs w:val="false"/>
+                <w:i w:val="false"/>
+                <w:iCs w:val="false"/>
+                <w:sz w:val="20"/>
+                <w:szCs w:val="20"/>
+              </w:rPr>
+              <w:t xml:space="preserve">Accessibility</w:t>
+            </w:r>
+          </w:p>
+        </w:tc>
+        <w:tc>
+          <w:tcPr>
+            <w:tcW w:type="dxa" w:w="3500"/>
+            <w:tcBorders>
+              <w:top w:val="none" w:color="FFFFFF" w:sz="0"/>
+              <w:left w:val="none" w:color="FFFFFF" w:sz="0"/>
+              <w:bottom w:val="single" w:color="000000" w:sz="12"/>
+              <w:right w:val="none" w:color="FFFFFF" w:sz="0"/>
+            </w:tcBorders>
+            <w:tcMar>
+              <w:top w:type="dxa" w:w="50"/>
+              <w:left w:type="dxa" w:w="80"/>
+              <w:bottom w:type="dxa" w:w="50"/>
+              <w:right w:type="dxa" w:w="80"/>
+            </w:tcMar>
+          </w:tcPr>
+          <w:p>
+            <w:pPr>
+              <w:keepNext w:val="false"/>
+            </w:pPr>
+            <w:r>
+              <w:rPr>
+                <w:rFonts w:ascii="Times New Roman" w:cs="Times New Roman" w:eastAsia="Times New Roman" w:hAnsi="Times New Roman"/>
+                <w:b w:val="false"/>
+                <w:bCs w:val="false"/>
+                <w:i w:val="false"/>
+                <w:iCs w:val="false"/>
+                <w:sz w:val="20"/>
+                <w:szCs w:val="20"/>
+              </w:rPr>
+              <w:t xml:space="preserve">Replies shown as English text may be hard for users less fluent in written English</w:t>
+            </w:r>
+          </w:p>
+        </w:tc>
+        <w:tc>
+          <w:tcPr>
+            <w:tcW w:type="dxa" w:w="3960"/>
+            <w:tcBorders>
+              <w:top w:val="none" w:color="FFFFFF" w:sz="0"/>
+              <w:left w:val="none" w:color="FFFFFF" w:sz="0"/>
+              <w:bottom w:val="single" w:color="000000" w:sz="12"/>
+              <w:right w:val="none" w:color="FFFFFF" w:sz="0"/>
+            </w:tcBorders>
+            <w:tcMar>
+              <w:top w:type="dxa" w:w="50"/>
+              <w:left w:type="dxa" w:w="80"/>
+              <w:bottom w:type="dxa" w:w="50"/>
+              <w:right w:type="dxa" w:w="80"/>
+            </w:tcMar>
+          </w:tcPr>
+          <w:p>
+            <w:pPr>
+              <w:keepNext w:val="false"/>
+            </w:pPr>
+            <w:r>
+              <w:rPr>
+                <w:rFonts w:ascii="Times New Roman" w:cs="Times New Roman" w:eastAsia="Times New Roman" w:hAnsi="Times New Roman"/>
+                <w:b w:val="false"/>
+                <w:bCs w:val="false"/>
+                <w:i w:val="false"/>
+                <w:iCs w:val="false"/>
+                <w:sz w:val="20"/>
+                <w:szCs w:val="20"/>
+              </w:rPr>
+              <w:t xml:space="preserve">Use short sentences and an adjustable font size; record this as a known limitation</w:t>
+            </w:r>
+          </w:p>
+        </w:tc>
+      </w:tr>
+    </w:tbl>
+    <w:p>
+      <w:pPr>
+        <w:spacing w:after="240"/>
+      </w:pPr>
+    </w:p>
+    <w:p>
+      <w:pPr>
+        <w:spacing w:after="120" w:line="360"/>
+        <w:ind w:firstLine="720"/>
+        <w:jc w:val="both"/>
+      </w:pPr>
+      <w:r>
+        <w:rPr>
+          <w:rFonts w:ascii="Times New Roman" w:cs="Times New Roman" w:eastAsia="Times New Roman" w:hAnsi="Times New Roman"/>
+          <w:sz w:val="24"/>
+          <w:szCs w:val="24"/>
+        </w:rPr>
+        <w:t xml:space="preserve">Deaf involvement is the most important of these issues. Our team is hearing, and both surveys cited in Section 3 show that Deaf communities are most concerned about sign language technology built without them [1], [16]. We will therefore contact the ASL community at NJIT before choosing the vocabulary, invite Deaf signers to test the prototype, and adjust the design based on their feedback. Any testing with people will follow NJIT's requirements for research involving human participants.</w:t>
+      </w:r>
+    </w:p>
+    <w:p>
+      <w:r>
+        <w:br w:type="page"/>
+      </w:r>
+    </w:p>
+    <w:p>
+      <w:pPr>
+        <w:pStyle w:val="IntroSection"/>
+        <w:keepNext/>
+        <w:spacing w:after="120" w:before="0"/>
+      </w:pPr>
+      <w:r>
+        <w:rPr>
+          <w:rFonts w:ascii="Times New Roman" w:cs="Times New Roman" w:eastAsia="Times New Roman" w:hAnsi="Times New Roman"/>
+          <w:b/>
+          <w:bCs/>
+          <w:sz w:val="24"/>
+          <w:szCs w:val="24"/>
+        </w:rPr>
         <w:t xml:space="preserve">12. References</w:t>
       </w:r>
     </w:p>
@@ -3660,6 +5698,70 @@
           <w:szCs w:val="24"/>
         </w:rPr>
         <w:t xml:space="preserve"> No. 5,887,069, 1999.</w:t>
+      </w:r>
+    </w:p>
+    <w:p>
+      <w:pPr>
+        <w:spacing w:after="120"/>
+        <w:ind w:left="432" w:hanging="432"/>
+      </w:pPr>
+      <w:r>
+        <w:rPr>
+          <w:rFonts w:ascii="Times New Roman" w:cs="Times New Roman" w:eastAsia="Times New Roman" w:hAnsi="Times New Roman"/>
+          <w:sz w:val="24"/>
+          <w:szCs w:val="24"/>
+        </w:rPr>
+        <w:t xml:space="preserve">22.	U.S. Department of Justice, Civil Rights Division. ADA requirements: Effective communication. </w:t>
+      </w:r>
+      <w:r>
+        <w:rPr>
+          <w:rFonts w:ascii="Times New Roman" w:cs="Times New Roman" w:eastAsia="Times New Roman" w:hAnsi="Times New Roman"/>
+          <w:i/>
+          <w:iCs/>
+          <w:sz w:val="24"/>
+          <w:szCs w:val="24"/>
+        </w:rPr>
+        <w:t xml:space="preserve">ADA.gov</w:t>
+      </w:r>
+      <w:r>
+        <w:rPr>
+          <w:rFonts w:ascii="Times New Roman" w:cs="Times New Roman" w:eastAsia="Times New Roman" w:hAnsi="Times New Roman"/>
+          <w:sz w:val="24"/>
+          <w:szCs w:val="24"/>
+        </w:rPr>
+        <w:t xml:space="preserve">, 2020. Available: https://www.ada.gov/resources/effective-communication/ [Accessed: 01-Oct-2026].</w:t>
+      </w:r>
+    </w:p>
+    <w:p>
+      <w:pPr>
+        <w:spacing w:after="120"/>
+        <w:ind w:left="432" w:hanging="432"/>
+      </w:pPr>
+      <w:r>
+        <w:rPr>
+          <w:rFonts w:ascii="Times New Roman" w:cs="Times New Roman" w:eastAsia="Times New Roman" w:hAnsi="Times New Roman"/>
+          <w:sz w:val="24"/>
+          <w:szCs w:val="24"/>
+        </w:rPr>
+        <w:t xml:space="preserve">23.	IEEE. IEEE Code of Ethics. </w:t>
+      </w:r>
+      <w:r>
+        <w:rPr>
+          <w:rFonts w:ascii="Times New Roman" w:cs="Times New Roman" w:eastAsia="Times New Roman" w:hAnsi="Times New Roman"/>
+          <w:i/>
+          <w:iCs/>
+          <w:sz w:val="24"/>
+          <w:szCs w:val="24"/>
+        </w:rPr>
+        <w:t xml:space="preserve">IEEE Policies, Section 7.8</w:t>
+      </w:r>
+      <w:r>
+        <w:rPr>
+          <w:rFonts w:ascii="Times New Roman" w:cs="Times New Roman" w:eastAsia="Times New Roman" w:hAnsi="Times New Roman"/>
+          <w:sz w:val="24"/>
+          <w:szCs w:val="24"/>
+        </w:rPr>
+        <w:t xml:space="preserve">, 2020. Available: https://www.ieee.org/about/corporate/governance/p7-8.html [Accessed: 01-Oct-2026].</w:t>
       </w:r>
     </w:p>
     <w:sectPr>

</xml_diff>

<commit_message>
Expand Sections 4 and 5
Develops each technical goal into its approach, targets and verification,
adds a targets-and-verification table and a team-responsibilities
subsection, starts Section 5 on a new page, covers community impact group
by group, and discusses the main ethical issues in full alongside the
summary table.

Co-Authored-By: Claude Opus 5.5 <noreply@anthropic.com>
Claude-Session: https://claude.ai/code/session_01Ghe1P8BgNsyGdHuD4xCbdv
</commit_message>
<xml_diff>
--- a/docs/ECE_414_Proposal_Draft.docx
+++ b/docs/ECE_414_Proposal_Draft.docx
@@ -3002,7 +3002,7 @@
           <w:sz w:val="24"/>
           <w:szCs w:val="24"/>
         </w:rPr>
-        <w:t xml:space="preserve">The project has three technical goals. Each has a measurable target that will be used to validate the prototype, consistent with the design targets in Table 1. Table 3 lists the team members responsible for each goal.</w:t>
+        <w:t xml:space="preserve">This section defines the three major technical goals of the project. Each goal corresponds to one part of the system shown in Fig. 2 and has measurable targets, so that the prototype can be validated objectively during ECE 416. The goals build on each other: Goal 1 produces recognized signs, Goal 2 turns them into a confirmed spoken sentence and carries the reply back, and Goal 3 makes the complete system run on portable hardware without a network connection. Table 3 summarizes the targets and how each will be verified, and Table 4 lists the team members responsible for each goal.</w:t>
       </w:r>
     </w:p>
     <w:p>
@@ -3034,7 +3034,37 @@
           <w:sz w:val="24"/>
           <w:szCs w:val="24"/>
         </w:rPr>
-        <w:t xml:space="preserve">The first goal is to recognize a vocabulary of 100–250 ASL signs, chosen for the service-counter setting, from body and hand landmarks captured by a single RGB camera. The target is at least 75% top-1 and 90% top-5 accuracy on signers not seen during training, measured on the ASL Citizen test split and on our own recordings [2]. The recognizer must also produce reliable confidence scores so that the device can abstain on uncertain signs. We will therefore report both the accuracy on the signs the device accepts and the share of signs it accepts, using risk–coverage analysis [14]. This goal covers vocabulary selection, landmark extraction, rest-pose segmentation, model training and confidence calibration.</w:t>
+        <w:t xml:space="preserve">The first goal is to recognize a vocabulary of 100–250 ASL signs from the camera image, and to know when the recognition is not reliable. The vocabulary will be chosen for the service-counter setting, covering greetings, common requests, questions about prices and directions, numbers and basic responses. To make sure the selected signs are the ones Deaf users actually need, the vocabulary will be reviewed with Deaf ASL users before training begins.</w:t>
+      </w:r>
+    </w:p>
+    <w:p>
+      <w:pPr>
+        <w:spacing w:after="120" w:line="360"/>
+        <w:ind w:firstLine="720"/>
+        <w:jc w:val="both"/>
+      </w:pPr>
+      <w:r>
+        <w:rPr>
+          <w:rFonts w:ascii="Times New Roman" w:cs="Times New Roman" w:eastAsia="Times New Roman" w:hAnsi="Times New Roman"/>
+          <w:sz w:val="24"/>
+          <w:szCs w:val="24"/>
+        </w:rPr>
+        <w:t xml:space="preserve">Recognition works on body and hand landmarks rather than raw video, which keeps the model small enough for the embedded hardware. MediaPipe extracts the landmarks from each frame [6], and the user returns the hands to a rest position between signs so that the device can tell where each sign ends. A lightweight landmark-based classifier, following the design of the winning Kaggle solution [7], will be trained on the ASL Citizen dataset [2] and outputs the five most likely signs with a confidence score for each.</w:t>
+      </w:r>
+    </w:p>
+    <w:p>
+      <w:pPr>
+        <w:spacing w:after="120" w:line="360"/>
+        <w:ind w:firstLine="720"/>
+        <w:jc w:val="both"/>
+      </w:pPr>
+      <w:r>
+        <w:rPr>
+          <w:rFonts w:ascii="Times New Roman" w:cs="Times New Roman" w:eastAsia="Times New Roman" w:hAnsi="Times New Roman"/>
+          <w:sz w:val="24"/>
+          <w:szCs w:val="24"/>
+        </w:rPr>
+        <w:t xml:space="preserve">The confidence scores are as important as the predictions themselves, because the device uses them to decide whether to accept a sign or to ask the user. A calibration step will adjust the scores so that, for example, signs reported with 90% confidence are correct about 90% of the time. The targets are at least 75% top-1 and 90% top-5 accuracy on signers not seen during training, measured on the ASL Citizen signer-independent test split and on recordings from our own test users. In addition, we will report the accuracy on the signs the device accepts together with the share of signs it accepts, using risk–coverage analysis [14]. Accuracy will be reported separately for each test signer, so that any signer for whom the system performs poorly is visible rather than hidden in an average.</w:t>
       </w:r>
     </w:p>
     <w:p>
@@ -3066,7 +3096,37 @@
           <w:sz w:val="24"/>
           <w:szCs w:val="24"/>
         </w:rPr>
-        <w:t xml:space="preserve">The second goal is to turn recognized signs into an English sentence, let the user confirm or edit it on the touchscreen, translate it into Turkish or Spanish when selected, and speak it aloud. In the other direction, the hearing person's speech is converted into English text on the same screen. The target is less than 1.2 s from the user's confirmation to the start of speech. Translation quality will be checked on a fixed test set of service-counter phrases, rated by native Turkish and Spanish speakers.</w:t>
+        <w:t xml:space="preserve">The second goal is to turn the recognized signs into a correct spoken sentence in the language the user selects, and to carry the hearing person's reply back as text. Recognized signs are ASL glosses, so a sentence builder first produces natural English. It uses templates for frequent service-counter phrases, such as “I would like ___” or “How much is ___?”, and falls back to a small language model for other sign sequences [10].</w:t>
+      </w:r>
+    </w:p>
+    <w:p>
+      <w:pPr>
+        <w:spacing w:after="120" w:line="360"/>
+        <w:ind w:firstLine="720"/>
+        <w:jc w:val="both"/>
+      </w:pPr>
+      <w:r>
+        <w:rPr>
+          <w:rFonts w:ascii="Times New Roman" w:cs="Times New Roman" w:eastAsia="Times New Roman" w:hAnsi="Times New Roman"/>
+          <w:sz w:val="24"/>
+          <w:szCs w:val="24"/>
+        </w:rPr>
+        <w:t xml:space="preserve">The English sentence is shown on the touchscreen, where the user can confirm it, replace a word with another candidate, delete a word, or sign again. Only a confirmed sentence is passed on. If Turkish or Spanish is selected, the sentence is translated with NLLB-200 [11]; if English is selected, translation is skipped. Piper then speaks the sentence with a voice for the selected language [12]. In the reverse direction, a voice-activity detector starts recording when the hearing person speaks, and the microphone is muted while the device is speaking. Whisper transcribes the reply and translates it into English [13], using the selected language as a hint to improve accuracy, and the text is shown on the touchscreen.</w:t>
+      </w:r>
+    </w:p>
+    <w:p>
+      <w:pPr>
+        <w:spacing w:after="120" w:line="360"/>
+        <w:ind w:firstLine="720"/>
+        <w:jc w:val="both"/>
+      </w:pPr>
+      <w:r>
+        <w:rPr>
+          <w:rFonts w:ascii="Times New Roman" w:cs="Times New Roman" w:eastAsia="Times New Roman" w:hAnsi="Times New Roman"/>
+          <w:sz w:val="24"/>
+          <w:szCs w:val="24"/>
+        </w:rPr>
+        <w:t xml:space="preserve">The main target for this goal is a latency of less than 1.2 s from the user's confirmation to the start of speech, which keeps the conversation flowing. Translation quality will be checked on a fixed test set of service-counter phrases, with each Turkish and Spanish output rated by native speakers. The accuracy of the reply channel will be measured as the word error rate of the transcription on recorded test replies.</w:t>
       </w:r>
     </w:p>
     <w:p>
@@ -3098,7 +3158,54 @@
           <w:sz w:val="24"/>
           <w:szCs w:val="24"/>
         </w:rPr>
-        <w:t xml:space="preserve">The third goal is to run the complete system on an NVIDIA Jetson Orin Nano in a portable enclosure with a camera, touchscreen, microphone and speaker, without any network connection. The targets are landmark extraction and recognition at no less than 15 frames per second, all models fitting within the module's 8 GB of memory, and a full conversation working with networking disabled. We will also measure the device's power draw in watts to guide the choice of power supply.</w:t>
+        <w:t xml:space="preserve">The third goal is to run the complete system on an NVIDIA Jetson Orin Nano, which the team will purchase, in a portable enclosure with a camera, touchscreen, microphone and speaker. All processing must happen on the device without any network connection, which is what allows the device to protect users' privacy and to work in places without internet access.</w:t>
+      </w:r>
+    </w:p>
+    <w:p>
+      <w:pPr>
+        <w:spacing w:after="120" w:line="360"/>
+        <w:ind w:firstLine="720"/>
+        <w:jc w:val="both"/>
+      </w:pPr>
+      <w:r>
+        <w:rPr>
+          <w:rFonts w:ascii="Times New Roman" w:cs="Times New Roman" w:eastAsia="Times New Roman" w:hAnsi="Times New Roman"/>
+          <w:sz w:val="24"/>
+          <w:szCs w:val="24"/>
+        </w:rPr>
+        <w:t xml:space="preserve">Running several neural networks at the same time on an embedded module is the main engineering challenge of the project. The landmark extractor, sign recognizer, sentence builder, translation model, text-to-speech system and speech recognizer all share the module's 8 GB of memory and its graphics processor. The models will therefore be converted to optimized runtimes such as ONNX Runtime or TensorRT, and the smallest model size that meets the accuracy targets will be chosen for each component. The targets are landmark extraction and recognition at no less than 15 frames per second during live use, all models fitting within the available memory, and a complete conversation working with networking disabled. We will also measure the device's power draw in watts, both idle and in use, to choose between battery and wall power.</w:t>
+      </w:r>
+    </w:p>
+    <w:p>
+      <w:pPr>
+        <w:pStyle w:val="IntroSubsection"/>
+        <w:keepNext/>
+        <w:spacing w:after="100" w:before="200"/>
+      </w:pPr>
+      <w:r>
+        <w:rPr>
+          <w:rFonts w:ascii="Times New Roman" w:cs="Times New Roman" w:eastAsia="Times New Roman" w:hAnsi="Times New Roman"/>
+          <w:b/>
+          <w:bCs/>
+          <w:sz w:val="24"/>
+          <w:szCs w:val="24"/>
+        </w:rPr>
+        <w:t xml:space="preserve">4.4 Team Responsibilities</w:t>
+      </w:r>
+    </w:p>
+    <w:p>
+      <w:pPr>
+        <w:spacing w:after="120" w:line="360"/>
+        <w:ind w:firstLine="720"/>
+        <w:jc w:val="both"/>
+      </w:pPr>
+      <w:r>
+        <w:rPr>
+          <w:rFonts w:ascii="Times New Roman" w:cs="Times New Roman" w:eastAsia="Times New Roman" w:hAnsi="Times New Roman"/>
+          <w:sz w:val="24"/>
+          <w:szCs w:val="24"/>
+        </w:rPr>
+        <w:t xml:space="preserve">Each team member will lead one area and support another, so that every goal has at least two people who understand it and the project does not depend on a single person for any part. Shared tasks, including the schedule, reports, presentations and user testing, are coordinated by the project-wide lead. The assignments will be finalized by the team and are listed in Table 4.</w:t>
       </w:r>
     </w:p>
     <w:p>
@@ -3123,7 +3230,7 @@
           <w:sz w:val="20"/>
           <w:szCs w:val="20"/>
         </w:rPr>
-        <w:t xml:space="preserve">Team responsibilities for the technical goals. Each member leads one area and supports another, so every goal has at least two people familiar with it.</w:t>
+        <w:t xml:space="preserve">Measurable targets and verification methods for the technical goals.</w:t>
       </w:r>
     </w:p>
     <w:tbl>
@@ -3139,10 +3246,9 @@
         </w:tblBorders>
       </w:tblPr>
       <w:tblGrid>
-        <w:gridCol w:w="1900"/>
-        <w:gridCol w:w="1300"/>
-        <w:gridCol w:w="1300"/>
-        <w:gridCol w:w="4860"/>
+        <w:gridCol w:w="2200"/>
+        <w:gridCol w:w="3400"/>
+        <w:gridCol w:w="3760"/>
       </w:tblGrid>
       <w:tr>
         <w:trPr>
@@ -3151,7 +3257,7 @@
         </w:trPr>
         <w:tc>
           <w:tcPr>
-            <w:tcW w:type="dxa" w:w="1900"/>
+            <w:tcW w:type="dxa" w:w="2200"/>
             <w:tcBorders>
               <w:top w:val="single" w:color="000000" w:sz="12"/>
               <w:left w:val="none" w:color="FFFFFF" w:sz="0"/>
@@ -3185,7 +3291,7 @@
         </w:tc>
         <w:tc>
           <w:tcPr>
-            <w:tcW w:type="dxa" w:w="1300"/>
+            <w:tcW w:type="dxa" w:w="3400"/>
             <w:tcBorders>
               <w:top w:val="single" w:color="000000" w:sz="12"/>
               <w:left w:val="none" w:color="FFFFFF" w:sz="0"/>
@@ -3213,13 +3319,13 @@
                 <w:sz w:val="20"/>
                 <w:szCs w:val="20"/>
               </w:rPr>
-              <w:t xml:space="preserve">Lead</w:t>
-            </w:r>
-          </w:p>
-        </w:tc>
-        <w:tc>
-          <w:tcPr>
-            <w:tcW w:type="dxa" w:w="1300"/>
+              <w:t xml:space="preserve">Target</w:t>
+            </w:r>
+          </w:p>
+        </w:tc>
+        <w:tc>
+          <w:tcPr>
+            <w:tcW w:type="dxa" w:w="3760"/>
             <w:tcBorders>
               <w:top w:val="single" w:color="000000" w:sz="12"/>
               <w:left w:val="none" w:color="FFFFFF" w:sz="0"/>
@@ -3247,41 +3353,7 @@
                 <w:sz w:val="20"/>
                 <w:szCs w:val="20"/>
               </w:rPr>
-              <w:t xml:space="preserve">Support</w:t>
-            </w:r>
-          </w:p>
-        </w:tc>
-        <w:tc>
-          <w:tcPr>
-            <w:tcW w:type="dxa" w:w="4860"/>
-            <w:tcBorders>
-              <w:top w:val="single" w:color="000000" w:sz="12"/>
-              <w:left w:val="none" w:color="FFFFFF" w:sz="0"/>
-              <w:bottom w:val="single" w:color="000000" w:sz="4"/>
-              <w:right w:val="none" w:color="FFFFFF" w:sz="0"/>
-            </w:tcBorders>
-            <w:tcMar>
-              <w:top w:type="dxa" w:w="80"/>
-              <w:left w:type="dxa" w:w="80"/>
-              <w:bottom w:type="dxa" w:w="80"/>
-              <w:right w:type="dxa" w:w="80"/>
-            </w:tcMar>
-          </w:tcPr>
-          <w:p>
-            <w:pPr>
-              <w:keepNext/>
-            </w:pPr>
-            <w:r>
-              <w:rPr>
-                <w:rFonts w:ascii="Times New Roman" w:cs="Times New Roman" w:eastAsia="Times New Roman" w:hAnsi="Times New Roman"/>
-                <w:b/>
-                <w:bCs/>
-                <w:i w:val="false"/>
-                <w:iCs w:val="false"/>
-                <w:sz w:val="20"/>
-                <w:szCs w:val="20"/>
-              </w:rPr>
-              <w:t xml:space="preserve">Main tasks</w:t>
+              <w:t xml:space="preserve">How it will be verified</w:t>
             </w:r>
           </w:p>
         </w:tc>
@@ -3293,7 +3365,7 @@
         </w:trPr>
         <w:tc>
           <w:tcPr>
-            <w:tcW w:type="dxa" w:w="1900"/>
+            <w:tcW w:type="dxa" w:w="2200"/>
             <w:tcBorders>
               <w:top w:val="single" w:color="000000" w:sz="4"/>
               <w:left w:val="none" w:color="FFFFFF" w:sz="0"/>
@@ -3327,7 +3399,7 @@
         </w:tc>
         <w:tc>
           <w:tcPr>
-            <w:tcW w:type="dxa" w:w="1300"/>
+            <w:tcW w:type="dxa" w:w="3400"/>
             <w:tcBorders>
               <w:top w:val="single" w:color="000000" w:sz="4"/>
               <w:left w:val="none" w:color="FFFFFF" w:sz="0"/>
@@ -3355,13 +3427,13 @@
                 <w:sz w:val="20"/>
                 <w:szCs w:val="20"/>
               </w:rPr>
-              <w:t xml:space="preserve">To be assigned</w:t>
-            </w:r>
-          </w:p>
-        </w:tc>
-        <w:tc>
-          <w:tcPr>
-            <w:tcW w:type="dxa" w:w="1300"/>
+              <w:t xml:space="preserve">≥ 75% top-1 and ≥ 90% top-5 accuracy on unseen signers, for 100–250 signs</w:t>
+            </w:r>
+          </w:p>
+        </w:tc>
+        <w:tc>
+          <w:tcPr>
+            <w:tcW w:type="dxa" w:w="3760"/>
             <w:tcBorders>
               <w:top w:val="single" w:color="000000" w:sz="4"/>
               <w:left w:val="none" w:color="FFFFFF" w:sz="0"/>
@@ -3389,41 +3461,7 @@
                 <w:sz w:val="20"/>
                 <w:szCs w:val="20"/>
               </w:rPr>
-              <w:t xml:space="preserve">To be assigned</w:t>
-            </w:r>
-          </w:p>
-        </w:tc>
-        <w:tc>
-          <w:tcPr>
-            <w:tcW w:type="dxa" w:w="4860"/>
-            <w:tcBorders>
-              <w:top w:val="single" w:color="000000" w:sz="4"/>
-              <w:left w:val="none" w:color="FFFFFF" w:sz="0"/>
-              <w:bottom w:val="none" w:color="FFFFFF" w:sz="0"/>
-              <w:right w:val="none" w:color="FFFFFF" w:sz="0"/>
-            </w:tcBorders>
-            <w:tcMar>
-              <w:top w:type="dxa" w:w="50"/>
-              <w:left w:type="dxa" w:w="80"/>
-              <w:bottom w:type="dxa" w:w="50"/>
-              <w:right w:type="dxa" w:w="80"/>
-            </w:tcMar>
-          </w:tcPr>
-          <w:p>
-            <w:pPr>
-              <w:keepNext/>
-            </w:pPr>
-            <w:r>
-              <w:rPr>
-                <w:rFonts w:ascii="Times New Roman" w:cs="Times New Roman" w:eastAsia="Times New Roman" w:hAnsi="Times New Roman"/>
-                <w:b w:val="false"/>
-                <w:bCs w:val="false"/>
-                <w:i w:val="false"/>
-                <w:iCs w:val="false"/>
-                <w:sz w:val="20"/>
-                <w:szCs w:val="20"/>
-              </w:rPr>
-              <w:t xml:space="preserve">Vocabulary selection, landmark extraction, rest-pose segmentation, model training, confidence calibration, accuracy evaluation</w:t>
+              <w:t xml:space="preserve">ASL Citizen signer-independent test split and recordings from our own test users</w:t>
             </w:r>
           </w:p>
         </w:tc>
@@ -3435,7 +3473,7 @@
         </w:trPr>
         <w:tc>
           <w:tcPr>
-            <w:tcW w:type="dxa" w:w="1900"/>
+            <w:tcW w:type="dxa" w:w="2200"/>
             <w:tcBorders>
               <w:top w:val="none" w:color="FFFFFF" w:sz="0"/>
               <w:left w:val="none" w:color="FFFFFF" w:sz="0"/>
@@ -3463,13 +3501,13 @@
                 <w:sz w:val="20"/>
                 <w:szCs w:val="20"/>
               </w:rPr>
-              <w:t xml:space="preserve">2. Language and speech</w:t>
-            </w:r>
-          </w:p>
-        </w:tc>
-        <w:tc>
-          <w:tcPr>
-            <w:tcW w:type="dxa" w:w="1300"/>
+              <w:t xml:space="preserve">1. Sign recognition</w:t>
+            </w:r>
+          </w:p>
+        </w:tc>
+        <w:tc>
+          <w:tcPr>
+            <w:tcW w:type="dxa" w:w="3400"/>
             <w:tcBorders>
               <w:top w:val="none" w:color="FFFFFF" w:sz="0"/>
               <w:left w:val="none" w:color="FFFFFF" w:sz="0"/>
@@ -3497,13 +3535,13 @@
                 <w:sz w:val="20"/>
                 <w:szCs w:val="20"/>
               </w:rPr>
-              <w:t xml:space="preserve">To be assigned</w:t>
-            </w:r>
-          </w:p>
-        </w:tc>
-        <w:tc>
-          <w:tcPr>
-            <w:tcW w:type="dxa" w:w="1300"/>
+              <w:t xml:space="preserve">Accuracy on accepted signs reported together with the share of signs accepted</w:t>
+            </w:r>
+          </w:p>
+        </w:tc>
+        <w:tc>
+          <w:tcPr>
+            <w:tcW w:type="dxa" w:w="3760"/>
             <w:tcBorders>
               <w:top w:val="none" w:color="FFFFFF" w:sz="0"/>
               <w:left w:val="none" w:color="FFFFFF" w:sz="0"/>
@@ -3531,41 +3569,7 @@
                 <w:sz w:val="20"/>
                 <w:szCs w:val="20"/>
               </w:rPr>
-              <w:t xml:space="preserve">To be assigned</w:t>
-            </w:r>
-          </w:p>
-        </w:tc>
-        <w:tc>
-          <w:tcPr>
-            <w:tcW w:type="dxa" w:w="4860"/>
-            <w:tcBorders>
-              <w:top w:val="none" w:color="FFFFFF" w:sz="0"/>
-              <w:left w:val="none" w:color="FFFFFF" w:sz="0"/>
-              <w:bottom w:val="none" w:color="FFFFFF" w:sz="0"/>
-              <w:right w:val="none" w:color="FFFFFF" w:sz="0"/>
-            </w:tcBorders>
-            <w:tcMar>
-              <w:top w:type="dxa" w:w="50"/>
-              <w:left w:type="dxa" w:w="80"/>
-              <w:bottom w:type="dxa" w:w="50"/>
-              <w:right w:type="dxa" w:w="80"/>
-            </w:tcMar>
-          </w:tcPr>
-          <w:p>
-            <w:pPr>
-              <w:keepNext/>
-            </w:pPr>
-            <w:r>
-              <w:rPr>
-                <w:rFonts w:ascii="Times New Roman" w:cs="Times New Roman" w:eastAsia="Times New Roman" w:hAnsi="Times New Roman"/>
-                <w:b w:val="false"/>
-                <w:bCs w:val="false"/>
-                <w:i w:val="false"/>
-                <w:iCs w:val="false"/>
-                <w:sz w:val="20"/>
-                <w:szCs w:val="20"/>
-              </w:rPr>
-              <w:t xml:space="preserve">Sentence builder, touchscreen interface, translation, text-to-speech, speech recognition, latency measurement</w:t>
+              <w:t xml:space="preserve">Risk–coverage curves over a range of confidence thresholds</w:t>
             </w:r>
           </w:p>
         </w:tc>
@@ -3577,7 +3581,7 @@
         </w:trPr>
         <w:tc>
           <w:tcPr>
-            <w:tcW w:type="dxa" w:w="1900"/>
+            <w:tcW w:type="dxa" w:w="2200"/>
             <w:tcBorders>
               <w:top w:val="none" w:color="FFFFFF" w:sz="0"/>
               <w:left w:val="none" w:color="FFFFFF" w:sz="0"/>
@@ -3605,13 +3609,13 @@
                 <w:sz w:val="20"/>
                 <w:szCs w:val="20"/>
               </w:rPr>
-              <w:t xml:space="preserve">3. Embedded integration</w:t>
-            </w:r>
-          </w:p>
-        </w:tc>
-        <w:tc>
-          <w:tcPr>
-            <w:tcW w:type="dxa" w:w="1300"/>
+              <w:t xml:space="preserve">2. Language and speech</w:t>
+            </w:r>
+          </w:p>
+        </w:tc>
+        <w:tc>
+          <w:tcPr>
+            <w:tcW w:type="dxa" w:w="3400"/>
             <w:tcBorders>
               <w:top w:val="none" w:color="FFFFFF" w:sz="0"/>
               <w:left w:val="none" w:color="FFFFFF" w:sz="0"/>
@@ -3639,13 +3643,13 @@
                 <w:sz w:val="20"/>
                 <w:szCs w:val="20"/>
               </w:rPr>
-              <w:t xml:space="preserve">To be assigned</w:t>
-            </w:r>
-          </w:p>
-        </w:tc>
-        <w:tc>
-          <w:tcPr>
-            <w:tcW w:type="dxa" w:w="1300"/>
+              <w:t xml:space="preserve">&lt; 1.2 s from the user's confirmation to the start of speech</w:t>
+            </w:r>
+          </w:p>
+        </w:tc>
+        <w:tc>
+          <w:tcPr>
+            <w:tcW w:type="dxa" w:w="3760"/>
             <w:tcBorders>
               <w:top w:val="none" w:color="FFFFFF" w:sz="0"/>
               <w:left w:val="none" w:color="FFFFFF" w:sz="0"/>
@@ -3673,41 +3677,7 @@
                 <w:sz w:val="20"/>
                 <w:szCs w:val="20"/>
               </w:rPr>
-              <w:t xml:space="preserve">To be assigned</w:t>
-            </w:r>
-          </w:p>
-        </w:tc>
-        <w:tc>
-          <w:tcPr>
-            <w:tcW w:type="dxa" w:w="4860"/>
-            <w:tcBorders>
-              <w:top w:val="none" w:color="FFFFFF" w:sz="0"/>
-              <w:left w:val="none" w:color="FFFFFF" w:sz="0"/>
-              <w:bottom w:val="none" w:color="FFFFFF" w:sz="0"/>
-              <w:right w:val="none" w:color="FFFFFF" w:sz="0"/>
-            </w:tcBorders>
-            <w:tcMar>
-              <w:top w:type="dxa" w:w="50"/>
-              <w:left w:type="dxa" w:w="80"/>
-              <w:bottom w:type="dxa" w:w="50"/>
-              <w:right w:type="dxa" w:w="80"/>
-            </w:tcMar>
-          </w:tcPr>
-          <w:p>
-            <w:pPr>
-              <w:keepNext/>
-            </w:pPr>
-            <w:r>
-              <w:rPr>
-                <w:rFonts w:ascii="Times New Roman" w:cs="Times New Roman" w:eastAsia="Times New Roman" w:hAnsi="Times New Roman"/>
-                <w:b w:val="false"/>
-                <w:bCs w:val="false"/>
-                <w:i w:val="false"/>
-                <w:iCs w:val="false"/>
-                <w:sz w:val="20"/>
-                <w:szCs w:val="20"/>
-              </w:rPr>
-              <w:t xml:space="preserve">Hardware purchase and setup, enclosure, deployment on the Jetson Orin Nano, frame-rate and power measurement</w:t>
+              <w:t xml:space="preserve">Timestamps logged on the device for every test sentence</w:t>
             </w:r>
           </w:p>
         </w:tc>
@@ -3719,10 +3689,442 @@
         </w:trPr>
         <w:tc>
           <w:tcPr>
-            <w:tcW w:type="dxa" w:w="1900"/>
+            <w:tcW w:type="dxa" w:w="2200"/>
             <w:tcBorders>
               <w:top w:val="none" w:color="FFFFFF" w:sz="0"/>
               <w:left w:val="none" w:color="FFFFFF" w:sz="0"/>
+              <w:bottom w:val="none" w:color="FFFFFF" w:sz="0"/>
+              <w:right w:val="none" w:color="FFFFFF" w:sz="0"/>
+            </w:tcBorders>
+            <w:tcMar>
+              <w:top w:type="dxa" w:w="50"/>
+              <w:left w:type="dxa" w:w="80"/>
+              <w:bottom w:type="dxa" w:w="50"/>
+              <w:right w:type="dxa" w:w="80"/>
+            </w:tcMar>
+          </w:tcPr>
+          <w:p>
+            <w:pPr>
+              <w:keepNext/>
+            </w:pPr>
+            <w:r>
+              <w:rPr>
+                <w:rFonts w:ascii="Times New Roman" w:cs="Times New Roman" w:eastAsia="Times New Roman" w:hAnsi="Times New Roman"/>
+                <w:b w:val="false"/>
+                <w:bCs w:val="false"/>
+                <w:i w:val="false"/>
+                <w:iCs w:val="false"/>
+                <w:sz w:val="20"/>
+                <w:szCs w:val="20"/>
+              </w:rPr>
+              <w:t xml:space="preserve">2. Language and speech</w:t>
+            </w:r>
+          </w:p>
+        </w:tc>
+        <w:tc>
+          <w:tcPr>
+            <w:tcW w:type="dxa" w:w="3400"/>
+            <w:tcBorders>
+              <w:top w:val="none" w:color="FFFFFF" w:sz="0"/>
+              <w:left w:val="none" w:color="FFFFFF" w:sz="0"/>
+              <w:bottom w:val="none" w:color="FFFFFF" w:sz="0"/>
+              <w:right w:val="none" w:color="FFFFFF" w:sz="0"/>
+            </w:tcBorders>
+            <w:tcMar>
+              <w:top w:type="dxa" w:w="50"/>
+              <w:left w:type="dxa" w:w="80"/>
+              <w:bottom w:type="dxa" w:w="50"/>
+              <w:right w:type="dxa" w:w="80"/>
+            </w:tcMar>
+          </w:tcPr>
+          <w:p>
+            <w:pPr>
+              <w:keepNext/>
+            </w:pPr>
+            <w:r>
+              <w:rPr>
+                <w:rFonts w:ascii="Times New Roman" w:cs="Times New Roman" w:eastAsia="Times New Roman" w:hAnsi="Times New Roman"/>
+                <w:b w:val="false"/>
+                <w:bCs w:val="false"/>
+                <w:i w:val="false"/>
+                <w:iCs w:val="false"/>
+                <w:sz w:val="20"/>
+                <w:szCs w:val="20"/>
+              </w:rPr>
+              <w:t xml:space="preserve">Turkish and Spanish output judged acceptable for service-counter phrases</w:t>
+            </w:r>
+          </w:p>
+        </w:tc>
+        <w:tc>
+          <w:tcPr>
+            <w:tcW w:type="dxa" w:w="3760"/>
+            <w:tcBorders>
+              <w:top w:val="none" w:color="FFFFFF" w:sz="0"/>
+              <w:left w:val="none" w:color="FFFFFF" w:sz="0"/>
+              <w:bottom w:val="none" w:color="FFFFFF" w:sz="0"/>
+              <w:right w:val="none" w:color="FFFFFF" w:sz="0"/>
+            </w:tcBorders>
+            <w:tcMar>
+              <w:top w:type="dxa" w:w="50"/>
+              <w:left w:type="dxa" w:w="80"/>
+              <w:bottom w:type="dxa" w:w="50"/>
+              <w:right w:type="dxa" w:w="80"/>
+            </w:tcMar>
+          </w:tcPr>
+          <w:p>
+            <w:pPr>
+              <w:keepNext/>
+            </w:pPr>
+            <w:r>
+              <w:rPr>
+                <w:rFonts w:ascii="Times New Roman" w:cs="Times New Roman" w:eastAsia="Times New Roman" w:hAnsi="Times New Roman"/>
+                <w:b w:val="false"/>
+                <w:bCs w:val="false"/>
+                <w:i w:val="false"/>
+                <w:iCs w:val="false"/>
+                <w:sz w:val="20"/>
+                <w:szCs w:val="20"/>
+              </w:rPr>
+              <w:t xml:space="preserve">A fixed test set of phrases rated by native speakers</w:t>
+            </w:r>
+          </w:p>
+        </w:tc>
+      </w:tr>
+      <w:tr>
+        <w:trPr>
+          <w:cantSplit/>
+          <w:tblHeader w:val="false"/>
+        </w:trPr>
+        <w:tc>
+          <w:tcPr>
+            <w:tcW w:type="dxa" w:w="2200"/>
+            <w:tcBorders>
+              <w:top w:val="none" w:color="FFFFFF" w:sz="0"/>
+              <w:left w:val="none" w:color="FFFFFF" w:sz="0"/>
+              <w:bottom w:val="none" w:color="FFFFFF" w:sz="0"/>
+              <w:right w:val="none" w:color="FFFFFF" w:sz="0"/>
+            </w:tcBorders>
+            <w:tcMar>
+              <w:top w:type="dxa" w:w="50"/>
+              <w:left w:type="dxa" w:w="80"/>
+              <w:bottom w:type="dxa" w:w="50"/>
+              <w:right w:type="dxa" w:w="80"/>
+            </w:tcMar>
+          </w:tcPr>
+          <w:p>
+            <w:pPr>
+              <w:keepNext/>
+            </w:pPr>
+            <w:r>
+              <w:rPr>
+                <w:rFonts w:ascii="Times New Roman" w:cs="Times New Roman" w:eastAsia="Times New Roman" w:hAnsi="Times New Roman"/>
+                <w:b w:val="false"/>
+                <w:bCs w:val="false"/>
+                <w:i w:val="false"/>
+                <w:iCs w:val="false"/>
+                <w:sz w:val="20"/>
+                <w:szCs w:val="20"/>
+              </w:rPr>
+              <w:t xml:space="preserve">2. Language and speech</w:t>
+            </w:r>
+          </w:p>
+        </w:tc>
+        <w:tc>
+          <w:tcPr>
+            <w:tcW w:type="dxa" w:w="3400"/>
+            <w:tcBorders>
+              <w:top w:val="none" w:color="FFFFFF" w:sz="0"/>
+              <w:left w:val="none" w:color="FFFFFF" w:sz="0"/>
+              <w:bottom w:val="none" w:color="FFFFFF" w:sz="0"/>
+              <w:right w:val="none" w:color="FFFFFF" w:sz="0"/>
+            </w:tcBorders>
+            <w:tcMar>
+              <w:top w:type="dxa" w:w="50"/>
+              <w:left w:type="dxa" w:w="80"/>
+              <w:bottom w:type="dxa" w:w="50"/>
+              <w:right w:type="dxa" w:w="80"/>
+            </w:tcMar>
+          </w:tcPr>
+          <w:p>
+            <w:pPr>
+              <w:keepNext/>
+            </w:pPr>
+            <w:r>
+              <w:rPr>
+                <w:rFonts w:ascii="Times New Roman" w:cs="Times New Roman" w:eastAsia="Times New Roman" w:hAnsi="Times New Roman"/>
+                <w:b w:val="false"/>
+                <w:bCs w:val="false"/>
+                <w:i w:val="false"/>
+                <w:iCs w:val="false"/>
+                <w:sz w:val="20"/>
+                <w:szCs w:val="20"/>
+              </w:rPr>
+              <w:t xml:space="preserve">Hearing person's reply shown as readable English text</w:t>
+            </w:r>
+          </w:p>
+        </w:tc>
+        <w:tc>
+          <w:tcPr>
+            <w:tcW w:type="dxa" w:w="3760"/>
+            <w:tcBorders>
+              <w:top w:val="none" w:color="FFFFFF" w:sz="0"/>
+              <w:left w:val="none" w:color="FFFFFF" w:sz="0"/>
+              <w:bottom w:val="none" w:color="FFFFFF" w:sz="0"/>
+              <w:right w:val="none" w:color="FFFFFF" w:sz="0"/>
+            </w:tcBorders>
+            <w:tcMar>
+              <w:top w:type="dxa" w:w="50"/>
+              <w:left w:type="dxa" w:w="80"/>
+              <w:bottom w:type="dxa" w:w="50"/>
+              <w:right w:type="dxa" w:w="80"/>
+            </w:tcMar>
+          </w:tcPr>
+          <w:p>
+            <w:pPr>
+              <w:keepNext/>
+            </w:pPr>
+            <w:r>
+              <w:rPr>
+                <w:rFonts w:ascii="Times New Roman" w:cs="Times New Roman" w:eastAsia="Times New Roman" w:hAnsi="Times New Roman"/>
+                <w:b w:val="false"/>
+                <w:bCs w:val="false"/>
+                <w:i w:val="false"/>
+                <w:iCs w:val="false"/>
+                <w:sz w:val="20"/>
+                <w:szCs w:val="20"/>
+              </w:rPr>
+              <w:t xml:space="preserve">Word error rate of the transcription on recorded test replies</w:t>
+            </w:r>
+          </w:p>
+        </w:tc>
+      </w:tr>
+      <w:tr>
+        <w:trPr>
+          <w:cantSplit/>
+          <w:tblHeader w:val="false"/>
+        </w:trPr>
+        <w:tc>
+          <w:tcPr>
+            <w:tcW w:type="dxa" w:w="2200"/>
+            <w:tcBorders>
+              <w:top w:val="none" w:color="FFFFFF" w:sz="0"/>
+              <w:left w:val="none" w:color="FFFFFF" w:sz="0"/>
+              <w:bottom w:val="none" w:color="FFFFFF" w:sz="0"/>
+              <w:right w:val="none" w:color="FFFFFF" w:sz="0"/>
+            </w:tcBorders>
+            <w:tcMar>
+              <w:top w:type="dxa" w:w="50"/>
+              <w:left w:type="dxa" w:w="80"/>
+              <w:bottom w:type="dxa" w:w="50"/>
+              <w:right w:type="dxa" w:w="80"/>
+            </w:tcMar>
+          </w:tcPr>
+          <w:p>
+            <w:pPr>
+              <w:keepNext/>
+            </w:pPr>
+            <w:r>
+              <w:rPr>
+                <w:rFonts w:ascii="Times New Roman" w:cs="Times New Roman" w:eastAsia="Times New Roman" w:hAnsi="Times New Roman"/>
+                <w:b w:val="false"/>
+                <w:bCs w:val="false"/>
+                <w:i w:val="false"/>
+                <w:iCs w:val="false"/>
+                <w:sz w:val="20"/>
+                <w:szCs w:val="20"/>
+              </w:rPr>
+              <w:t xml:space="preserve">3. Embedded integration</w:t>
+            </w:r>
+          </w:p>
+        </w:tc>
+        <w:tc>
+          <w:tcPr>
+            <w:tcW w:type="dxa" w:w="3400"/>
+            <w:tcBorders>
+              <w:top w:val="none" w:color="FFFFFF" w:sz="0"/>
+              <w:left w:val="none" w:color="FFFFFF" w:sz="0"/>
+              <w:bottom w:val="none" w:color="FFFFFF" w:sz="0"/>
+              <w:right w:val="none" w:color="FFFFFF" w:sz="0"/>
+            </w:tcBorders>
+            <w:tcMar>
+              <w:top w:type="dxa" w:w="50"/>
+              <w:left w:type="dxa" w:w="80"/>
+              <w:bottom w:type="dxa" w:w="50"/>
+              <w:right w:type="dxa" w:w="80"/>
+            </w:tcMar>
+          </w:tcPr>
+          <w:p>
+            <w:pPr>
+              <w:keepNext/>
+            </w:pPr>
+            <w:r>
+              <w:rPr>
+                <w:rFonts w:ascii="Times New Roman" w:cs="Times New Roman" w:eastAsia="Times New Roman" w:hAnsi="Times New Roman"/>
+                <w:b w:val="false"/>
+                <w:bCs w:val="false"/>
+                <w:i w:val="false"/>
+                <w:iCs w:val="false"/>
+                <w:sz w:val="20"/>
+                <w:szCs w:val="20"/>
+              </w:rPr>
+              <w:t xml:space="preserve">≥ 15 frames per second for landmark extraction and recognition</w:t>
+            </w:r>
+          </w:p>
+        </w:tc>
+        <w:tc>
+          <w:tcPr>
+            <w:tcW w:type="dxa" w:w="3760"/>
+            <w:tcBorders>
+              <w:top w:val="none" w:color="FFFFFF" w:sz="0"/>
+              <w:left w:val="none" w:color="FFFFFF" w:sz="0"/>
+              <w:bottom w:val="none" w:color="FFFFFF" w:sz="0"/>
+              <w:right w:val="none" w:color="FFFFFF" w:sz="0"/>
+            </w:tcBorders>
+            <w:tcMar>
+              <w:top w:type="dxa" w:w="50"/>
+              <w:left w:type="dxa" w:w="80"/>
+              <w:bottom w:type="dxa" w:w="50"/>
+              <w:right w:type="dxa" w:w="80"/>
+            </w:tcMar>
+          </w:tcPr>
+          <w:p>
+            <w:pPr>
+              <w:keepNext/>
+            </w:pPr>
+            <w:r>
+              <w:rPr>
+                <w:rFonts w:ascii="Times New Roman" w:cs="Times New Roman" w:eastAsia="Times New Roman" w:hAnsi="Times New Roman"/>
+                <w:b w:val="false"/>
+                <w:bCs w:val="false"/>
+                <w:i w:val="false"/>
+                <w:iCs w:val="false"/>
+                <w:sz w:val="20"/>
+                <w:szCs w:val="20"/>
+              </w:rPr>
+              <w:t xml:space="preserve">Profiling on the Jetson Orin Nano during live use</w:t>
+            </w:r>
+          </w:p>
+        </w:tc>
+      </w:tr>
+      <w:tr>
+        <w:trPr>
+          <w:cantSplit/>
+          <w:tblHeader w:val="false"/>
+        </w:trPr>
+        <w:tc>
+          <w:tcPr>
+            <w:tcW w:type="dxa" w:w="2200"/>
+            <w:tcBorders>
+              <w:top w:val="none" w:color="FFFFFF" w:sz="0"/>
+              <w:left w:val="none" w:color="FFFFFF" w:sz="0"/>
+              <w:bottom w:val="none" w:color="FFFFFF" w:sz="0"/>
+              <w:right w:val="none" w:color="FFFFFF" w:sz="0"/>
+            </w:tcBorders>
+            <w:tcMar>
+              <w:top w:type="dxa" w:w="50"/>
+              <w:left w:type="dxa" w:w="80"/>
+              <w:bottom w:type="dxa" w:w="50"/>
+              <w:right w:type="dxa" w:w="80"/>
+            </w:tcMar>
+          </w:tcPr>
+          <w:p>
+            <w:pPr>
+              <w:keepNext/>
+            </w:pPr>
+            <w:r>
+              <w:rPr>
+                <w:rFonts w:ascii="Times New Roman" w:cs="Times New Roman" w:eastAsia="Times New Roman" w:hAnsi="Times New Roman"/>
+                <w:b w:val="false"/>
+                <w:bCs w:val="false"/>
+                <w:i w:val="false"/>
+                <w:iCs w:val="false"/>
+                <w:sz w:val="20"/>
+                <w:szCs w:val="20"/>
+              </w:rPr>
+              <w:t xml:space="preserve">3. Embedded integration</w:t>
+            </w:r>
+          </w:p>
+        </w:tc>
+        <w:tc>
+          <w:tcPr>
+            <w:tcW w:type="dxa" w:w="3400"/>
+            <w:tcBorders>
+              <w:top w:val="none" w:color="FFFFFF" w:sz="0"/>
+              <w:left w:val="none" w:color="FFFFFF" w:sz="0"/>
+              <w:bottom w:val="none" w:color="FFFFFF" w:sz="0"/>
+              <w:right w:val="none" w:color="FFFFFF" w:sz="0"/>
+            </w:tcBorders>
+            <w:tcMar>
+              <w:top w:type="dxa" w:w="50"/>
+              <w:left w:type="dxa" w:w="80"/>
+              <w:bottom w:type="dxa" w:w="50"/>
+              <w:right w:type="dxa" w:w="80"/>
+            </w:tcMar>
+          </w:tcPr>
+          <w:p>
+            <w:pPr>
+              <w:keepNext/>
+            </w:pPr>
+            <w:r>
+              <w:rPr>
+                <w:rFonts w:ascii="Times New Roman" w:cs="Times New Roman" w:eastAsia="Times New Roman" w:hAnsi="Times New Roman"/>
+                <w:b w:val="false"/>
+                <w:bCs w:val="false"/>
+                <w:i w:val="false"/>
+                <w:iCs w:val="false"/>
+                <w:sz w:val="20"/>
+                <w:szCs w:val="20"/>
+              </w:rPr>
+              <w:t xml:space="preserve">All models fit within 8 GB of memory; full conversation works offline</w:t>
+            </w:r>
+          </w:p>
+        </w:tc>
+        <w:tc>
+          <w:tcPr>
+            <w:tcW w:type="dxa" w:w="3760"/>
+            <w:tcBorders>
+              <w:top w:val="none" w:color="FFFFFF" w:sz="0"/>
+              <w:left w:val="none" w:color="FFFFFF" w:sz="0"/>
+              <w:bottom w:val="none" w:color="FFFFFF" w:sz="0"/>
+              <w:right w:val="none" w:color="FFFFFF" w:sz="0"/>
+            </w:tcBorders>
+            <w:tcMar>
+              <w:top w:type="dxa" w:w="50"/>
+              <w:left w:type="dxa" w:w="80"/>
+              <w:bottom w:type="dxa" w:w="50"/>
+              <w:right w:type="dxa" w:w="80"/>
+            </w:tcMar>
+          </w:tcPr>
+          <w:p>
+            <w:pPr>
+              <w:keepNext/>
+            </w:pPr>
+            <w:r>
+              <w:rPr>
+                <w:rFonts w:ascii="Times New Roman" w:cs="Times New Roman" w:eastAsia="Times New Roman" w:hAnsi="Times New Roman"/>
+                <w:b w:val="false"/>
+                <w:bCs w:val="false"/>
+                <w:i w:val="false"/>
+                <w:iCs w:val="false"/>
+                <w:sz w:val="20"/>
+                <w:szCs w:val="20"/>
+              </w:rPr>
+              <w:t xml:space="preserve">Memory monitoring and end-to-end tests with networking disabled</w:t>
+            </w:r>
+          </w:p>
+        </w:tc>
+      </w:tr>
+      <w:tr>
+        <w:trPr>
+          <w:cantSplit/>
+          <w:tblHeader w:val="false"/>
+        </w:trPr>
+        <w:tc>
+          <w:tcPr>
+            <w:tcW w:type="dxa" w:w="2200"/>
+            <w:tcBorders>
+              <w:top w:val="none" w:color="FFFFFF" w:sz="0"/>
+              <w:left w:val="none" w:color="FFFFFF" w:sz="0"/>
               <w:bottom w:val="single" w:color="000000" w:sz="12"/>
               <w:right w:val="none" w:color="FFFFFF" w:sz="0"/>
             </w:tcBorders>
@@ -3747,13 +4149,13 @@
                 <w:sz w:val="20"/>
                 <w:szCs w:val="20"/>
               </w:rPr>
-              <w:t xml:space="preserve">Project-wide</w:t>
-            </w:r>
-          </w:p>
-        </w:tc>
-        <w:tc>
-          <w:tcPr>
-            <w:tcW w:type="dxa" w:w="1300"/>
+              <w:t xml:space="preserve">3. Embedded integration</w:t>
+            </w:r>
+          </w:p>
+        </w:tc>
+        <w:tc>
+          <w:tcPr>
+            <w:tcW w:type="dxa" w:w="3400"/>
             <w:tcBorders>
               <w:top w:val="none" w:color="FFFFFF" w:sz="0"/>
               <w:left w:val="none" w:color="FFFFFF" w:sz="0"/>
@@ -3781,13 +4183,13 @@
                 <w:sz w:val="20"/>
                 <w:szCs w:val="20"/>
               </w:rPr>
-              <w:t xml:space="preserve">To be assigned</w:t>
-            </w:r>
-          </w:p>
-        </w:tc>
-        <w:tc>
-          <w:tcPr>
-            <w:tcW w:type="dxa" w:w="1300"/>
+              <w:t xml:space="preserve">Power draw measured to select the power supply</w:t>
+            </w:r>
+          </w:p>
+        </w:tc>
+        <w:tc>
+          <w:tcPr>
+            <w:tcW w:type="dxa" w:w="3760"/>
             <w:tcBorders>
               <w:top w:val="none" w:color="FFFFFF" w:sz="0"/>
               <w:left w:val="none" w:color="FFFFFF" w:sz="0"/>
@@ -3815,41 +4217,7 @@
                 <w:sz w:val="20"/>
                 <w:szCs w:val="20"/>
               </w:rPr>
-              <w:t xml:space="preserve">To be assigned</w:t>
-            </w:r>
-          </w:p>
-        </w:tc>
-        <w:tc>
-          <w:tcPr>
-            <w:tcW w:type="dxa" w:w="4860"/>
-            <w:tcBorders>
-              <w:top w:val="none" w:color="FFFFFF" w:sz="0"/>
-              <w:left w:val="none" w:color="FFFFFF" w:sz="0"/>
-              <w:bottom w:val="single" w:color="000000" w:sz="12"/>
-              <w:right w:val="none" w:color="FFFFFF" w:sz="0"/>
-            </w:tcBorders>
-            <w:tcMar>
-              <w:top w:type="dxa" w:w="50"/>
-              <w:left w:type="dxa" w:w="80"/>
-              <w:bottom w:type="dxa" w:w="50"/>
-              <w:right w:type="dxa" w:w="80"/>
-            </w:tcMar>
-          </w:tcPr>
-          <w:p>
-            <w:pPr>
-              <w:keepNext w:val="false"/>
-            </w:pPr>
-            <w:r>
-              <w:rPr>
-                <w:rFonts w:ascii="Times New Roman" w:cs="Times New Roman" w:eastAsia="Times New Roman" w:hAnsi="Times New Roman"/>
-                <w:b w:val="false"/>
-                <w:bCs w:val="false"/>
-                <w:i w:val="false"/>
-                <w:iCs w:val="false"/>
-                <w:sz w:val="20"/>
-                <w:szCs w:val="20"/>
-              </w:rPr>
-              <w:t xml:space="preserve">Schedule, reports, user testing with Deaf ASL users, documentation</w:t>
+              <w:t xml:space="preserve">Power measurement in watts during idle and active use</w:t>
             </w:r>
           </w:p>
         </w:tc>
@@ -3859,117 +4227,6 @@
       <w:pPr>
         <w:spacing w:after="240"/>
       </w:pPr>
-    </w:p>
-    <w:p>
-      <w:pPr>
-        <w:pStyle w:val="IntroSection"/>
-        <w:keepNext/>
-        <w:spacing w:after="120" w:before="240"/>
-      </w:pPr>
-      <w:r>
-        <w:rPr>
-          <w:rFonts w:ascii="Times New Roman" w:cs="Times New Roman" w:eastAsia="Times New Roman" w:hAnsi="Times New Roman"/>
-          <w:b/>
-          <w:bCs/>
-          <w:sz w:val="24"/>
-          <w:szCs w:val="24"/>
-        </w:rPr>
-        <w:t xml:space="preserve">5. Projected Community Impact and Relevant Ethical Issues</w:t>
-      </w:r>
-    </w:p>
-    <w:p>
-      <w:pPr>
-        <w:pStyle w:val="IntroSubsection"/>
-        <w:keepNext/>
-        <w:spacing w:after="100" w:before="200"/>
-      </w:pPr>
-      <w:r>
-        <w:rPr>
-          <w:rFonts w:ascii="Times New Roman" w:cs="Times New Roman" w:eastAsia="Times New Roman" w:hAnsi="Times New Roman"/>
-          <w:b/>
-          <w:bCs/>
-          <w:sz w:val="24"/>
-          <w:szCs w:val="24"/>
-        </w:rPr>
-        <w:t xml:space="preserve">5.1 Community Impact</w:t>
-      </w:r>
-    </w:p>
-    <w:p>
-      <w:pPr>
-        <w:spacing w:after="120" w:line="360"/>
-        <w:ind w:firstLine="720"/>
-        <w:jc w:val="both"/>
-      </w:pPr>
-      <w:r>
-        <w:rPr>
-          <w:rFonts w:ascii="Times New Roman" w:cs="Times New Roman" w:eastAsia="Times New Roman" w:hAnsi="Times New Roman"/>
-          <w:sz w:val="24"/>
-          <w:szCs w:val="24"/>
-        </w:rPr>
-        <w:t xml:space="preserve">The main beneficiaries are Deaf ASL users, whose need for interpreters often goes unmet [1]. The device lets them communicate independently in everyday exchanges, such as at a store counter, a bank or a front desk, or while waiting for an interpreter, instead of writing notes or relying on family members to interpret. Because the spoken output can be in English, Turkish or Spanish, it also serves hearing staff and family members who speak these languages, which matters in multilingual communities such as those in New Jersey.</w:t>
-      </w:r>
-    </w:p>
-    <w:p>
-      <w:pPr>
-        <w:spacing w:after="120" w:line="360"/>
-        <w:ind w:firstLine="720"/>
-        <w:jc w:val="both"/>
-      </w:pPr>
-      <w:r>
-        <w:rPr>
-          <w:rFonts w:ascii="Times New Roman" w:cs="Times New Roman" w:eastAsia="Times New Roman" w:hAnsi="Times New Roman"/>
-          <w:sz w:val="24"/>
-          <w:szCs w:val="24"/>
-        </w:rPr>
-        <w:t xml:space="preserve">Businesses and public services benefit as well. Under the Americans with Disabilities Act (ADA), businesses and nonprofits that serve the public must communicate effectively with people who have communication disabilities [22]. The device does not replace an interpreter when one is required, but it can support short, routine exchanges for which an interpreter is rarely available at short notice. Because it runs offline, it can also be used in rural areas and in places without reliable internet access.</w:t>
-      </w:r>
-    </w:p>
-    <w:p>
-      <w:pPr>
-        <w:spacing w:after="120" w:line="360"/>
-        <w:ind w:firstLine="720"/>
-        <w:jc w:val="both"/>
-      </w:pPr>
-      <w:r>
-        <w:rPr>
-          <w:rFonts w:ascii="Times New Roman" w:cs="Times New Roman" w:eastAsia="Times New Roman" w:hAnsi="Times New Roman"/>
-          <w:sz w:val="24"/>
-          <w:szCs w:val="24"/>
-        </w:rPr>
-        <w:t xml:space="preserve">The design also has environmental benefits. Running on a low-power embedded module instead of cloud servers reduces energy use and avoids continuous video upload. Because the device is built from off-the-shelf, replaceable parts and open-source software, it can be repaired and upgraded rather than discarded.</w:t>
-      </w:r>
-    </w:p>
-    <w:p>
-      <w:pPr>
-        <w:pStyle w:val="IntroSubsection"/>
-        <w:keepNext/>
-        <w:spacing w:after="100" w:before="200"/>
-      </w:pPr>
-      <w:r>
-        <w:rPr>
-          <w:rFonts w:ascii="Times New Roman" w:cs="Times New Roman" w:eastAsia="Times New Roman" w:hAnsi="Times New Roman"/>
-          <w:b/>
-          <w:bCs/>
-          <w:sz w:val="24"/>
-          <w:szCs w:val="24"/>
-        </w:rPr>
-        <w:t xml:space="preserve">5.2 Ethical Issues</w:t>
-      </w:r>
-    </w:p>
-    <w:p>
-      <w:pPr>
-        <w:spacing w:after="120" w:line="360"/>
-        <w:ind w:firstLine="720"/>
-        <w:jc w:val="both"/>
-      </w:pPr>
-      <w:r>
-        <w:rPr>
-          <w:rFonts w:ascii="Times New Roman" w:cs="Times New Roman" w:eastAsia="Times New Roman" w:hAnsi="Times New Roman"/>
-          <w:sz w:val="24"/>
-          <w:szCs w:val="24"/>
-        </w:rPr>
-        <w:t xml:space="preserve">We follow the IEEE Code of Ethics, which asks engineers to hold paramount the safety, health and welfare of the public, to protect the privacy of others, to avoid harm, to treat all persons fairly, and to be honest and realistic in stating claims [23]. Table 4 summarizes the main ethical issues for this project and our response to each.</w:t>
-      </w:r>
     </w:p>
     <w:p>
       <w:pPr>
@@ -3986,6 +4243,896 @@
           <w:szCs w:val="20"/>
         </w:rPr>
         <w:t xml:space="preserve">Table 4. </w:t>
+      </w:r>
+      <w:r>
+        <w:rPr>
+          <w:rFonts w:ascii="Times New Roman" w:cs="Times New Roman" w:eastAsia="Times New Roman" w:hAnsi="Times New Roman"/>
+          <w:sz w:val="20"/>
+          <w:szCs w:val="20"/>
+        </w:rPr>
+        <w:t xml:space="preserve">Team responsibilities for the technical goals.</w:t>
+      </w:r>
+    </w:p>
+    <w:tbl>
+      <w:tblPr>
+        <w:tblW w:type="dxa" w:w="9360"/>
+        <w:tblBorders>
+          <w:top w:val="single" w:color="auto" w:sz="4"/>
+          <w:left w:val="single" w:color="auto" w:sz="4"/>
+          <w:bottom w:val="single" w:color="auto" w:sz="4"/>
+          <w:right w:val="single" w:color="auto" w:sz="4"/>
+          <w:insideH w:val="single" w:color="auto" w:sz="4"/>
+          <w:insideV w:val="single" w:color="auto" w:sz="4"/>
+        </w:tblBorders>
+      </w:tblPr>
+      <w:tblGrid>
+        <w:gridCol w:w="2000"/>
+        <w:gridCol w:w="1300"/>
+        <w:gridCol w:w="1300"/>
+        <w:gridCol w:w="4760"/>
+      </w:tblGrid>
+      <w:tr>
+        <w:trPr>
+          <w:cantSplit/>
+          <w:tblHeader/>
+        </w:trPr>
+        <w:tc>
+          <w:tcPr>
+            <w:tcW w:type="dxa" w:w="2000"/>
+            <w:tcBorders>
+              <w:top w:val="single" w:color="000000" w:sz="12"/>
+              <w:left w:val="none" w:color="FFFFFF" w:sz="0"/>
+              <w:bottom w:val="single" w:color="000000" w:sz="4"/>
+              <w:right w:val="none" w:color="FFFFFF" w:sz="0"/>
+            </w:tcBorders>
+            <w:tcMar>
+              <w:top w:type="dxa" w:w="80"/>
+              <w:left w:type="dxa" w:w="80"/>
+              <w:bottom w:type="dxa" w:w="80"/>
+              <w:right w:type="dxa" w:w="80"/>
+            </w:tcMar>
+          </w:tcPr>
+          <w:p>
+            <w:pPr>
+              <w:keepNext/>
+            </w:pPr>
+            <w:r>
+              <w:rPr>
+                <w:rFonts w:ascii="Times New Roman" w:cs="Times New Roman" w:eastAsia="Times New Roman" w:hAnsi="Times New Roman"/>
+                <w:b/>
+                <w:bCs/>
+                <w:i w:val="false"/>
+                <w:iCs w:val="false"/>
+                <w:sz w:val="20"/>
+                <w:szCs w:val="20"/>
+              </w:rPr>
+              <w:t xml:space="preserve">Area</w:t>
+            </w:r>
+          </w:p>
+        </w:tc>
+        <w:tc>
+          <w:tcPr>
+            <w:tcW w:type="dxa" w:w="1300"/>
+            <w:tcBorders>
+              <w:top w:val="single" w:color="000000" w:sz="12"/>
+              <w:left w:val="none" w:color="FFFFFF" w:sz="0"/>
+              <w:bottom w:val="single" w:color="000000" w:sz="4"/>
+              <w:right w:val="none" w:color="FFFFFF" w:sz="0"/>
+            </w:tcBorders>
+            <w:tcMar>
+              <w:top w:type="dxa" w:w="80"/>
+              <w:left w:type="dxa" w:w="80"/>
+              <w:bottom w:type="dxa" w:w="80"/>
+              <w:right w:type="dxa" w:w="80"/>
+            </w:tcMar>
+          </w:tcPr>
+          <w:p>
+            <w:pPr>
+              <w:keepNext/>
+            </w:pPr>
+            <w:r>
+              <w:rPr>
+                <w:rFonts w:ascii="Times New Roman" w:cs="Times New Roman" w:eastAsia="Times New Roman" w:hAnsi="Times New Roman"/>
+                <w:b/>
+                <w:bCs/>
+                <w:i w:val="false"/>
+                <w:iCs w:val="false"/>
+                <w:sz w:val="20"/>
+                <w:szCs w:val="20"/>
+              </w:rPr>
+              <w:t xml:space="preserve">Lead</w:t>
+            </w:r>
+          </w:p>
+        </w:tc>
+        <w:tc>
+          <w:tcPr>
+            <w:tcW w:type="dxa" w:w="1300"/>
+            <w:tcBorders>
+              <w:top w:val="single" w:color="000000" w:sz="12"/>
+              <w:left w:val="none" w:color="FFFFFF" w:sz="0"/>
+              <w:bottom w:val="single" w:color="000000" w:sz="4"/>
+              <w:right w:val="none" w:color="FFFFFF" w:sz="0"/>
+            </w:tcBorders>
+            <w:tcMar>
+              <w:top w:type="dxa" w:w="80"/>
+              <w:left w:type="dxa" w:w="80"/>
+              <w:bottom w:type="dxa" w:w="80"/>
+              <w:right w:type="dxa" w:w="80"/>
+            </w:tcMar>
+          </w:tcPr>
+          <w:p>
+            <w:pPr>
+              <w:keepNext/>
+            </w:pPr>
+            <w:r>
+              <w:rPr>
+                <w:rFonts w:ascii="Times New Roman" w:cs="Times New Roman" w:eastAsia="Times New Roman" w:hAnsi="Times New Roman"/>
+                <w:b/>
+                <w:bCs/>
+                <w:i w:val="false"/>
+                <w:iCs w:val="false"/>
+                <w:sz w:val="20"/>
+                <w:szCs w:val="20"/>
+              </w:rPr>
+              <w:t xml:space="preserve">Support</w:t>
+            </w:r>
+          </w:p>
+        </w:tc>
+        <w:tc>
+          <w:tcPr>
+            <w:tcW w:type="dxa" w:w="4760"/>
+            <w:tcBorders>
+              <w:top w:val="single" w:color="000000" w:sz="12"/>
+              <w:left w:val="none" w:color="FFFFFF" w:sz="0"/>
+              <w:bottom w:val="single" w:color="000000" w:sz="4"/>
+              <w:right w:val="none" w:color="FFFFFF" w:sz="0"/>
+            </w:tcBorders>
+            <w:tcMar>
+              <w:top w:type="dxa" w:w="80"/>
+              <w:left w:type="dxa" w:w="80"/>
+              <w:bottom w:type="dxa" w:w="80"/>
+              <w:right w:type="dxa" w:w="80"/>
+            </w:tcMar>
+          </w:tcPr>
+          <w:p>
+            <w:pPr>
+              <w:keepNext/>
+            </w:pPr>
+            <w:r>
+              <w:rPr>
+                <w:rFonts w:ascii="Times New Roman" w:cs="Times New Roman" w:eastAsia="Times New Roman" w:hAnsi="Times New Roman"/>
+                <w:b/>
+                <w:bCs/>
+                <w:i w:val="false"/>
+                <w:iCs w:val="false"/>
+                <w:sz w:val="20"/>
+                <w:szCs w:val="20"/>
+              </w:rPr>
+              <w:t xml:space="preserve">Main tasks</w:t>
+            </w:r>
+          </w:p>
+        </w:tc>
+      </w:tr>
+      <w:tr>
+        <w:trPr>
+          <w:cantSplit/>
+          <w:tblHeader w:val="false"/>
+        </w:trPr>
+        <w:tc>
+          <w:tcPr>
+            <w:tcW w:type="dxa" w:w="2000"/>
+            <w:tcBorders>
+              <w:top w:val="single" w:color="000000" w:sz="4"/>
+              <w:left w:val="none" w:color="FFFFFF" w:sz="0"/>
+              <w:bottom w:val="none" w:color="FFFFFF" w:sz="0"/>
+              <w:right w:val="none" w:color="FFFFFF" w:sz="0"/>
+            </w:tcBorders>
+            <w:tcMar>
+              <w:top w:type="dxa" w:w="50"/>
+              <w:left w:type="dxa" w:w="80"/>
+              <w:bottom w:type="dxa" w:w="50"/>
+              <w:right w:type="dxa" w:w="80"/>
+            </w:tcMar>
+          </w:tcPr>
+          <w:p>
+            <w:pPr>
+              <w:keepNext/>
+            </w:pPr>
+            <w:r>
+              <w:rPr>
+                <w:rFonts w:ascii="Times New Roman" w:cs="Times New Roman" w:eastAsia="Times New Roman" w:hAnsi="Times New Roman"/>
+                <w:b w:val="false"/>
+                <w:bCs w:val="false"/>
+                <w:i w:val="false"/>
+                <w:iCs w:val="false"/>
+                <w:sz w:val="20"/>
+                <w:szCs w:val="20"/>
+              </w:rPr>
+              <w:t xml:space="preserve">Goal 1: Sign recognition</w:t>
+            </w:r>
+          </w:p>
+        </w:tc>
+        <w:tc>
+          <w:tcPr>
+            <w:tcW w:type="dxa" w:w="1300"/>
+            <w:tcBorders>
+              <w:top w:val="single" w:color="000000" w:sz="4"/>
+              <w:left w:val="none" w:color="FFFFFF" w:sz="0"/>
+              <w:bottom w:val="none" w:color="FFFFFF" w:sz="0"/>
+              <w:right w:val="none" w:color="FFFFFF" w:sz="0"/>
+            </w:tcBorders>
+            <w:tcMar>
+              <w:top w:type="dxa" w:w="50"/>
+              <w:left w:type="dxa" w:w="80"/>
+              <w:bottom w:type="dxa" w:w="50"/>
+              <w:right w:type="dxa" w:w="80"/>
+            </w:tcMar>
+          </w:tcPr>
+          <w:p>
+            <w:pPr>
+              <w:keepNext/>
+            </w:pPr>
+            <w:r>
+              <w:rPr>
+                <w:rFonts w:ascii="Times New Roman" w:cs="Times New Roman" w:eastAsia="Times New Roman" w:hAnsi="Times New Roman"/>
+                <w:b w:val="false"/>
+                <w:bCs w:val="false"/>
+                <w:i w:val="false"/>
+                <w:iCs w:val="false"/>
+                <w:sz w:val="20"/>
+                <w:szCs w:val="20"/>
+              </w:rPr>
+              <w:t xml:space="preserve">To be assigned</w:t>
+            </w:r>
+          </w:p>
+        </w:tc>
+        <w:tc>
+          <w:tcPr>
+            <w:tcW w:type="dxa" w:w="1300"/>
+            <w:tcBorders>
+              <w:top w:val="single" w:color="000000" w:sz="4"/>
+              <w:left w:val="none" w:color="FFFFFF" w:sz="0"/>
+              <w:bottom w:val="none" w:color="FFFFFF" w:sz="0"/>
+              <w:right w:val="none" w:color="FFFFFF" w:sz="0"/>
+            </w:tcBorders>
+            <w:tcMar>
+              <w:top w:type="dxa" w:w="50"/>
+              <w:left w:type="dxa" w:w="80"/>
+              <w:bottom w:type="dxa" w:w="50"/>
+              <w:right w:type="dxa" w:w="80"/>
+            </w:tcMar>
+          </w:tcPr>
+          <w:p>
+            <w:pPr>
+              <w:keepNext/>
+            </w:pPr>
+            <w:r>
+              <w:rPr>
+                <w:rFonts w:ascii="Times New Roman" w:cs="Times New Roman" w:eastAsia="Times New Roman" w:hAnsi="Times New Roman"/>
+                <w:b w:val="false"/>
+                <w:bCs w:val="false"/>
+                <w:i w:val="false"/>
+                <w:iCs w:val="false"/>
+                <w:sz w:val="20"/>
+                <w:szCs w:val="20"/>
+              </w:rPr>
+              <w:t xml:space="preserve">To be assigned</w:t>
+            </w:r>
+          </w:p>
+        </w:tc>
+        <w:tc>
+          <w:tcPr>
+            <w:tcW w:type="dxa" w:w="4760"/>
+            <w:tcBorders>
+              <w:top w:val="single" w:color="000000" w:sz="4"/>
+              <w:left w:val="none" w:color="FFFFFF" w:sz="0"/>
+              <w:bottom w:val="none" w:color="FFFFFF" w:sz="0"/>
+              <w:right w:val="none" w:color="FFFFFF" w:sz="0"/>
+            </w:tcBorders>
+            <w:tcMar>
+              <w:top w:type="dxa" w:w="50"/>
+              <w:left w:type="dxa" w:w="80"/>
+              <w:bottom w:type="dxa" w:w="50"/>
+              <w:right w:type="dxa" w:w="80"/>
+            </w:tcMar>
+          </w:tcPr>
+          <w:p>
+            <w:pPr>
+              <w:keepNext/>
+            </w:pPr>
+            <w:r>
+              <w:rPr>
+                <w:rFonts w:ascii="Times New Roman" w:cs="Times New Roman" w:eastAsia="Times New Roman" w:hAnsi="Times New Roman"/>
+                <w:b w:val="false"/>
+                <w:bCs w:val="false"/>
+                <w:i w:val="false"/>
+                <w:iCs w:val="false"/>
+                <w:sz w:val="20"/>
+                <w:szCs w:val="20"/>
+              </w:rPr>
+              <w:t xml:space="preserve">Vocabulary selection with Deaf ASL users, landmark extraction, rest-pose segmentation, model training, confidence calibration, accuracy evaluation</w:t>
+            </w:r>
+          </w:p>
+        </w:tc>
+      </w:tr>
+      <w:tr>
+        <w:trPr>
+          <w:cantSplit/>
+          <w:tblHeader w:val="false"/>
+        </w:trPr>
+        <w:tc>
+          <w:tcPr>
+            <w:tcW w:type="dxa" w:w="2000"/>
+            <w:tcBorders>
+              <w:top w:val="none" w:color="FFFFFF" w:sz="0"/>
+              <w:left w:val="none" w:color="FFFFFF" w:sz="0"/>
+              <w:bottom w:val="none" w:color="FFFFFF" w:sz="0"/>
+              <w:right w:val="none" w:color="FFFFFF" w:sz="0"/>
+            </w:tcBorders>
+            <w:tcMar>
+              <w:top w:type="dxa" w:w="50"/>
+              <w:left w:type="dxa" w:w="80"/>
+              <w:bottom w:type="dxa" w:w="50"/>
+              <w:right w:type="dxa" w:w="80"/>
+            </w:tcMar>
+          </w:tcPr>
+          <w:p>
+            <w:pPr>
+              <w:keepNext/>
+            </w:pPr>
+            <w:r>
+              <w:rPr>
+                <w:rFonts w:ascii="Times New Roman" w:cs="Times New Roman" w:eastAsia="Times New Roman" w:hAnsi="Times New Roman"/>
+                <w:b w:val="false"/>
+                <w:bCs w:val="false"/>
+                <w:i w:val="false"/>
+                <w:iCs w:val="false"/>
+                <w:sz w:val="20"/>
+                <w:szCs w:val="20"/>
+              </w:rPr>
+              <w:t xml:space="preserve">Goal 2: Language and speech</w:t>
+            </w:r>
+          </w:p>
+        </w:tc>
+        <w:tc>
+          <w:tcPr>
+            <w:tcW w:type="dxa" w:w="1300"/>
+            <w:tcBorders>
+              <w:top w:val="none" w:color="FFFFFF" w:sz="0"/>
+              <w:left w:val="none" w:color="FFFFFF" w:sz="0"/>
+              <w:bottom w:val="none" w:color="FFFFFF" w:sz="0"/>
+              <w:right w:val="none" w:color="FFFFFF" w:sz="0"/>
+            </w:tcBorders>
+            <w:tcMar>
+              <w:top w:type="dxa" w:w="50"/>
+              <w:left w:type="dxa" w:w="80"/>
+              <w:bottom w:type="dxa" w:w="50"/>
+              <w:right w:type="dxa" w:w="80"/>
+            </w:tcMar>
+          </w:tcPr>
+          <w:p>
+            <w:pPr>
+              <w:keepNext/>
+            </w:pPr>
+            <w:r>
+              <w:rPr>
+                <w:rFonts w:ascii="Times New Roman" w:cs="Times New Roman" w:eastAsia="Times New Roman" w:hAnsi="Times New Roman"/>
+                <w:b w:val="false"/>
+                <w:bCs w:val="false"/>
+                <w:i w:val="false"/>
+                <w:iCs w:val="false"/>
+                <w:sz w:val="20"/>
+                <w:szCs w:val="20"/>
+              </w:rPr>
+              <w:t xml:space="preserve">To be assigned</w:t>
+            </w:r>
+          </w:p>
+        </w:tc>
+        <w:tc>
+          <w:tcPr>
+            <w:tcW w:type="dxa" w:w="1300"/>
+            <w:tcBorders>
+              <w:top w:val="none" w:color="FFFFFF" w:sz="0"/>
+              <w:left w:val="none" w:color="FFFFFF" w:sz="0"/>
+              <w:bottom w:val="none" w:color="FFFFFF" w:sz="0"/>
+              <w:right w:val="none" w:color="FFFFFF" w:sz="0"/>
+            </w:tcBorders>
+            <w:tcMar>
+              <w:top w:type="dxa" w:w="50"/>
+              <w:left w:type="dxa" w:w="80"/>
+              <w:bottom w:type="dxa" w:w="50"/>
+              <w:right w:type="dxa" w:w="80"/>
+            </w:tcMar>
+          </w:tcPr>
+          <w:p>
+            <w:pPr>
+              <w:keepNext/>
+            </w:pPr>
+            <w:r>
+              <w:rPr>
+                <w:rFonts w:ascii="Times New Roman" w:cs="Times New Roman" w:eastAsia="Times New Roman" w:hAnsi="Times New Roman"/>
+                <w:b w:val="false"/>
+                <w:bCs w:val="false"/>
+                <w:i w:val="false"/>
+                <w:iCs w:val="false"/>
+                <w:sz w:val="20"/>
+                <w:szCs w:val="20"/>
+              </w:rPr>
+              <w:t xml:space="preserve">To be assigned</w:t>
+            </w:r>
+          </w:p>
+        </w:tc>
+        <w:tc>
+          <w:tcPr>
+            <w:tcW w:type="dxa" w:w="4760"/>
+            <w:tcBorders>
+              <w:top w:val="none" w:color="FFFFFF" w:sz="0"/>
+              <w:left w:val="none" w:color="FFFFFF" w:sz="0"/>
+              <w:bottom w:val="none" w:color="FFFFFF" w:sz="0"/>
+              <w:right w:val="none" w:color="FFFFFF" w:sz="0"/>
+            </w:tcBorders>
+            <w:tcMar>
+              <w:top w:type="dxa" w:w="50"/>
+              <w:left w:type="dxa" w:w="80"/>
+              <w:bottom w:type="dxa" w:w="50"/>
+              <w:right w:type="dxa" w:w="80"/>
+            </w:tcMar>
+          </w:tcPr>
+          <w:p>
+            <w:pPr>
+              <w:keepNext/>
+            </w:pPr>
+            <w:r>
+              <w:rPr>
+                <w:rFonts w:ascii="Times New Roman" w:cs="Times New Roman" w:eastAsia="Times New Roman" w:hAnsi="Times New Roman"/>
+                <w:b w:val="false"/>
+                <w:bCs w:val="false"/>
+                <w:i w:val="false"/>
+                <w:iCs w:val="false"/>
+                <w:sz w:val="20"/>
+                <w:szCs w:val="20"/>
+              </w:rPr>
+              <w:t xml:space="preserve">Sentence builder, touchscreen interface, translation, text-to-speech, speech recognition, latency measurement</w:t>
+            </w:r>
+          </w:p>
+        </w:tc>
+      </w:tr>
+      <w:tr>
+        <w:trPr>
+          <w:cantSplit/>
+          <w:tblHeader w:val="false"/>
+        </w:trPr>
+        <w:tc>
+          <w:tcPr>
+            <w:tcW w:type="dxa" w:w="2000"/>
+            <w:tcBorders>
+              <w:top w:val="none" w:color="FFFFFF" w:sz="0"/>
+              <w:left w:val="none" w:color="FFFFFF" w:sz="0"/>
+              <w:bottom w:val="none" w:color="FFFFFF" w:sz="0"/>
+              <w:right w:val="none" w:color="FFFFFF" w:sz="0"/>
+            </w:tcBorders>
+            <w:tcMar>
+              <w:top w:type="dxa" w:w="50"/>
+              <w:left w:type="dxa" w:w="80"/>
+              <w:bottom w:type="dxa" w:w="50"/>
+              <w:right w:type="dxa" w:w="80"/>
+            </w:tcMar>
+          </w:tcPr>
+          <w:p>
+            <w:pPr>
+              <w:keepNext/>
+            </w:pPr>
+            <w:r>
+              <w:rPr>
+                <w:rFonts w:ascii="Times New Roman" w:cs="Times New Roman" w:eastAsia="Times New Roman" w:hAnsi="Times New Roman"/>
+                <w:b w:val="false"/>
+                <w:bCs w:val="false"/>
+                <w:i w:val="false"/>
+                <w:iCs w:val="false"/>
+                <w:sz w:val="20"/>
+                <w:szCs w:val="20"/>
+              </w:rPr>
+              <w:t xml:space="preserve">Goal 3: Embedded integration</w:t>
+            </w:r>
+          </w:p>
+        </w:tc>
+        <w:tc>
+          <w:tcPr>
+            <w:tcW w:type="dxa" w:w="1300"/>
+            <w:tcBorders>
+              <w:top w:val="none" w:color="FFFFFF" w:sz="0"/>
+              <w:left w:val="none" w:color="FFFFFF" w:sz="0"/>
+              <w:bottom w:val="none" w:color="FFFFFF" w:sz="0"/>
+              <w:right w:val="none" w:color="FFFFFF" w:sz="0"/>
+            </w:tcBorders>
+            <w:tcMar>
+              <w:top w:type="dxa" w:w="50"/>
+              <w:left w:type="dxa" w:w="80"/>
+              <w:bottom w:type="dxa" w:w="50"/>
+              <w:right w:type="dxa" w:w="80"/>
+            </w:tcMar>
+          </w:tcPr>
+          <w:p>
+            <w:pPr>
+              <w:keepNext/>
+            </w:pPr>
+            <w:r>
+              <w:rPr>
+                <w:rFonts w:ascii="Times New Roman" w:cs="Times New Roman" w:eastAsia="Times New Roman" w:hAnsi="Times New Roman"/>
+                <w:b w:val="false"/>
+                <w:bCs w:val="false"/>
+                <w:i w:val="false"/>
+                <w:iCs w:val="false"/>
+                <w:sz w:val="20"/>
+                <w:szCs w:val="20"/>
+              </w:rPr>
+              <w:t xml:space="preserve">To be assigned</w:t>
+            </w:r>
+          </w:p>
+        </w:tc>
+        <w:tc>
+          <w:tcPr>
+            <w:tcW w:type="dxa" w:w="1300"/>
+            <w:tcBorders>
+              <w:top w:val="none" w:color="FFFFFF" w:sz="0"/>
+              <w:left w:val="none" w:color="FFFFFF" w:sz="0"/>
+              <w:bottom w:val="none" w:color="FFFFFF" w:sz="0"/>
+              <w:right w:val="none" w:color="FFFFFF" w:sz="0"/>
+            </w:tcBorders>
+            <w:tcMar>
+              <w:top w:type="dxa" w:w="50"/>
+              <w:left w:type="dxa" w:w="80"/>
+              <w:bottom w:type="dxa" w:w="50"/>
+              <w:right w:type="dxa" w:w="80"/>
+            </w:tcMar>
+          </w:tcPr>
+          <w:p>
+            <w:pPr>
+              <w:keepNext/>
+            </w:pPr>
+            <w:r>
+              <w:rPr>
+                <w:rFonts w:ascii="Times New Roman" w:cs="Times New Roman" w:eastAsia="Times New Roman" w:hAnsi="Times New Roman"/>
+                <w:b w:val="false"/>
+                <w:bCs w:val="false"/>
+                <w:i w:val="false"/>
+                <w:iCs w:val="false"/>
+                <w:sz w:val="20"/>
+                <w:szCs w:val="20"/>
+              </w:rPr>
+              <w:t xml:space="preserve">To be assigned</w:t>
+            </w:r>
+          </w:p>
+        </w:tc>
+        <w:tc>
+          <w:tcPr>
+            <w:tcW w:type="dxa" w:w="4760"/>
+            <w:tcBorders>
+              <w:top w:val="none" w:color="FFFFFF" w:sz="0"/>
+              <w:left w:val="none" w:color="FFFFFF" w:sz="0"/>
+              <w:bottom w:val="none" w:color="FFFFFF" w:sz="0"/>
+              <w:right w:val="none" w:color="FFFFFF" w:sz="0"/>
+            </w:tcBorders>
+            <w:tcMar>
+              <w:top w:type="dxa" w:w="50"/>
+              <w:left w:type="dxa" w:w="80"/>
+              <w:bottom w:type="dxa" w:w="50"/>
+              <w:right w:type="dxa" w:w="80"/>
+            </w:tcMar>
+          </w:tcPr>
+          <w:p>
+            <w:pPr>
+              <w:keepNext/>
+            </w:pPr>
+            <w:r>
+              <w:rPr>
+                <w:rFonts w:ascii="Times New Roman" w:cs="Times New Roman" w:eastAsia="Times New Roman" w:hAnsi="Times New Roman"/>
+                <w:b w:val="false"/>
+                <w:bCs w:val="false"/>
+                <w:i w:val="false"/>
+                <w:iCs w:val="false"/>
+                <w:sz w:val="20"/>
+                <w:szCs w:val="20"/>
+              </w:rPr>
+              <w:t xml:space="preserve">Hardware purchase and setup, enclosure, deployment and optimization on the Jetson Orin Nano, frame-rate and power measurement</w:t>
+            </w:r>
+          </w:p>
+        </w:tc>
+      </w:tr>
+      <w:tr>
+        <w:trPr>
+          <w:cantSplit/>
+          <w:tblHeader w:val="false"/>
+        </w:trPr>
+        <w:tc>
+          <w:tcPr>
+            <w:tcW w:type="dxa" w:w="2000"/>
+            <w:tcBorders>
+              <w:top w:val="none" w:color="FFFFFF" w:sz="0"/>
+              <w:left w:val="none" w:color="FFFFFF" w:sz="0"/>
+              <w:bottom w:val="single" w:color="000000" w:sz="12"/>
+              <w:right w:val="none" w:color="FFFFFF" w:sz="0"/>
+            </w:tcBorders>
+            <w:tcMar>
+              <w:top w:type="dxa" w:w="50"/>
+              <w:left w:type="dxa" w:w="80"/>
+              <w:bottom w:type="dxa" w:w="50"/>
+              <w:right w:type="dxa" w:w="80"/>
+            </w:tcMar>
+          </w:tcPr>
+          <w:p>
+            <w:pPr>
+              <w:keepNext w:val="false"/>
+            </w:pPr>
+            <w:r>
+              <w:rPr>
+                <w:rFonts w:ascii="Times New Roman" w:cs="Times New Roman" w:eastAsia="Times New Roman" w:hAnsi="Times New Roman"/>
+                <w:b w:val="false"/>
+                <w:bCs w:val="false"/>
+                <w:i w:val="false"/>
+                <w:iCs w:val="false"/>
+                <w:sz w:val="20"/>
+                <w:szCs w:val="20"/>
+              </w:rPr>
+              <w:t xml:space="preserve">Project-wide</w:t>
+            </w:r>
+          </w:p>
+        </w:tc>
+        <w:tc>
+          <w:tcPr>
+            <w:tcW w:type="dxa" w:w="1300"/>
+            <w:tcBorders>
+              <w:top w:val="none" w:color="FFFFFF" w:sz="0"/>
+              <w:left w:val="none" w:color="FFFFFF" w:sz="0"/>
+              <w:bottom w:val="single" w:color="000000" w:sz="12"/>
+              <w:right w:val="none" w:color="FFFFFF" w:sz="0"/>
+            </w:tcBorders>
+            <w:tcMar>
+              <w:top w:type="dxa" w:w="50"/>
+              <w:left w:type="dxa" w:w="80"/>
+              <w:bottom w:type="dxa" w:w="50"/>
+              <w:right w:type="dxa" w:w="80"/>
+            </w:tcMar>
+          </w:tcPr>
+          <w:p>
+            <w:pPr>
+              <w:keepNext w:val="false"/>
+            </w:pPr>
+            <w:r>
+              <w:rPr>
+                <w:rFonts w:ascii="Times New Roman" w:cs="Times New Roman" w:eastAsia="Times New Roman" w:hAnsi="Times New Roman"/>
+                <w:b w:val="false"/>
+                <w:bCs w:val="false"/>
+                <w:i w:val="false"/>
+                <w:iCs w:val="false"/>
+                <w:sz w:val="20"/>
+                <w:szCs w:val="20"/>
+              </w:rPr>
+              <w:t xml:space="preserve">To be assigned</w:t>
+            </w:r>
+          </w:p>
+        </w:tc>
+        <w:tc>
+          <w:tcPr>
+            <w:tcW w:type="dxa" w:w="1300"/>
+            <w:tcBorders>
+              <w:top w:val="none" w:color="FFFFFF" w:sz="0"/>
+              <w:left w:val="none" w:color="FFFFFF" w:sz="0"/>
+              <w:bottom w:val="single" w:color="000000" w:sz="12"/>
+              <w:right w:val="none" w:color="FFFFFF" w:sz="0"/>
+            </w:tcBorders>
+            <w:tcMar>
+              <w:top w:type="dxa" w:w="50"/>
+              <w:left w:type="dxa" w:w="80"/>
+              <w:bottom w:type="dxa" w:w="50"/>
+              <w:right w:type="dxa" w:w="80"/>
+            </w:tcMar>
+          </w:tcPr>
+          <w:p>
+            <w:pPr>
+              <w:keepNext w:val="false"/>
+            </w:pPr>
+            <w:r>
+              <w:rPr>
+                <w:rFonts w:ascii="Times New Roman" w:cs="Times New Roman" w:eastAsia="Times New Roman" w:hAnsi="Times New Roman"/>
+                <w:b w:val="false"/>
+                <w:bCs w:val="false"/>
+                <w:i w:val="false"/>
+                <w:iCs w:val="false"/>
+                <w:sz w:val="20"/>
+                <w:szCs w:val="20"/>
+              </w:rPr>
+              <w:t xml:space="preserve">To be assigned</w:t>
+            </w:r>
+          </w:p>
+        </w:tc>
+        <w:tc>
+          <w:tcPr>
+            <w:tcW w:type="dxa" w:w="4760"/>
+            <w:tcBorders>
+              <w:top w:val="none" w:color="FFFFFF" w:sz="0"/>
+              <w:left w:val="none" w:color="FFFFFF" w:sz="0"/>
+              <w:bottom w:val="single" w:color="000000" w:sz="12"/>
+              <w:right w:val="none" w:color="FFFFFF" w:sz="0"/>
+            </w:tcBorders>
+            <w:tcMar>
+              <w:top w:type="dxa" w:w="50"/>
+              <w:left w:type="dxa" w:w="80"/>
+              <w:bottom w:type="dxa" w:w="50"/>
+              <w:right w:type="dxa" w:w="80"/>
+            </w:tcMar>
+          </w:tcPr>
+          <w:p>
+            <w:pPr>
+              <w:keepNext w:val="false"/>
+            </w:pPr>
+            <w:r>
+              <w:rPr>
+                <w:rFonts w:ascii="Times New Roman" w:cs="Times New Roman" w:eastAsia="Times New Roman" w:hAnsi="Times New Roman"/>
+                <w:b w:val="false"/>
+                <w:bCs w:val="false"/>
+                <w:i w:val="false"/>
+                <w:iCs w:val="false"/>
+                <w:sz w:val="20"/>
+                <w:szCs w:val="20"/>
+              </w:rPr>
+              <w:t xml:space="preserve">Schedule and milestones, reports and presentations, user testing with Deaf ASL users, documentation</w:t>
+            </w:r>
+          </w:p>
+        </w:tc>
+      </w:tr>
+    </w:tbl>
+    <w:p>
+      <w:pPr>
+        <w:spacing w:after="240"/>
+      </w:pPr>
+    </w:p>
+    <w:p>
+      <w:r>
+        <w:br w:type="page"/>
+      </w:r>
+    </w:p>
+    <w:p>
+      <w:pPr>
+        <w:pStyle w:val="IntroSection"/>
+        <w:keepNext/>
+        <w:spacing w:after="120" w:before="0"/>
+      </w:pPr>
+      <w:r>
+        <w:rPr>
+          <w:rFonts w:ascii="Times New Roman" w:cs="Times New Roman" w:eastAsia="Times New Roman" w:hAnsi="Times New Roman"/>
+          <w:b/>
+          <w:bCs/>
+          <w:sz w:val="24"/>
+          <w:szCs w:val="24"/>
+        </w:rPr>
+        <w:t xml:space="preserve">5. Projected Community Impact and Relevant Ethical Issues</w:t>
+      </w:r>
+    </w:p>
+    <w:p>
+      <w:pPr>
+        <w:pStyle w:val="IntroSubsection"/>
+        <w:keepNext/>
+        <w:spacing w:after="100" w:before="200"/>
+      </w:pPr>
+      <w:r>
+        <w:rPr>
+          <w:rFonts w:ascii="Times New Roman" w:cs="Times New Roman" w:eastAsia="Times New Roman" w:hAnsi="Times New Roman"/>
+          <w:b/>
+          <w:bCs/>
+          <w:sz w:val="24"/>
+          <w:szCs w:val="24"/>
+        </w:rPr>
+        <w:t xml:space="preserve">5.1 Community Impact</w:t>
+      </w:r>
+    </w:p>
+    <w:p>
+      <w:pPr>
+        <w:spacing w:after="120" w:line="360"/>
+        <w:ind w:firstLine="720"/>
+        <w:jc w:val="both"/>
+      </w:pPr>
+      <w:r>
+        <w:rPr>
+          <w:rFonts w:ascii="Times New Roman" w:cs="Times New Roman" w:eastAsia="Times New Roman" w:hAnsi="Times New Roman"/>
+          <w:sz w:val="24"/>
+          <w:szCs w:val="24"/>
+        </w:rPr>
+        <w:t xml:space="preserve">The main beneficiaries of this project are Deaf ASL users, a group whose need for interpreters often goes unmet [1]. In everyday situations such as buying something at a store, asking a question at a bank or checking in at a front desk, a Deaf person today often has to write notes, rely on a family member to interpret, or simply leave without the information they needed. The device lets them communicate in their own language and on their own, with the hearing person hearing a spoken sentence instead of reading a note. Because the user confirms every sentence before it is spoken, they stay in control of what is said on their behalf.</w:t>
+      </w:r>
+    </w:p>
+    <w:p>
+      <w:pPr>
+        <w:spacing w:after="120" w:line="360"/>
+        <w:ind w:firstLine="720"/>
+        <w:jc w:val="both"/>
+      </w:pPr>
+      <w:r>
+        <w:rPr>
+          <w:rFonts w:ascii="Times New Roman" w:cs="Times New Roman" w:eastAsia="Times New Roman" w:hAnsi="Times New Roman"/>
+          <w:sz w:val="24"/>
+          <w:szCs w:val="24"/>
+        </w:rPr>
+        <w:t xml:space="preserve">The device also serves multilingual communities. Because the spoken output can be in English, Turkish or Spanish, a Deaf customer can communicate directly with staff or family members who are more comfortable in Turkish or Spanish than in English. This matters in diverse regions such as New Jersey, where many families and workers speak a language other than English at home.</w:t>
+      </w:r>
+    </w:p>
+    <w:p>
+      <w:pPr>
+        <w:spacing w:after="120" w:line="360"/>
+        <w:ind w:firstLine="720"/>
+        <w:jc w:val="both"/>
+      </w:pPr>
+      <w:r>
+        <w:rPr>
+          <w:rFonts w:ascii="Times New Roman" w:cs="Times New Roman" w:eastAsia="Times New Roman" w:hAnsi="Times New Roman"/>
+          <w:sz w:val="24"/>
+          <w:szCs w:val="24"/>
+        </w:rPr>
+        <w:t xml:space="preserve">Businesses and public services benefit as well. Under the Americans with Disabilities Act (ADA), businesses and nonprofits that serve the public must communicate effectively with people who have communication disabilities [22]. For long or complex conversations, a qualified interpreter remains the right solution, and the device does not replace one. For short, routine exchanges for which an interpreter is rarely available at short notice, the device gives staff a practical way to communicate. Because it runs offline, it can also be used in rural areas and in buildings without reliable internet access.</w:t>
+      </w:r>
+    </w:p>
+    <w:p>
+      <w:pPr>
+        <w:spacing w:after="120" w:line="360"/>
+        <w:ind w:firstLine="720"/>
+        <w:jc w:val="both"/>
+      </w:pPr>
+      <w:r>
+        <w:rPr>
+          <w:rFonts w:ascii="Times New Roman" w:cs="Times New Roman" w:eastAsia="Times New Roman" w:hAnsi="Times New Roman"/>
+          <w:sz w:val="24"/>
+          <w:szCs w:val="24"/>
+        </w:rPr>
+        <w:t xml:space="preserve">The design also has environmental benefits. Running on a low-power embedded module instead of cloud servers reduces energy use and avoids the continuous upload of video. Because the device is built from off-the-shelf, replaceable parts and open-source software, it can be repaired and upgraded rather than discarded, and its software can be moved to newer hardware at the end of the module's life.</w:t>
+      </w:r>
+    </w:p>
+    <w:p>
+      <w:pPr>
+        <w:pStyle w:val="IntroSubsection"/>
+        <w:keepNext/>
+        <w:spacing w:after="100" w:before="200"/>
+      </w:pPr>
+      <w:r>
+        <w:rPr>
+          <w:rFonts w:ascii="Times New Roman" w:cs="Times New Roman" w:eastAsia="Times New Roman" w:hAnsi="Times New Roman"/>
+          <w:b/>
+          <w:bCs/>
+          <w:sz w:val="24"/>
+          <w:szCs w:val="24"/>
+        </w:rPr>
+        <w:t xml:space="preserve">5.2 Ethical Issues</w:t>
+      </w:r>
+    </w:p>
+    <w:p>
+      <w:pPr>
+        <w:spacing w:after="120" w:line="360"/>
+        <w:ind w:firstLine="720"/>
+        <w:jc w:val="both"/>
+      </w:pPr>
+      <w:r>
+        <w:rPr>
+          <w:rFonts w:ascii="Times New Roman" w:cs="Times New Roman" w:eastAsia="Times New Roman" w:hAnsi="Times New Roman"/>
+          <w:sz w:val="24"/>
+          <w:szCs w:val="24"/>
+        </w:rPr>
+        <w:t xml:space="preserve">We follow the IEEE Code of Ethics, which asks engineers to hold paramount the safety, health and welfare of the public, to protect the privacy of others, to avoid harm, to treat all persons fairly, and to be honest and realistic in stating claims [23]. Table 5 summarizes the main ethical issues for this project and our response to each. The most important of these are discussed below.</w:t>
+      </w:r>
+    </w:p>
+    <w:p>
+      <w:pPr>
+        <w:keepNext/>
+        <w:spacing w:after="120" w:before="240"/>
+        <w:jc w:val="center"/>
+      </w:pPr>
+      <w:r>
+        <w:rPr>
+          <w:rFonts w:ascii="Times New Roman" w:cs="Times New Roman" w:eastAsia="Times New Roman" w:hAnsi="Times New Roman"/>
+          <w:b/>
+          <w:bCs/>
+          <w:sz w:val="20"/>
+          <w:szCs w:val="20"/>
+        </w:rPr>
+        <w:t xml:space="preserve">Table 5. </w:t>
       </w:r>
       <w:r>
         <w:rPr>
@@ -5003,7 +6150,52 @@
           <w:sz w:val="24"/>
           <w:szCs w:val="24"/>
         </w:rPr>
-        <w:t xml:space="preserve">Deaf involvement is the most important of these issues. Our team is hearing, and both surveys cited in Section 3 show that Deaf communities are most concerned about sign language technology built without them [1], [16]. We will therefore contact the ASL community at NJIT before choosing the vocabulary, invite Deaf signers to test the prototype, and adjust the design based on their feedback. Any testing with people will follow NJIT's requirements for research involving human participants.</w:t>
+        <w:t xml:space="preserve">The first issue is the risk of replacing interpreters. In the U.S. survey, 88% of Deaf participants were concerned that automatic translation could weaken the legal right to an interpreter [1]. A device like ours could be misused by an organization as a cheaper substitute in situations where a qualified interpreter is required. We will therefore describe and label the device as an aid for situations where no interpreter is available, and state this both in its documentation and on its start screen.</w:t>
+      </w:r>
+    </w:p>
+    <w:p>
+      <w:pPr>
+        <w:spacing w:after="120" w:line="360"/>
+        <w:ind w:firstLine="720"/>
+        <w:jc w:val="both"/>
+      </w:pPr>
+      <w:r>
+        <w:rPr>
+          <w:rFonts w:ascii="Times New Roman" w:cs="Times New Roman" w:eastAsia="Times New Roman" w:hAnsi="Times New Roman"/>
+          <w:sz w:val="24"/>
+          <w:szCs w:val="24"/>
+        </w:rPr>
+        <w:t xml:space="preserve">The second issue is harm from wrong translations. A misrecognized sign can change the meaning of a sentence, and in medical, legal or financial situations the consequences can be serious. Our design addresses this in two ways: the device abstains and shows candidate signs when it is unsure, and nothing is spoken until the user has read and confirmed the English sentence. High-stakes settings remain outside the intended use of the prototype.</w:t>
+      </w:r>
+    </w:p>
+    <w:p>
+      <w:pPr>
+        <w:spacing w:after="120" w:line="360"/>
+        <w:ind w:firstLine="720"/>
+        <w:jc w:val="both"/>
+      </w:pPr>
+      <w:r>
+        <w:rPr>
+          <w:rFonts w:ascii="Times New Roman" w:cs="Times New Roman" w:eastAsia="Times New Roman" w:hAnsi="Times New Roman"/>
+          <w:sz w:val="24"/>
+          <w:szCs w:val="24"/>
+        </w:rPr>
+        <w:t xml:space="preserve">The third issue is fairness. Sign recognition systems can work less well for some people, for example because of differences in signing style, handedness, skin tone or lighting. We will test with signers who differ in these respects, report accuracy for each signer rather than only an average, and publish any limits we find. Privacy and consent are closely related: the camera captures users' faces and bodies, so all processing stays on the device and no video or audio is stored or transmitted. We use consent-based training data such as ASL Citizen [2], and any recordings we make ourselves will be collected with written consent.</w:t>
+      </w:r>
+    </w:p>
+    <w:p>
+      <w:pPr>
+        <w:spacing w:after="120" w:line="360"/>
+        <w:ind w:firstLine="720"/>
+        <w:jc w:val="both"/>
+      </w:pPr>
+      <w:r>
+        <w:rPr>
+          <w:rFonts w:ascii="Times New Roman" w:cs="Times New Roman" w:eastAsia="Times New Roman" w:hAnsi="Times New Roman"/>
+          <w:sz w:val="24"/>
+          <w:szCs w:val="24"/>
+        </w:rPr>
+        <w:t xml:space="preserve">Finally, Deaf involvement is the issue that Deaf communities themselves rank highest. Our team is hearing, and both surveys cited in Section 3 show that the strongest concerns are hearing people profiting from ASL and sign language technology being built without Deaf input [1], [16]. We will therefore contact the ASL community at NJIT before choosing the vocabulary, invite Deaf signers to test the prototype, credit their contributions, and adjust the design based on their feedback. Any testing with people will follow NJIT's requirements for research involving human participants.</w:t>
       </w:r>
     </w:p>
     <w:p>

</xml_diff>

<commit_message>
Close the gap before Table 5
Table 5 could not break across pages, so it jumped to the next page and left
a gap after the start of Section 5.2. Long tables (Tables 3 and 5) may now
break between rows, with the header kept with the first row and repeated,
and Table 5 moves after the discussion paragraphs it summarizes.

Co-Authored-By: Claude Opus 5.5 <noreply@anthropic.com>
Claude-Session: https://claude.ai/code/session_01Ghe1P8BgNsyGdHuD4xCbdv
</commit_message>
<xml_diff>
--- a/docs/ECE_414_Proposal_Draft.docx
+++ b/docs/ECE_414_Proposal_Draft.docx
@@ -3903,7 +3903,7 @@
           </w:tcPr>
           <w:p>
             <w:pPr>
-              <w:keepNext/>
+              <w:keepNext w:val="false"/>
             </w:pPr>
             <w:r>
               <w:rPr>
@@ -3932,7 +3932,7 @@
           </w:tcPr>
           <w:p>
             <w:pPr>
-              <w:keepNext/>
+              <w:keepNext w:val="false"/>
             </w:pPr>
             <w:r>
               <w:rPr>
@@ -3961,7 +3961,7 @@
           </w:tcPr>
           <w:p>
             <w:pPr>
-              <w:keepNext/>
+              <w:keepNext w:val="false"/>
             </w:pPr>
             <w:r>
               <w:rPr>
@@ -3996,7 +3996,7 @@
           </w:tcPr>
           <w:p>
             <w:pPr>
-              <w:keepNext/>
+              <w:keepNext w:val="false"/>
             </w:pPr>
             <w:r>
               <w:rPr>
@@ -4025,7 +4025,7 @@
           </w:tcPr>
           <w:p>
             <w:pPr>
-              <w:keepNext/>
+              <w:keepNext w:val="false"/>
             </w:pPr>
             <w:r>
               <w:rPr>
@@ -4054,7 +4054,7 @@
           </w:tcPr>
           <w:p>
             <w:pPr>
-              <w:keepNext/>
+              <w:keepNext w:val="false"/>
             </w:pPr>
             <w:r>
               <w:rPr>
@@ -4089,7 +4089,7 @@
           </w:tcPr>
           <w:p>
             <w:pPr>
-              <w:keepNext/>
+              <w:keepNext w:val="false"/>
             </w:pPr>
             <w:r>
               <w:rPr>
@@ -4118,7 +4118,7 @@
           </w:tcPr>
           <w:p>
             <w:pPr>
-              <w:keepNext/>
+              <w:keepNext w:val="false"/>
             </w:pPr>
             <w:r>
               <w:rPr>
@@ -4147,7 +4147,7 @@
           </w:tcPr>
           <w:p>
             <w:pPr>
-              <w:keepNext/>
+              <w:keepNext w:val="false"/>
             </w:pPr>
             <w:r>
               <w:rPr>
@@ -4182,7 +4182,7 @@
           </w:tcPr>
           <w:p>
             <w:pPr>
-              <w:keepNext/>
+              <w:keepNext w:val="false"/>
             </w:pPr>
             <w:r>
               <w:rPr>
@@ -4211,7 +4211,7 @@
           </w:tcPr>
           <w:p>
             <w:pPr>
-              <w:keepNext/>
+              <w:keepNext w:val="false"/>
             </w:pPr>
             <w:r>
               <w:rPr>
@@ -4240,7 +4240,7 @@
           </w:tcPr>
           <w:p>
             <w:pPr>
-              <w:keepNext/>
+              <w:keepNext w:val="false"/>
             </w:pPr>
             <w:r>
               <w:rPr>
@@ -4275,7 +4275,7 @@
           </w:tcPr>
           <w:p>
             <w:pPr>
-              <w:keepNext/>
+              <w:keepNext w:val="false"/>
             </w:pPr>
             <w:r>
               <w:rPr>
@@ -4304,7 +4304,7 @@
           </w:tcPr>
           <w:p>
             <w:pPr>
-              <w:keepNext/>
+              <w:keepNext w:val="false"/>
             </w:pPr>
             <w:r>
               <w:rPr>
@@ -4333,7 +4333,7 @@
           </w:tcPr>
           <w:p>
             <w:pPr>
-              <w:keepNext/>
+              <w:keepNext w:val="false"/>
             </w:pPr>
             <w:r>
               <w:rPr>
@@ -4368,7 +4368,7 @@
           </w:tcPr>
           <w:p>
             <w:pPr>
-              <w:keepNext/>
+              <w:keepNext w:val="false"/>
             </w:pPr>
             <w:r>
               <w:rPr>
@@ -4397,7 +4397,7 @@
           </w:tcPr>
           <w:p>
             <w:pPr>
-              <w:keepNext/>
+              <w:keepNext w:val="false"/>
             </w:pPr>
             <w:r>
               <w:rPr>
@@ -4426,7 +4426,7 @@
           </w:tcPr>
           <w:p>
             <w:pPr>
-              <w:keepNext/>
+              <w:keepNext w:val="false"/>
             </w:pPr>
             <w:r>
               <w:rPr>
@@ -4461,7 +4461,7 @@
           </w:tcPr>
           <w:p>
             <w:pPr>
-              <w:keepNext/>
+              <w:keepNext w:val="false"/>
             </w:pPr>
             <w:r>
               <w:rPr>
@@ -4490,7 +4490,7 @@
           </w:tcPr>
           <w:p>
             <w:pPr>
-              <w:keepNext/>
+              <w:keepNext w:val="false"/>
             </w:pPr>
             <w:r>
               <w:rPr>
@@ -4519,7 +4519,7 @@
           </w:tcPr>
           <w:p>
             <w:pPr>
-              <w:keepNext/>
+              <w:keepNext w:val="false"/>
             </w:pPr>
             <w:r>
               <w:rPr>
@@ -5409,7 +5409,67 @@
           <w:sz w:val="24"/>
           <w:szCs w:val="24"/>
         </w:rPr>
-        <w:t xml:space="preserve">We follow the IEEE Code of Ethics, which asks engineers to hold paramount the safety, health and welfare of the public, to protect the privacy of others, to avoid harm, to treat all persons fairly, and to be honest and realistic in stating claims [23]. Table 5 summarizes the main ethical issues for this project and our response to each. The most important of these are discussed below.</w:t>
+        <w:t xml:space="preserve">We follow the IEEE Code of Ethics, which asks engineers to hold paramount the safety, health and welfare of the public, to protect the privacy of others, to avoid harm, to treat all persons fairly, and to be honest and realistic in stating claims [23]. The most important ethical issues for this project are discussed below, and Table 5 summarizes all of them together with our response to each.</w:t>
+      </w:r>
+    </w:p>
+    <w:p>
+      <w:pPr>
+        <w:spacing w:after="120" w:line="360"/>
+        <w:ind w:firstLine="720"/>
+        <w:jc w:val="both"/>
+      </w:pPr>
+      <w:r>
+        <w:rPr>
+          <w:rFonts w:ascii="Times New Roman" w:cs="Times New Roman" w:eastAsia="Times New Roman" w:hAnsi="Times New Roman"/>
+          <w:sz w:val="24"/>
+          <w:szCs w:val="24"/>
+        </w:rPr>
+        <w:t xml:space="preserve">The first issue is the risk of replacing interpreters. In the U.S. survey, 88% of Deaf participants were concerned that automatic translation could weaken the legal right to an interpreter [1]. A device like ours could be misused by an organization as a cheaper substitute in situations where a qualified interpreter is required. We will therefore describe and label the device as an aid for situations where no interpreter is available, and state this both in its documentation and on its start screen.</w:t>
+      </w:r>
+    </w:p>
+    <w:p>
+      <w:pPr>
+        <w:spacing w:after="120" w:line="360"/>
+        <w:ind w:firstLine="720"/>
+        <w:jc w:val="both"/>
+      </w:pPr>
+      <w:r>
+        <w:rPr>
+          <w:rFonts w:ascii="Times New Roman" w:cs="Times New Roman" w:eastAsia="Times New Roman" w:hAnsi="Times New Roman"/>
+          <w:sz w:val="24"/>
+          <w:szCs w:val="24"/>
+        </w:rPr>
+        <w:t xml:space="preserve">The second issue is harm from wrong translations. A misrecognized sign can change the meaning of a sentence, and in medical, legal or financial situations the consequences can be serious. Our design addresses this in two ways: the device abstains and shows candidate signs when it is unsure, and nothing is spoken until the user has read and confirmed the English sentence. High-stakes settings remain outside the intended use of the prototype.</w:t>
+      </w:r>
+    </w:p>
+    <w:p>
+      <w:pPr>
+        <w:spacing w:after="120" w:line="360"/>
+        <w:ind w:firstLine="720"/>
+        <w:jc w:val="both"/>
+      </w:pPr>
+      <w:r>
+        <w:rPr>
+          <w:rFonts w:ascii="Times New Roman" w:cs="Times New Roman" w:eastAsia="Times New Roman" w:hAnsi="Times New Roman"/>
+          <w:sz w:val="24"/>
+          <w:szCs w:val="24"/>
+        </w:rPr>
+        <w:t xml:space="preserve">The third issue is fairness. Sign recognition systems can work less well for some people, for example because of differences in signing style, handedness, skin tone or lighting. We will test with signers who differ in these respects, report accuracy for each signer rather than only an average, and publish any limits we find. Privacy and consent are closely related: the camera captures users' faces and bodies, so all processing stays on the device and no video or audio is stored or transmitted. We use consent-based training data such as ASL Citizen [2], and any recordings we make ourselves will be collected with written consent.</w:t>
+      </w:r>
+    </w:p>
+    <w:p>
+      <w:pPr>
+        <w:spacing w:after="120" w:line="360"/>
+        <w:ind w:firstLine="720"/>
+        <w:jc w:val="both"/>
+      </w:pPr>
+      <w:r>
+        <w:rPr>
+          <w:rFonts w:ascii="Times New Roman" w:cs="Times New Roman" w:eastAsia="Times New Roman" w:hAnsi="Times New Roman"/>
+          <w:sz w:val="24"/>
+          <w:szCs w:val="24"/>
+        </w:rPr>
+        <w:t xml:space="preserve">Finally, Deaf involvement is the issue that Deaf communities themselves rank highest. Our team is hearing, and both surveys cited in Section 3 show that the strongest concerns are hearing people profiting from ASL and sign language technology being built without Deaf input [1], [16]. We will therefore contact the ASL community at NJIT before choosing the vocabulary, invite Deaf signers to test the prototype, credit their contributions, and adjust the design based on their feedback. Any testing with people will follow NJIT's requirements for research involving human participants.</w:t>
       </w:r>
     </w:p>
     <w:p>
@@ -5562,7 +5622,7 @@
           </w:tcPr>
           <w:p>
             <w:pPr>
-              <w:keepNext/>
+              <w:keepNext w:val="false"/>
             </w:pPr>
             <w:r>
               <w:rPr>
@@ -5591,7 +5651,7 @@
           </w:tcPr>
           <w:p>
             <w:pPr>
-              <w:keepNext/>
+              <w:keepNext w:val="false"/>
             </w:pPr>
             <w:r>
               <w:rPr>
@@ -5620,7 +5680,7 @@
           </w:tcPr>
           <w:p>
             <w:pPr>
-              <w:keepNext/>
+              <w:keepNext w:val="false"/>
             </w:pPr>
             <w:r>
               <w:rPr>
@@ -5655,7 +5715,7 @@
           </w:tcPr>
           <w:p>
             <w:pPr>
-              <w:keepNext/>
+              <w:keepNext w:val="false"/>
             </w:pPr>
             <w:r>
               <w:rPr>
@@ -5684,7 +5744,7 @@
           </w:tcPr>
           <w:p>
             <w:pPr>
-              <w:keepNext/>
+              <w:keepNext w:val="false"/>
             </w:pPr>
             <w:r>
               <w:rPr>
@@ -5713,7 +5773,7 @@
           </w:tcPr>
           <w:p>
             <w:pPr>
-              <w:keepNext/>
+              <w:keepNext w:val="false"/>
             </w:pPr>
             <w:r>
               <w:rPr>
@@ -5748,7 +5808,7 @@
           </w:tcPr>
           <w:p>
             <w:pPr>
-              <w:keepNext/>
+              <w:keepNext w:val="false"/>
             </w:pPr>
             <w:r>
               <w:rPr>
@@ -5777,7 +5837,7 @@
           </w:tcPr>
           <w:p>
             <w:pPr>
-              <w:keepNext/>
+              <w:keepNext w:val="false"/>
             </w:pPr>
             <w:r>
               <w:rPr>
@@ -5806,7 +5866,7 @@
           </w:tcPr>
           <w:p>
             <w:pPr>
-              <w:keepNext/>
+              <w:keepNext w:val="false"/>
             </w:pPr>
             <w:r>
               <w:rPr>
@@ -5841,7 +5901,7 @@
           </w:tcPr>
           <w:p>
             <w:pPr>
-              <w:keepNext/>
+              <w:keepNext w:val="false"/>
             </w:pPr>
             <w:r>
               <w:rPr>
@@ -5870,7 +5930,7 @@
           </w:tcPr>
           <w:p>
             <w:pPr>
-              <w:keepNext/>
+              <w:keepNext w:val="false"/>
             </w:pPr>
             <w:r>
               <w:rPr>
@@ -5899,7 +5959,7 @@
           </w:tcPr>
           <w:p>
             <w:pPr>
-              <w:keepNext/>
+              <w:keepNext w:val="false"/>
             </w:pPr>
             <w:r>
               <w:rPr>
@@ -5934,7 +5994,7 @@
           </w:tcPr>
           <w:p>
             <w:pPr>
-              <w:keepNext/>
+              <w:keepNext w:val="false"/>
             </w:pPr>
             <w:r>
               <w:rPr>
@@ -5963,7 +6023,7 @@
           </w:tcPr>
           <w:p>
             <w:pPr>
-              <w:keepNext/>
+              <w:keepNext w:val="false"/>
             </w:pPr>
             <w:r>
               <w:rPr>
@@ -5992,7 +6052,7 @@
           </w:tcPr>
           <w:p>
             <w:pPr>
-              <w:keepNext/>
+              <w:keepNext w:val="false"/>
             </w:pPr>
             <w:r>
               <w:rPr>
@@ -6027,7 +6087,7 @@
           </w:tcPr>
           <w:p>
             <w:pPr>
-              <w:keepNext/>
+              <w:keepNext w:val="false"/>
             </w:pPr>
             <w:r>
               <w:rPr>
@@ -6056,7 +6116,7 @@
           </w:tcPr>
           <w:p>
             <w:pPr>
-              <w:keepNext/>
+              <w:keepNext w:val="false"/>
             </w:pPr>
             <w:r>
               <w:rPr>
@@ -6085,7 +6145,7 @@
           </w:tcPr>
           <w:p>
             <w:pPr>
-              <w:keepNext/>
+              <w:keepNext w:val="false"/>
             </w:pPr>
             <w:r>
               <w:rPr>
@@ -6120,7 +6180,7 @@
           </w:tcPr>
           <w:p>
             <w:pPr>
-              <w:keepNext/>
+              <w:keepNext w:val="false"/>
             </w:pPr>
             <w:r>
               <w:rPr>
@@ -6149,7 +6209,7 @@
           </w:tcPr>
           <w:p>
             <w:pPr>
-              <w:keepNext/>
+              <w:keepNext w:val="false"/>
             </w:pPr>
             <w:r>
               <w:rPr>
@@ -6178,7 +6238,7 @@
           </w:tcPr>
           <w:p>
             <w:pPr>
-              <w:keepNext/>
+              <w:keepNext w:val="false"/>
             </w:pPr>
             <w:r>
               <w:rPr>
@@ -6288,66 +6348,6 @@
       <w:pPr>
         <w:spacing w:after="240"/>
       </w:pPr>
-    </w:p>
-    <w:p>
-      <w:pPr>
-        <w:spacing w:after="120" w:line="360"/>
-        <w:ind w:firstLine="720"/>
-        <w:jc w:val="both"/>
-      </w:pPr>
-      <w:r>
-        <w:rPr>
-          <w:rFonts w:ascii="Times New Roman" w:cs="Times New Roman" w:eastAsia="Times New Roman" w:hAnsi="Times New Roman"/>
-          <w:sz w:val="24"/>
-          <w:szCs w:val="24"/>
-        </w:rPr>
-        <w:t xml:space="preserve">The first issue is the risk of replacing interpreters. In the U.S. survey, 88% of Deaf participants were concerned that automatic translation could weaken the legal right to an interpreter [1]. A device like ours could be misused by an organization as a cheaper substitute in situations where a qualified interpreter is required. We will therefore describe and label the device as an aid for situations where no interpreter is available, and state this both in its documentation and on its start screen.</w:t>
-      </w:r>
-    </w:p>
-    <w:p>
-      <w:pPr>
-        <w:spacing w:after="120" w:line="360"/>
-        <w:ind w:firstLine="720"/>
-        <w:jc w:val="both"/>
-      </w:pPr>
-      <w:r>
-        <w:rPr>
-          <w:rFonts w:ascii="Times New Roman" w:cs="Times New Roman" w:eastAsia="Times New Roman" w:hAnsi="Times New Roman"/>
-          <w:sz w:val="24"/>
-          <w:szCs w:val="24"/>
-        </w:rPr>
-        <w:t xml:space="preserve">The second issue is harm from wrong translations. A misrecognized sign can change the meaning of a sentence, and in medical, legal or financial situations the consequences can be serious. Our design addresses this in two ways: the device abstains and shows candidate signs when it is unsure, and nothing is spoken until the user has read and confirmed the English sentence. High-stakes settings remain outside the intended use of the prototype.</w:t>
-      </w:r>
-    </w:p>
-    <w:p>
-      <w:pPr>
-        <w:spacing w:after="120" w:line="360"/>
-        <w:ind w:firstLine="720"/>
-        <w:jc w:val="both"/>
-      </w:pPr>
-      <w:r>
-        <w:rPr>
-          <w:rFonts w:ascii="Times New Roman" w:cs="Times New Roman" w:eastAsia="Times New Roman" w:hAnsi="Times New Roman"/>
-          <w:sz w:val="24"/>
-          <w:szCs w:val="24"/>
-        </w:rPr>
-        <w:t xml:space="preserve">The third issue is fairness. Sign recognition systems can work less well for some people, for example because of differences in signing style, handedness, skin tone or lighting. We will test with signers who differ in these respects, report accuracy for each signer rather than only an average, and publish any limits we find. Privacy and consent are closely related: the camera captures users' faces and bodies, so all processing stays on the device and no video or audio is stored or transmitted. We use consent-based training data such as ASL Citizen [2], and any recordings we make ourselves will be collected with written consent.</w:t>
-      </w:r>
-    </w:p>
-    <w:p>
-      <w:pPr>
-        <w:spacing w:after="120" w:line="360"/>
-        <w:ind w:firstLine="720"/>
-        <w:jc w:val="both"/>
-      </w:pPr>
-      <w:r>
-        <w:rPr>
-          <w:rFonts w:ascii="Times New Roman" w:cs="Times New Roman" w:eastAsia="Times New Roman" w:hAnsi="Times New Roman"/>
-          <w:sz w:val="24"/>
-          <w:szCs w:val="24"/>
-        </w:rPr>
-        <w:t xml:space="preserve">Finally, Deaf involvement is the issue that Deaf communities themselves rank highest. Our team is hearing, and both surveys cited in Section 3 show that the strongest concerns are hearing people profiting from ASL and sign language technology being built without Deaf input [1], [16]. We will therefore contact the ASL community at NJIT before choosing the vocabulary, invite Deaf signers to test the prototype, credit their contributions, and adjust the design based on their feedback. Any testing with people will follow NJIT's requirements for research involving human participants.</w:t>
-      </w:r>
     </w:p>
     <w:p>
       <w:r>

</xml_diff>

<commit_message>
Show student ID numbers in the proposal draft
At the team's request, the cover page in the Word and PDF copies now shows
the student ID numbers instead of blanks.

Co-Authored-By: Claude Opus 5.5 <noreply@anthropic.com>
Claude-Session: https://claude.ai/code/session_01Ghe1P8BgNsyGdHuD4xCbdv
</commit_message>
<xml_diff>
--- a/docs/ECE_414_Proposal_Draft.docx
+++ b/docs/ECE_414_Proposal_Draft.docx
@@ -271,7 +271,7 @@
         <w:t xml:space="preserve">ID# </w:t>
       </w:r>
       <w:r>
-        <w:t>________</w:t>
+        <w:t>31699521</w:t>
       </w:r>
     </w:p>
     <w:p>
@@ -304,7 +304,7 @@
         <w:t xml:space="preserve">ID# </w:t>
       </w:r>
       <w:r>
-        <w:t>________</w:t>
+        <w:t>31699799</w:t>
       </w:r>
     </w:p>
     <w:p>
@@ -329,7 +329,7 @@
         <w:t xml:space="preserve">ID# </w:t>
       </w:r>
       <w:r>
-        <w:t>________</w:t>
+        <w:t>31623224</w:t>
       </w:r>
     </w:p>
     <w:p>
@@ -346,7 +346,7 @@
       </w:r>
       <w:r>
         <w:tab/>
-        <w:t>ID# ________</w:t>
+        <w:t>ID# 31699507</w:t>
       </w:r>
       <w:r>
         <w:br w:type="page"/>

</xml_diff>

<commit_message>
Remove forced page breaks before Sections 4 and 5
The page break before Section 5 left most of the page after Table 4 empty.
Sections 4 and 5 now flow on from the previous section; only the
references still start on a new page.

Co-Authored-By: Claude Opus 5.5 <noreply@anthropic.com>
Claude-Session: https://claude.ai/code/session_01Ghe1P8BgNsyGdHuD4xCbdv
</commit_message>
<xml_diff>
--- a/docs/ECE_414_Proposal_Draft.docx
+++ b/docs/ECE_414_Proposal_Draft.docx
@@ -3514,15 +3514,10 @@
       </w:r>
     </w:p>
     <w:p>
-      <w:r>
-        <w:br w:type="page"/>
-      </w:r>
-    </w:p>
-    <w:p>
       <w:pPr>
         <w:pStyle w:val="IntroSection"/>
         <w:keepNext/>
-        <w:spacing w:after="120" w:before="0"/>
+        <w:spacing w:after="120" w:before="360"/>
       </w:pPr>
       <w:r>
         <w:rPr>
@@ -5282,15 +5277,10 @@
       </w:pPr>
     </w:p>
     <w:p>
-      <w:r>
-        <w:br w:type="page"/>
-      </w:r>
-    </w:p>
-    <w:p>
       <w:pPr>
         <w:pStyle w:val="IntroSection"/>
         <w:keepNext/>
-        <w:spacing w:after="120" w:before="0"/>
+        <w:spacing w:after="120" w:before="360"/>
       </w:pPr>
       <w:r>
         <w:rPr>

</xml_diff>

<commit_message>
Address team review of Sections 4 and 5
Writes the table of contents entries and page numbers into the file so it
is correct even where fields are not updated; states the interpreter-rights
finding precisely (28 of 32 participants, 88%); removes an unverified claim
about the team's hearing status; and adds fingerspelling to Goal 1 and
Table 3 as a stretch goal.

Co-Authored-By: Claude Opus 5.5 <noreply@anthropic.com>
Claude-Session: https://claude.ai/code/session_01Ghe1P8BgNsyGdHuD4xCbdv
</commit_message>
<xml_diff>
--- a/docs/ECE_414_Proposal_Draft.docx
+++ b/docs/ECE_414_Proposal_Draft.docx
@@ -676,9 +676,6 @@
         <w:tabs>
           <w:tab w:val="right" w:leader="dot" w:pos="9350"/>
         </w:tabs>
-        <w:rPr>
-          <w:noProof/>
-        </w:rPr>
       </w:pPr>
       <w:r>
         <w:fldChar w:fldCharType="begin"/>
@@ -689,63 +686,15 @@
       <w:r>
         <w:fldChar w:fldCharType="separate"/>
       </w:r>
-      <w:hyperlink w:anchor="_Toc241179580" w:history="1">
-        <w:r>
-          <w:rPr>
-            <w:rStyle w:val="Hyperlink"/>
-            <w:noProof/>
-          </w:rPr>
-          <w:t>3. Introduction</w:t>
-        </w:r>
-        <w:r>
-          <w:rPr>
-            <w:noProof/>
-            <w:webHidden/>
-          </w:rPr>
-          <w:tab/>
-        </w:r>
-        <w:r>
-          <w:rPr>
-            <w:noProof/>
-            <w:webHidden/>
-          </w:rPr>
-          <w:fldChar w:fldCharType="begin"/>
-        </w:r>
-        <w:r>
-          <w:rPr>
-            <w:noProof/>
-            <w:webHidden/>
-          </w:rPr>
-          <w:instrText xml:space="preserve"> PAGEREF _Toc241179580 \h </w:instrText>
-        </w:r>
-        <w:r>
-          <w:rPr>
-            <w:noProof/>
-            <w:webHidden/>
-          </w:rPr>
-        </w:r>
-        <w:r>
-          <w:rPr>
-            <w:noProof/>
-            <w:webHidden/>
-          </w:rPr>
-          <w:fldChar w:fldCharType="separate"/>
-        </w:r>
-        <w:r>
-          <w:rPr>
-            <w:noProof/>
-            <w:webHidden/>
-          </w:rPr>
-          <w:t>0</w:t>
-        </w:r>
-        <w:r>
-          <w:rPr>
-            <w:noProof/>
-            <w:webHidden/>
-          </w:rPr>
-          <w:fldChar w:fldCharType="end"/>
-        </w:r>
-      </w:hyperlink>
+      <w:r>
+        <w:t xml:space="preserve">3. Introduction</w:t>
+      </w:r>
+      <w:r>
+        <w:tab/>
+      </w:r>
+      <w:r>
+        <w:t>3</w:t>
+      </w:r>
     </w:p>
     <w:p>
       <w:pPr>
@@ -753,67 +702,16 @@
         <w:tabs>
           <w:tab w:val="right" w:leader="dot" w:pos="9350"/>
         </w:tabs>
-        <w:rPr>
-          <w:noProof/>
-        </w:rPr>
-      </w:pPr>
-      <w:hyperlink w:anchor="_Toc241179581" w:history="1">
-        <w:r>
-          <w:rPr>
-            <w:rStyle w:val="Hyperlink"/>
-            <w:noProof/>
-          </w:rPr>
-          <w:t>3.1 Background</w:t>
-        </w:r>
-        <w:r>
-          <w:rPr>
-            <w:noProof/>
-            <w:webHidden/>
-          </w:rPr>
-          <w:tab/>
-        </w:r>
-        <w:r>
-          <w:rPr>
-            <w:noProof/>
-            <w:webHidden/>
-          </w:rPr>
-          <w:fldChar w:fldCharType="begin"/>
-        </w:r>
-        <w:r>
-          <w:rPr>
-            <w:noProof/>
-            <w:webHidden/>
-          </w:rPr>
-          <w:instrText xml:space="preserve"> PAGEREF _Toc241179581 \h </w:instrText>
-        </w:r>
-        <w:r>
-          <w:rPr>
-            <w:noProof/>
-            <w:webHidden/>
-          </w:rPr>
-        </w:r>
-        <w:r>
-          <w:rPr>
-            <w:noProof/>
-            <w:webHidden/>
-          </w:rPr>
-          <w:fldChar w:fldCharType="separate"/>
-        </w:r>
-        <w:r>
-          <w:rPr>
-            <w:noProof/>
-            <w:webHidden/>
-          </w:rPr>
-          <w:t>0</w:t>
-        </w:r>
-        <w:r>
-          <w:rPr>
-            <w:noProof/>
-            <w:webHidden/>
-          </w:rPr>
-          <w:fldChar w:fldCharType="end"/>
-        </w:r>
-      </w:hyperlink>
+      </w:pPr>
+      <w:r>
+        <w:t xml:space="preserve">3.1 Background</w:t>
+      </w:r>
+      <w:r>
+        <w:tab/>
+      </w:r>
+      <w:r>
+        <w:t>3</w:t>
+      </w:r>
     </w:p>
     <w:p>
       <w:pPr>
@@ -821,67 +719,16 @@
         <w:tabs>
           <w:tab w:val="right" w:leader="dot" w:pos="9350"/>
         </w:tabs>
-        <w:rPr>
-          <w:noProof/>
-        </w:rPr>
-      </w:pPr>
-      <w:hyperlink w:anchor="_Toc241179582" w:history="1">
-        <w:r>
-          <w:rPr>
-            <w:rStyle w:val="Hyperlink"/>
-            <w:noProof/>
-          </w:rPr>
-          <w:t>3.2 Problem Statement</w:t>
-        </w:r>
-        <w:r>
-          <w:rPr>
-            <w:noProof/>
-            <w:webHidden/>
-          </w:rPr>
-          <w:tab/>
-        </w:r>
-        <w:r>
-          <w:rPr>
-            <w:noProof/>
-            <w:webHidden/>
-          </w:rPr>
-          <w:fldChar w:fldCharType="begin"/>
-        </w:r>
-        <w:r>
-          <w:rPr>
-            <w:noProof/>
-            <w:webHidden/>
-          </w:rPr>
-          <w:instrText xml:space="preserve"> PAGEREF _Toc241179582 \h </w:instrText>
-        </w:r>
-        <w:r>
-          <w:rPr>
-            <w:noProof/>
-            <w:webHidden/>
-          </w:rPr>
-        </w:r>
-        <w:r>
-          <w:rPr>
-            <w:noProof/>
-            <w:webHidden/>
-          </w:rPr>
-          <w:fldChar w:fldCharType="separate"/>
-        </w:r>
-        <w:r>
-          <w:rPr>
-            <w:noProof/>
-            <w:webHidden/>
-          </w:rPr>
-          <w:t>0</w:t>
-        </w:r>
-        <w:r>
-          <w:rPr>
-            <w:noProof/>
-            <w:webHidden/>
-          </w:rPr>
-          <w:fldChar w:fldCharType="end"/>
-        </w:r>
-      </w:hyperlink>
+      </w:pPr>
+      <w:r>
+        <w:t xml:space="preserve">3.2 Problem Statement</w:t>
+      </w:r>
+      <w:r>
+        <w:tab/>
+      </w:r>
+      <w:r>
+        <w:t>4</w:t>
+      </w:r>
     </w:p>
     <w:p>
       <w:pPr>
@@ -889,67 +736,16 @@
         <w:tabs>
           <w:tab w:val="right" w:leader="dot" w:pos="9350"/>
         </w:tabs>
-        <w:rPr>
-          <w:noProof/>
-        </w:rPr>
-      </w:pPr>
-      <w:hyperlink w:anchor="_Toc241179583" w:history="1">
-        <w:r>
-          <w:rPr>
-            <w:rStyle w:val="Hyperlink"/>
-            <w:noProof/>
-          </w:rPr>
-          <w:t>3.3 Objectives</w:t>
-        </w:r>
-        <w:r>
-          <w:rPr>
-            <w:noProof/>
-            <w:webHidden/>
-          </w:rPr>
-          <w:tab/>
-        </w:r>
-        <w:r>
-          <w:rPr>
-            <w:noProof/>
-            <w:webHidden/>
-          </w:rPr>
-          <w:fldChar w:fldCharType="begin"/>
-        </w:r>
-        <w:r>
-          <w:rPr>
-            <w:noProof/>
-            <w:webHidden/>
-          </w:rPr>
-          <w:instrText xml:space="preserve"> PAGEREF _Toc241179583 \h </w:instrText>
-        </w:r>
-        <w:r>
-          <w:rPr>
-            <w:noProof/>
-            <w:webHidden/>
-          </w:rPr>
-        </w:r>
-        <w:r>
-          <w:rPr>
-            <w:noProof/>
-            <w:webHidden/>
-          </w:rPr>
-          <w:fldChar w:fldCharType="separate"/>
-        </w:r>
-        <w:r>
-          <w:rPr>
-            <w:noProof/>
-            <w:webHidden/>
-          </w:rPr>
-          <w:t>0</w:t>
-        </w:r>
-        <w:r>
-          <w:rPr>
-            <w:noProof/>
-            <w:webHidden/>
-          </w:rPr>
-          <w:fldChar w:fldCharType="end"/>
-        </w:r>
-      </w:hyperlink>
+      </w:pPr>
+      <w:r>
+        <w:t xml:space="preserve">3.3 Objectives</w:t>
+      </w:r>
+      <w:r>
+        <w:tab/>
+      </w:r>
+      <w:r>
+        <w:t>4</w:t>
+      </w:r>
     </w:p>
     <w:p>
       <w:pPr>
@@ -957,67 +753,16 @@
         <w:tabs>
           <w:tab w:val="right" w:leader="dot" w:pos="9350"/>
         </w:tabs>
-        <w:rPr>
-          <w:noProof/>
-        </w:rPr>
-      </w:pPr>
-      <w:hyperlink w:anchor="_Toc241179584" w:history="1">
-        <w:r>
-          <w:rPr>
-            <w:rStyle w:val="Hyperlink"/>
-            <w:noProof/>
-          </w:rPr>
-          <w:t>3.4 Proposed Approach</w:t>
-        </w:r>
-        <w:r>
-          <w:rPr>
-            <w:noProof/>
-            <w:webHidden/>
-          </w:rPr>
-          <w:tab/>
-        </w:r>
-        <w:r>
-          <w:rPr>
-            <w:noProof/>
-            <w:webHidden/>
-          </w:rPr>
-          <w:fldChar w:fldCharType="begin"/>
-        </w:r>
-        <w:r>
-          <w:rPr>
-            <w:noProof/>
-            <w:webHidden/>
-          </w:rPr>
-          <w:instrText xml:space="preserve"> PAGEREF _Toc241179584 \h </w:instrText>
-        </w:r>
-        <w:r>
-          <w:rPr>
-            <w:noProof/>
-            <w:webHidden/>
-          </w:rPr>
-        </w:r>
-        <w:r>
-          <w:rPr>
-            <w:noProof/>
-            <w:webHidden/>
-          </w:rPr>
-          <w:fldChar w:fldCharType="separate"/>
-        </w:r>
-        <w:r>
-          <w:rPr>
-            <w:noProof/>
-            <w:webHidden/>
-          </w:rPr>
-          <w:t>0</w:t>
-        </w:r>
-        <w:r>
-          <w:rPr>
-            <w:noProof/>
-            <w:webHidden/>
-          </w:rPr>
-          <w:fldChar w:fldCharType="end"/>
-        </w:r>
-      </w:hyperlink>
+      </w:pPr>
+      <w:r>
+        <w:t xml:space="preserve">3.4 Proposed Approach</w:t>
+      </w:r>
+      <w:r>
+        <w:tab/>
+      </w:r>
+      <w:r>
+        <w:t>6</w:t>
+      </w:r>
     </w:p>
     <w:p>
       <w:pPr>
@@ -1025,67 +770,16 @@
         <w:tabs>
           <w:tab w:val="right" w:leader="dot" w:pos="9350"/>
         </w:tabs>
-        <w:rPr>
-          <w:noProof/>
-        </w:rPr>
-      </w:pPr>
-      <w:hyperlink w:anchor="_Toc241179585" w:history="1">
-        <w:r>
-          <w:rPr>
-            <w:rStyle w:val="Hyperlink"/>
-            <w:noProof/>
-          </w:rPr>
-          <w:t>3.5 Current Trends</w:t>
-        </w:r>
-        <w:r>
-          <w:rPr>
-            <w:noProof/>
-            <w:webHidden/>
-          </w:rPr>
-          <w:tab/>
-        </w:r>
-        <w:r>
-          <w:rPr>
-            <w:noProof/>
-            <w:webHidden/>
-          </w:rPr>
-          <w:fldChar w:fldCharType="begin"/>
-        </w:r>
-        <w:r>
-          <w:rPr>
-            <w:noProof/>
-            <w:webHidden/>
-          </w:rPr>
-          <w:instrText xml:space="preserve"> PAGEREF _Toc241179585 \h </w:instrText>
-        </w:r>
-        <w:r>
-          <w:rPr>
-            <w:noProof/>
-            <w:webHidden/>
-          </w:rPr>
-        </w:r>
-        <w:r>
-          <w:rPr>
-            <w:noProof/>
-            <w:webHidden/>
-          </w:rPr>
-          <w:fldChar w:fldCharType="separate"/>
-        </w:r>
-        <w:r>
-          <w:rPr>
-            <w:noProof/>
-            <w:webHidden/>
-          </w:rPr>
-          <w:t>0</w:t>
-        </w:r>
-        <w:r>
-          <w:rPr>
-            <w:noProof/>
-            <w:webHidden/>
-          </w:rPr>
-          <w:fldChar w:fldCharType="end"/>
-        </w:r>
-      </w:hyperlink>
+      </w:pPr>
+      <w:r>
+        <w:t xml:space="preserve">3.5 Current Trends</w:t>
+      </w:r>
+      <w:r>
+        <w:tab/>
+      </w:r>
+      <w:r>
+        <w:t>8</w:t>
+      </w:r>
     </w:p>
     <w:p>
       <w:pPr>
@@ -1093,67 +787,16 @@
         <w:tabs>
           <w:tab w:val="right" w:leader="dot" w:pos="9350"/>
         </w:tabs>
-        <w:rPr>
-          <w:noProof/>
-        </w:rPr>
-      </w:pPr>
-      <w:hyperlink w:anchor="_Toc241179586" w:history="1">
-        <w:r>
-          <w:rPr>
-            <w:rStyle w:val="Hyperlink"/>
-            <w:noProof/>
-          </w:rPr>
-          <w:t>3.6 Existing Systems</w:t>
-        </w:r>
-        <w:r>
-          <w:rPr>
-            <w:noProof/>
-            <w:webHidden/>
-          </w:rPr>
-          <w:tab/>
-        </w:r>
-        <w:r>
-          <w:rPr>
-            <w:noProof/>
-            <w:webHidden/>
-          </w:rPr>
-          <w:fldChar w:fldCharType="begin"/>
-        </w:r>
-        <w:r>
-          <w:rPr>
-            <w:noProof/>
-            <w:webHidden/>
-          </w:rPr>
-          <w:instrText xml:space="preserve"> PAGEREF _Toc241179586 \h </w:instrText>
-        </w:r>
-        <w:r>
-          <w:rPr>
-            <w:noProof/>
-            <w:webHidden/>
-          </w:rPr>
-        </w:r>
-        <w:r>
-          <w:rPr>
-            <w:noProof/>
-            <w:webHidden/>
-          </w:rPr>
-          <w:fldChar w:fldCharType="separate"/>
-        </w:r>
-        <w:r>
-          <w:rPr>
-            <w:noProof/>
-            <w:webHidden/>
-          </w:rPr>
-          <w:t>0</w:t>
-        </w:r>
-        <w:r>
-          <w:rPr>
-            <w:noProof/>
-            <w:webHidden/>
-          </w:rPr>
-          <w:fldChar w:fldCharType="end"/>
-        </w:r>
-      </w:hyperlink>
+      </w:pPr>
+      <w:r>
+        <w:t xml:space="preserve">3.6 Existing Systems</w:t>
+      </w:r>
+      <w:r>
+        <w:tab/>
+      </w:r>
+      <w:r>
+        <w:t>8</w:t>
+      </w:r>
     </w:p>
     <w:p>
       <w:pPr>
@@ -1161,67 +804,16 @@
         <w:tabs>
           <w:tab w:val="right" w:leader="dot" w:pos="9350"/>
         </w:tabs>
-        <w:rPr>
-          <w:noProof/>
-        </w:rPr>
-      </w:pPr>
-      <w:hyperlink w:anchor="_Toc241179587" w:history="1">
-        <w:r>
-          <w:rPr>
-            <w:rStyle w:val="Hyperlink"/>
-            <w:noProof/>
-          </w:rPr>
-          <w:t>3.7 Ethics, Economics and Sustainability</w:t>
-        </w:r>
-        <w:r>
-          <w:rPr>
-            <w:noProof/>
-            <w:webHidden/>
-          </w:rPr>
-          <w:tab/>
-        </w:r>
-        <w:r>
-          <w:rPr>
-            <w:noProof/>
-            <w:webHidden/>
-          </w:rPr>
-          <w:fldChar w:fldCharType="begin"/>
-        </w:r>
-        <w:r>
-          <w:rPr>
-            <w:noProof/>
-            <w:webHidden/>
-          </w:rPr>
-          <w:instrText xml:space="preserve"> PAGEREF _Toc241179587 \h </w:instrText>
-        </w:r>
-        <w:r>
-          <w:rPr>
-            <w:noProof/>
-            <w:webHidden/>
-          </w:rPr>
-        </w:r>
-        <w:r>
-          <w:rPr>
-            <w:noProof/>
-            <w:webHidden/>
-          </w:rPr>
-          <w:fldChar w:fldCharType="separate"/>
-        </w:r>
-        <w:r>
-          <w:rPr>
-            <w:noProof/>
-            <w:webHidden/>
-          </w:rPr>
-          <w:t>0</w:t>
-        </w:r>
-        <w:r>
-          <w:rPr>
-            <w:noProof/>
-            <w:webHidden/>
-          </w:rPr>
-          <w:fldChar w:fldCharType="end"/>
-        </w:r>
-      </w:hyperlink>
+      </w:pPr>
+      <w:r>
+        <w:t xml:space="preserve">3.7 Ethics, Economics and Sustainability</w:t>
+      </w:r>
+      <w:r>
+        <w:tab/>
+      </w:r>
+      <w:r>
+        <w:t>9</w:t>
+      </w:r>
     </w:p>
     <w:p>
       <w:pPr>
@@ -1229,67 +821,155 @@
         <w:tabs>
           <w:tab w:val="right" w:leader="dot" w:pos="9350"/>
         </w:tabs>
-        <w:rPr>
-          <w:noProof/>
-        </w:rPr>
-      </w:pPr>
-      <w:hyperlink w:anchor="_Toc241179588" w:history="1">
-        <w:r>
-          <w:rPr>
-            <w:rStyle w:val="Hyperlink"/>
-            <w:noProof/>
-          </w:rPr>
-          <w:t>12. References</w:t>
-        </w:r>
-        <w:r>
-          <w:rPr>
-            <w:noProof/>
-            <w:webHidden/>
-          </w:rPr>
-          <w:tab/>
-        </w:r>
-        <w:r>
-          <w:rPr>
-            <w:noProof/>
-            <w:webHidden/>
-          </w:rPr>
-          <w:fldChar w:fldCharType="begin"/>
-        </w:r>
-        <w:r>
-          <w:rPr>
-            <w:noProof/>
-            <w:webHidden/>
-          </w:rPr>
-          <w:instrText xml:space="preserve"> PAGEREF _Toc241179588 \h </w:instrText>
-        </w:r>
-        <w:r>
-          <w:rPr>
-            <w:noProof/>
-            <w:webHidden/>
-          </w:rPr>
-        </w:r>
-        <w:r>
-          <w:rPr>
-            <w:noProof/>
-            <w:webHidden/>
-          </w:rPr>
-          <w:fldChar w:fldCharType="separate"/>
-        </w:r>
-        <w:r>
-          <w:rPr>
-            <w:noProof/>
-            <w:webHidden/>
-          </w:rPr>
-          <w:t>0</w:t>
-        </w:r>
-        <w:r>
-          <w:rPr>
-            <w:noProof/>
-            <w:webHidden/>
-          </w:rPr>
-          <w:fldChar w:fldCharType="end"/>
-        </w:r>
-      </w:hyperlink>
+      </w:pPr>
+      <w:r>
+        <w:t xml:space="preserve">4. Technical Goals</w:t>
+      </w:r>
+      <w:r>
+        <w:tab/>
+      </w:r>
+      <w:r>
+        <w:t>10</w:t>
+      </w:r>
+    </w:p>
+    <w:p>
+      <w:pPr>
+        <w:pStyle w:val="TOC2"/>
+        <w:tabs>
+          <w:tab w:val="right" w:leader="dot" w:pos="9350"/>
+        </w:tabs>
+      </w:pPr>
+      <w:r>
+        <w:t xml:space="preserve">4.1 Goal 1: Sign Recognition with Abstention</w:t>
+      </w:r>
+      <w:r>
+        <w:tab/>
+      </w:r>
+      <w:r>
+        <w:t>11</w:t>
+      </w:r>
+    </w:p>
+    <w:p>
+      <w:pPr>
+        <w:pStyle w:val="TOC2"/>
+        <w:tabs>
+          <w:tab w:val="right" w:leader="dot" w:pos="9350"/>
+        </w:tabs>
+      </w:pPr>
+      <w:r>
+        <w:t xml:space="preserve">4.2 Goal 2: Confirmed Multilingual Speech and Two-Way Conversation</w:t>
+      </w:r>
+      <w:r>
+        <w:tab/>
+      </w:r>
+      <w:r>
+        <w:t>11</w:t>
+      </w:r>
+    </w:p>
+    <w:p>
+      <w:pPr>
+        <w:pStyle w:val="TOC2"/>
+        <w:tabs>
+          <w:tab w:val="right" w:leader="dot" w:pos="9350"/>
+        </w:tabs>
+      </w:pPr>
+      <w:r>
+        <w:t xml:space="preserve">4.3 Goal 3: Offline Embedded Integration</w:t>
+      </w:r>
+      <w:r>
+        <w:tab/>
+      </w:r>
+      <w:r>
+        <w:t>12</w:t>
+      </w:r>
+    </w:p>
+    <w:p>
+      <w:pPr>
+        <w:pStyle w:val="TOC2"/>
+        <w:tabs>
+          <w:tab w:val="right" w:leader="dot" w:pos="9350"/>
+        </w:tabs>
+      </w:pPr>
+      <w:r>
+        <w:t xml:space="preserve">4.4 Team Responsibilities</w:t>
+      </w:r>
+      <w:r>
+        <w:tab/>
+      </w:r>
+      <w:r>
+        <w:t>12</w:t>
+      </w:r>
+    </w:p>
+    <w:p>
+      <w:pPr>
+        <w:pStyle w:val="TOC1"/>
+        <w:tabs>
+          <w:tab w:val="right" w:leader="dot" w:pos="9350"/>
+        </w:tabs>
+      </w:pPr>
+      <w:r>
+        <w:t xml:space="preserve">5. Projected Community Impact and Relevant Ethical Issues</w:t>
+      </w:r>
+      <w:r>
+        <w:tab/>
+      </w:r>
+      <w:r>
+        <w:t>14</w:t>
+      </w:r>
+    </w:p>
+    <w:p>
+      <w:pPr>
+        <w:pStyle w:val="TOC2"/>
+        <w:tabs>
+          <w:tab w:val="right" w:leader="dot" w:pos="9350"/>
+        </w:tabs>
+      </w:pPr>
+      <w:r>
+        <w:t xml:space="preserve">5.1 Community Impact</w:t>
+      </w:r>
+      <w:r>
+        <w:tab/>
+      </w:r>
+      <w:r>
+        <w:t>14</w:t>
+      </w:r>
+    </w:p>
+    <w:p>
+      <w:pPr>
+        <w:pStyle w:val="TOC2"/>
+        <w:tabs>
+          <w:tab w:val="right" w:leader="dot" w:pos="9350"/>
+        </w:tabs>
+      </w:pPr>
+      <w:r>
+        <w:t xml:space="preserve">5.2 Ethical Issues</w:t>
+      </w:r>
+      <w:r>
+        <w:tab/>
+      </w:r>
+      <w:r>
+        <w:t>14</w:t>
+      </w:r>
+    </w:p>
+    <w:p>
+      <w:pPr>
+        <w:pStyle w:val="TOC1"/>
+        <w:tabs>
+          <w:tab w:val="right" w:leader="dot" w:pos="9350"/>
+        </w:tabs>
+      </w:pPr>
+      <w:r>
+        <w:t xml:space="preserve">12. References</w:t>
+      </w:r>
+      <w:r>
+        <w:tab/>
+      </w:r>
+      <w:r>
+        <w:t>17</w:t>
+      </w:r>
+      <w:r>
+        <w:fldChar w:fldCharType="end"/>
+      </w:r>
     </w:p>
     <w:p>
       <w:pPr>
@@ -3604,7 +3284,7 @@
           <w:sz w:val="24"/>
           <w:szCs w:val="24"/>
         </w:rPr>
-        <w:t xml:space="preserve">The confidence scores are as important as the predictions themselves, because the device uses them to decide whether to accept a sign or to ask the user. A calibration step will adjust the scores so that, for example, signs reported with 90% confidence are correct about 90% of the time. The targets are at least 75% top-1 and 90% top-5 accuracy on signers not seen during training, measured on the ASL Citizen signer-independent test split and on recordings from our own test users. In addition, we will report the accuracy on the signs the device accepts together with the share of signs it accepts, using risk–coverage analysis [14]. Accuracy will be reported separately for each test signer, so that any signer for whom the system performs poorly is visible rather than hidden in an average.</w:t>
+        <w:t xml:space="preserve">The confidence scores are as important as the predictions themselves, because the device uses them to decide whether to accept a sign or to ask the user. A calibration step will adjust the scores so that, for example, signs reported with 90% confidence are correct about 90% of the time. The targets are at least 75% top-1 and 90% top-5 accuracy on signers not seen during training, measured on the ASL Citizen signer-independent test split and on recordings from our own test users. In addition, we will report the accuracy on the signs the device accepts together with the share of signs it accepts, using risk–coverage analysis [14]. Accuracy will be reported separately for each test signer, so that any signer for whom the system performs poorly is visible rather than hidden in an average. The fingerspelling fallback described in Section 3.4, which handles words outside the vocabulary such as names by recognizing letters one at a time, is treated as a stretch goal: it will be added once the main vocabulary meets the targets above, and it is not part of the accuracy targets.</w:t>
       </w:r>
     </w:p>
     <w:p>
@@ -4057,6 +3737,99 @@
                 <w:bCs w:val="false"/>
               </w:rPr>
               <w:t xml:space="preserve">Risk–coverage curves over a range of confidence thresholds</w:t>
+            </w:r>
+          </w:p>
+        </w:tc>
+      </w:tr>
+      <w:tr>
+        <w:trPr>
+          <w:cantSplit/>
+          <w:tblHeader w:val="false"/>
+        </w:trPr>
+        <w:tc>
+          <w:tcPr>
+            <w:tcW w:type="dxa" w:w="2200"/>
+            <w:tcBorders>
+              <w:top w:val="none" w:color="FFFFFF" w:sz="0"/>
+              <w:left w:val="none" w:color="FFFFFF" w:sz="0"/>
+              <w:bottom w:val="none" w:color="FFFFFF" w:sz="0"/>
+              <w:right w:val="none" w:color="FFFFFF" w:sz="0"/>
+            </w:tcBorders>
+            <w:tcMar>
+              <w:top w:type="dxa" w:w="50"/>
+              <w:left w:type="dxa" w:w="80"/>
+              <w:bottom w:type="dxa" w:w="50"/>
+              <w:right w:type="dxa" w:w="80"/>
+            </w:tcMar>
+          </w:tcPr>
+          <w:p>
+            <w:pPr>
+              <w:keepNext w:val="false"/>
+            </w:pPr>
+            <w:r>
+              <w:rPr>
+                <w:b w:val="false"/>
+                <w:bCs w:val="false"/>
+              </w:rPr>
+              <w:t xml:space="preserve">1. Sign recognition (stretch goal)</w:t>
+            </w:r>
+          </w:p>
+        </w:tc>
+        <w:tc>
+          <w:tcPr>
+            <w:tcW w:type="dxa" w:w="3400"/>
+            <w:tcBorders>
+              <w:top w:val="none" w:color="FFFFFF" w:sz="0"/>
+              <w:left w:val="none" w:color="FFFFFF" w:sz="0"/>
+              <w:bottom w:val="none" w:color="FFFFFF" w:sz="0"/>
+              <w:right w:val="none" w:color="FFFFFF" w:sz="0"/>
+            </w:tcBorders>
+            <w:tcMar>
+              <w:top w:type="dxa" w:w="50"/>
+              <w:left w:type="dxa" w:w="80"/>
+              <w:bottom w:type="dxa" w:w="50"/>
+              <w:right w:type="dxa" w:w="80"/>
+            </w:tcMar>
+          </w:tcPr>
+          <w:p>
+            <w:pPr>
+              <w:keepNext w:val="false"/>
+            </w:pPr>
+            <w:r>
+              <w:rPr>
+                <w:b w:val="false"/>
+                <w:bCs w:val="false"/>
+              </w:rPr>
+              <w:t xml:space="preserve">Fingerspelling of out-of-vocabulary words such as names</w:t>
+            </w:r>
+          </w:p>
+        </w:tc>
+        <w:tc>
+          <w:tcPr>
+            <w:tcW w:type="dxa" w:w="3760"/>
+            <w:tcBorders>
+              <w:top w:val="none" w:color="FFFFFF" w:sz="0"/>
+              <w:left w:val="none" w:color="FFFFFF" w:sz="0"/>
+              <w:bottom w:val="none" w:color="FFFFFF" w:sz="0"/>
+              <w:right w:val="none" w:color="FFFFFF" w:sz="0"/>
+            </w:tcBorders>
+            <w:tcMar>
+              <w:top w:type="dxa" w:w="50"/>
+              <w:left w:type="dxa" w:w="80"/>
+              <w:bottom w:type="dxa" w:w="50"/>
+              <w:right w:type="dxa" w:w="80"/>
+            </w:tcMar>
+          </w:tcPr>
+          <w:p>
+            <w:pPr>
+              <w:keepNext w:val="false"/>
+            </w:pPr>
+            <w:r>
+              <w:rPr>
+                <w:b w:val="false"/>
+                <w:bCs w:val="false"/>
+              </w:rPr>
+              <w:t xml:space="preserve">Letter accuracy on recorded fingerspelled words</w:t>
             </w:r>
           </w:p>
         </w:tc>
@@ -5414,7 +5187,7 @@
           <w:sz w:val="24"/>
           <w:szCs w:val="24"/>
         </w:rPr>
-        <w:t xml:space="preserve">The first issue is the risk of replacing interpreters. In the U.S. survey, 88% of Deaf participants were concerned that automatic translation could weaken the legal right to an interpreter [1]. A device like ours could be misused by an organization as a cheaper substitute in situations where a qualified interpreter is required. We will therefore describe and label the device as an aid for situations where no interpreter is available, and state this both in its documentation and on its start screen.</w:t>
+        <w:t xml:space="preserve">The first issue is the risk of replacing interpreters. In the U.S. survey, 28 of the 32 Deaf and hard-of-hearing participants (88%) were concerned that automatic translation could weaken the legal protections of their right to accommodations such as interpreters [1]. A device like ours could be misused by an organization as a cheaper substitute in situations where a qualified interpreter is required. We will therefore describe and label the device as an aid for situations where no interpreter is available, and state this both in its documentation and on its start screen.</w:t>
       </w:r>
     </w:p>
     <w:p>
@@ -5459,7 +5232,7 @@
           <w:sz w:val="24"/>
           <w:szCs w:val="24"/>
         </w:rPr>
-        <w:t xml:space="preserve">Finally, Deaf involvement is the issue that Deaf communities themselves rank highest. Our team is hearing, and both surveys cited in Section 3 show that the strongest concerns are hearing people profiting from ASL and sign language technology being built without Deaf input [1], [16]. We will therefore contact the ASL community at NJIT before choosing the vocabulary, invite Deaf signers to test the prototype, credit their contributions, and adjust the design based on their feedback. Any testing with people will follow NJIT's requirements for research involving human participants.</w:t>
+        <w:t xml:space="preserve">Finally, Deaf involvement is the issue that Deaf communities themselves rank highest. Both surveys cited in Section 3 show that the strongest concerns are hearing people profiting from ASL and sign language technology being built without Deaf input [1], [16]. We will therefore contact the ASL community at NJIT before choosing the vocabulary, invite Deaf signers to test the prototype, credit their contributions, and adjust the design based on their feedback. Any testing with people will follow NJIT's requirements for research involving human participants.</w:t>
       </w:r>
     </w:p>
     <w:p>

</xml_diff>

<commit_message>
Fill in team responsibilities in Table 4
Goal 1 is assigned to Asmar Hasanova, Goal 2 to Dorukhan Cakir and Zeynep
Hafsa Cakici, and Goal 3 to Merrick Simmons. The project-wide row and the
lead/support split are replaced by a single responsible-members column,
and Section 4.4 explains that Goal 2 is shared and that project-wide tasks
belong to the whole team.

Co-Authored-By: Claude Opus 5.5 <noreply@anthropic.com>
Claude-Session: https://claude.ai/code/session_01Ghe1P8BgNsyGdHuD4xCbdv
</commit_message>
<xml_diff>
--- a/docs/ECE_414_Proposal_Draft.docx
+++ b/docs/ECE_414_Proposal_Draft.docx
@@ -3425,7 +3425,7 @@
           <w:sz w:val="24"/>
           <w:szCs w:val="24"/>
         </w:rPr>
-        <w:t xml:space="preserve">Each team member will lead one area and support another, so that every goal has at least two people who understand it and the project does not depend on a single person for any part. Shared tasks, including the schedule, reports, presentations and user testing, are coordinated by the project-wide lead. The assignments will be finalized by the team and are listed in Table 4.</w:t>
+        <w:t xml:space="preserve">Each technical goal has a responsible team member, listed in Table 4. Goal 2 has the most separate components, from the sentence builder and touchscreen interface to translation, text-to-speech and speech recognition, so it is shared by two members. Tasks that span the whole project, including the schedule, reports, presentations and testing with Deaf ASL users, are shared by the entire team, and members will support each other at integration points such as the interface between the recognizer and the sentence builder.</w:t>
       </w:r>
     </w:p>
     <w:p>
@@ -4428,10 +4428,9 @@
         </w:tblBorders>
       </w:tblPr>
       <w:tblGrid>
-        <w:gridCol w:w="2000"/>
-        <w:gridCol w:w="1300"/>
-        <w:gridCol w:w="1300"/>
-        <w:gridCol w:w="4760"/>
+        <w:gridCol w:w="2600"/>
+        <w:gridCol w:w="2400"/>
+        <w:gridCol w:w="4360"/>
       </w:tblGrid>
       <w:tr>
         <w:trPr>
@@ -4440,7 +4439,7 @@
         </w:trPr>
         <w:tc>
           <w:tcPr>
-            <w:tcW w:type="dxa" w:w="2000"/>
+            <w:tcW w:type="dxa" w:w="2600"/>
             <w:tcBorders>
               <w:top w:val="single" w:color="000000" w:sz="12"/>
               <w:left w:val="none" w:color="FFFFFF" w:sz="0"/>
@@ -4463,13 +4462,13 @@
                 <w:b/>
                 <w:bCs/>
               </w:rPr>
-              <w:t xml:space="preserve">Area</w:t>
-            </w:r>
-          </w:p>
-        </w:tc>
-        <w:tc>
-          <w:tcPr>
-            <w:tcW w:type="dxa" w:w="1300"/>
+              <w:t xml:space="preserve">Goal</w:t>
+            </w:r>
+          </w:p>
+        </w:tc>
+        <w:tc>
+          <w:tcPr>
+            <w:tcW w:type="dxa" w:w="2400"/>
             <w:tcBorders>
               <w:top w:val="single" w:color="000000" w:sz="12"/>
               <w:left w:val="none" w:color="FFFFFF" w:sz="0"/>
@@ -4492,42 +4491,13 @@
                 <w:b/>
                 <w:bCs/>
               </w:rPr>
-              <w:t xml:space="preserve">Lead</w:t>
-            </w:r>
-          </w:p>
-        </w:tc>
-        <w:tc>
-          <w:tcPr>
-            <w:tcW w:type="dxa" w:w="1300"/>
-            <w:tcBorders>
-              <w:top w:val="single" w:color="000000" w:sz="12"/>
-              <w:left w:val="none" w:color="FFFFFF" w:sz="0"/>
-              <w:bottom w:val="single" w:color="000000" w:sz="4"/>
-              <w:right w:val="none" w:color="FFFFFF" w:sz="0"/>
-            </w:tcBorders>
-            <w:tcMar>
-              <w:top w:type="dxa" w:w="80"/>
-              <w:left w:type="dxa" w:w="80"/>
-              <w:bottom w:type="dxa" w:w="80"/>
-              <w:right w:type="dxa" w:w="80"/>
-            </w:tcMar>
-          </w:tcPr>
-          <w:p>
-            <w:pPr>
-              <w:keepNext/>
-            </w:pPr>
-            <w:r>
-              <w:rPr>
-                <w:b/>
-                <w:bCs/>
-              </w:rPr>
-              <w:t xml:space="preserve">Support</w:t>
-            </w:r>
-          </w:p>
-        </w:tc>
-        <w:tc>
-          <w:tcPr>
-            <w:tcW w:type="dxa" w:w="4760"/>
+              <w:t xml:space="preserve">Responsible members</w:t>
+            </w:r>
+          </w:p>
+        </w:tc>
+        <w:tc>
+          <w:tcPr>
+            <w:tcW w:type="dxa" w:w="4360"/>
             <w:tcBorders>
               <w:top w:val="single" w:color="000000" w:sz="12"/>
               <w:left w:val="none" w:color="FFFFFF" w:sz="0"/>
@@ -4562,7 +4532,7 @@
         </w:trPr>
         <w:tc>
           <w:tcPr>
-            <w:tcW w:type="dxa" w:w="2000"/>
+            <w:tcW w:type="dxa" w:w="2600"/>
             <w:tcBorders>
               <w:top w:val="single" w:color="000000" w:sz="4"/>
               <w:left w:val="none" w:color="FFFFFF" w:sz="0"/>
@@ -4591,7 +4561,7 @@
         </w:tc>
         <w:tc>
           <w:tcPr>
-            <w:tcW w:type="dxa" w:w="1300"/>
+            <w:tcW w:type="dxa" w:w="2400"/>
             <w:tcBorders>
               <w:top w:val="single" w:color="000000" w:sz="4"/>
               <w:left w:val="none" w:color="FFFFFF" w:sz="0"/>
@@ -4614,42 +4584,13 @@
                 <w:b w:val="false"/>
                 <w:bCs w:val="false"/>
               </w:rPr>
-              <w:t xml:space="preserve">To be assigned</w:t>
-            </w:r>
-          </w:p>
-        </w:tc>
-        <w:tc>
-          <w:tcPr>
-            <w:tcW w:type="dxa" w:w="1300"/>
-            <w:tcBorders>
-              <w:top w:val="single" w:color="000000" w:sz="4"/>
-              <w:left w:val="none" w:color="FFFFFF" w:sz="0"/>
-              <w:bottom w:val="none" w:color="FFFFFF" w:sz="0"/>
-              <w:right w:val="none" w:color="FFFFFF" w:sz="0"/>
-            </w:tcBorders>
-            <w:tcMar>
-              <w:top w:type="dxa" w:w="50"/>
-              <w:left w:type="dxa" w:w="80"/>
-              <w:bottom w:type="dxa" w:w="50"/>
-              <w:right w:type="dxa" w:w="80"/>
-            </w:tcMar>
-          </w:tcPr>
-          <w:p>
-            <w:pPr>
-              <w:keepNext/>
-            </w:pPr>
-            <w:r>
-              <w:rPr>
-                <w:b w:val="false"/>
-                <w:bCs w:val="false"/>
-              </w:rPr>
-              <w:t xml:space="preserve">To be assigned</w:t>
-            </w:r>
-          </w:p>
-        </w:tc>
-        <w:tc>
-          <w:tcPr>
-            <w:tcW w:type="dxa" w:w="4760"/>
+              <w:t xml:space="preserve">Asmar Hasanova</w:t>
+            </w:r>
+          </w:p>
+        </w:tc>
+        <w:tc>
+          <w:tcPr>
+            <w:tcW w:type="dxa" w:w="4360"/>
             <w:tcBorders>
               <w:top w:val="single" w:color="000000" w:sz="4"/>
               <w:left w:val="none" w:color="FFFFFF" w:sz="0"/>
@@ -4684,7 +4625,7 @@
         </w:trPr>
         <w:tc>
           <w:tcPr>
-            <w:tcW w:type="dxa" w:w="2000"/>
+            <w:tcW w:type="dxa" w:w="2600"/>
             <w:tcBorders>
               <w:top w:val="none" w:color="FFFFFF" w:sz="0"/>
               <w:left w:val="none" w:color="FFFFFF" w:sz="0"/>
@@ -4713,7 +4654,7 @@
         </w:tc>
         <w:tc>
           <w:tcPr>
-            <w:tcW w:type="dxa" w:w="1300"/>
+            <w:tcW w:type="dxa" w:w="2400"/>
             <w:tcBorders>
               <w:top w:val="none" w:color="FFFFFF" w:sz="0"/>
               <w:left w:val="none" w:color="FFFFFF" w:sz="0"/>
@@ -4736,42 +4677,13 @@
                 <w:b w:val="false"/>
                 <w:bCs w:val="false"/>
               </w:rPr>
-              <w:t xml:space="preserve">To be assigned</w:t>
-            </w:r>
-          </w:p>
-        </w:tc>
-        <w:tc>
-          <w:tcPr>
-            <w:tcW w:type="dxa" w:w="1300"/>
-            <w:tcBorders>
-              <w:top w:val="none" w:color="FFFFFF" w:sz="0"/>
-              <w:left w:val="none" w:color="FFFFFF" w:sz="0"/>
-              <w:bottom w:val="none" w:color="FFFFFF" w:sz="0"/>
-              <w:right w:val="none" w:color="FFFFFF" w:sz="0"/>
-            </w:tcBorders>
-            <w:tcMar>
-              <w:top w:type="dxa" w:w="50"/>
-              <w:left w:type="dxa" w:w="80"/>
-              <w:bottom w:type="dxa" w:w="50"/>
-              <w:right w:type="dxa" w:w="80"/>
-            </w:tcMar>
-          </w:tcPr>
-          <w:p>
-            <w:pPr>
-              <w:keepNext/>
-            </w:pPr>
-            <w:r>
-              <w:rPr>
-                <w:b w:val="false"/>
-                <w:bCs w:val="false"/>
-              </w:rPr>
-              <w:t xml:space="preserve">To be assigned</w:t>
-            </w:r>
-          </w:p>
-        </w:tc>
-        <w:tc>
-          <w:tcPr>
-            <w:tcW w:type="dxa" w:w="4760"/>
+              <w:t xml:space="preserve">Dorukhan Cakir, Zeynep Hafsa Cakici</w:t>
+            </w:r>
+          </w:p>
+        </w:tc>
+        <w:tc>
+          <w:tcPr>
+            <w:tcW w:type="dxa" w:w="4360"/>
             <w:tcBorders>
               <w:top w:val="none" w:color="FFFFFF" w:sz="0"/>
               <w:left w:val="none" w:color="FFFFFF" w:sz="0"/>
@@ -4806,11 +4718,11 @@
         </w:trPr>
         <w:tc>
           <w:tcPr>
-            <w:tcW w:type="dxa" w:w="2000"/>
+            <w:tcW w:type="dxa" w:w="2600"/>
             <w:tcBorders>
               <w:top w:val="none" w:color="FFFFFF" w:sz="0"/>
               <w:left w:val="none" w:color="FFFFFF" w:sz="0"/>
-              <w:bottom w:val="none" w:color="FFFFFF" w:sz="0"/>
+              <w:bottom w:val="single" w:color="000000" w:sz="12"/>
               <w:right w:val="none" w:color="FFFFFF" w:sz="0"/>
             </w:tcBorders>
             <w:tcMar>
@@ -4822,7 +4734,7 @@
           </w:tcPr>
           <w:p>
             <w:pPr>
-              <w:keepNext/>
+              <w:keepNext w:val="false"/>
             </w:pPr>
             <w:r>
               <w:rPr>
@@ -4835,11 +4747,11 @@
         </w:tc>
         <w:tc>
           <w:tcPr>
-            <w:tcW w:type="dxa" w:w="1300"/>
+            <w:tcW w:type="dxa" w:w="2400"/>
             <w:tcBorders>
               <w:top w:val="none" w:color="FFFFFF" w:sz="0"/>
               <w:left w:val="none" w:color="FFFFFF" w:sz="0"/>
-              <w:bottom w:val="none" w:color="FFFFFF" w:sz="0"/>
+              <w:bottom w:val="single" w:color="000000" w:sz="12"/>
               <w:right w:val="none" w:color="FFFFFF" w:sz="0"/>
             </w:tcBorders>
             <w:tcMar>
@@ -4851,24 +4763,24 @@
           </w:tcPr>
           <w:p>
             <w:pPr>
-              <w:keepNext/>
+              <w:keepNext w:val="false"/>
             </w:pPr>
             <w:r>
               <w:rPr>
                 <w:b w:val="false"/>
                 <w:bCs w:val="false"/>
               </w:rPr>
-              <w:t xml:space="preserve">To be assigned</w:t>
-            </w:r>
-          </w:p>
-        </w:tc>
-        <w:tc>
-          <w:tcPr>
-            <w:tcW w:type="dxa" w:w="1300"/>
+              <w:t xml:space="preserve">Merrick Simmons</w:t>
+            </w:r>
+          </w:p>
+        </w:tc>
+        <w:tc>
+          <w:tcPr>
+            <w:tcW w:type="dxa" w:w="4360"/>
             <w:tcBorders>
               <w:top w:val="none" w:color="FFFFFF" w:sz="0"/>
               <w:left w:val="none" w:color="FFFFFF" w:sz="0"/>
-              <w:bottom w:val="none" w:color="FFFFFF" w:sz="0"/>
+              <w:bottom w:val="single" w:color="000000" w:sz="12"/>
               <w:right w:val="none" w:color="FFFFFF" w:sz="0"/>
             </w:tcBorders>
             <w:tcMar>
@@ -4880,36 +4792,7 @@
           </w:tcPr>
           <w:p>
             <w:pPr>
-              <w:keepNext/>
-            </w:pPr>
-            <w:r>
-              <w:rPr>
-                <w:b w:val="false"/>
-                <w:bCs w:val="false"/>
-              </w:rPr>
-              <w:t xml:space="preserve">To be assigned</w:t>
-            </w:r>
-          </w:p>
-        </w:tc>
-        <w:tc>
-          <w:tcPr>
-            <w:tcW w:type="dxa" w:w="4760"/>
-            <w:tcBorders>
-              <w:top w:val="none" w:color="FFFFFF" w:sz="0"/>
-              <w:left w:val="none" w:color="FFFFFF" w:sz="0"/>
-              <w:bottom w:val="none" w:color="FFFFFF" w:sz="0"/>
-              <w:right w:val="none" w:color="FFFFFF" w:sz="0"/>
-            </w:tcBorders>
-            <w:tcMar>
-              <w:top w:type="dxa" w:w="50"/>
-              <w:left w:type="dxa" w:w="80"/>
-              <w:bottom w:type="dxa" w:w="50"/>
-              <w:right w:type="dxa" w:w="80"/>
-            </w:tcMar>
-          </w:tcPr>
-          <w:p>
-            <w:pPr>
-              <w:keepNext/>
+              <w:keepNext w:val="false"/>
             </w:pPr>
             <w:r>
               <w:rPr>
@@ -4917,128 +4800,6 @@
                 <w:bCs w:val="false"/>
               </w:rPr>
               <w:t xml:space="preserve">Hardware purchase and setup, enclosure, deployment and optimization on the Jetson Orin Nano, frame-rate and power measurement</w:t>
-            </w:r>
-          </w:p>
-        </w:tc>
-      </w:tr>
-      <w:tr>
-        <w:trPr>
-          <w:cantSplit/>
-          <w:tblHeader w:val="false"/>
-        </w:trPr>
-        <w:tc>
-          <w:tcPr>
-            <w:tcW w:type="dxa" w:w="2000"/>
-            <w:tcBorders>
-              <w:top w:val="none" w:color="FFFFFF" w:sz="0"/>
-              <w:left w:val="none" w:color="FFFFFF" w:sz="0"/>
-              <w:bottom w:val="single" w:color="000000" w:sz="12"/>
-              <w:right w:val="none" w:color="FFFFFF" w:sz="0"/>
-            </w:tcBorders>
-            <w:tcMar>
-              <w:top w:type="dxa" w:w="50"/>
-              <w:left w:type="dxa" w:w="80"/>
-              <w:bottom w:type="dxa" w:w="50"/>
-              <w:right w:type="dxa" w:w="80"/>
-            </w:tcMar>
-          </w:tcPr>
-          <w:p>
-            <w:pPr>
-              <w:keepNext w:val="false"/>
-            </w:pPr>
-            <w:r>
-              <w:rPr>
-                <w:b w:val="false"/>
-                <w:bCs w:val="false"/>
-              </w:rPr>
-              <w:t xml:space="preserve">Project-wide</w:t>
-            </w:r>
-          </w:p>
-        </w:tc>
-        <w:tc>
-          <w:tcPr>
-            <w:tcW w:type="dxa" w:w="1300"/>
-            <w:tcBorders>
-              <w:top w:val="none" w:color="FFFFFF" w:sz="0"/>
-              <w:left w:val="none" w:color="FFFFFF" w:sz="0"/>
-              <w:bottom w:val="single" w:color="000000" w:sz="12"/>
-              <w:right w:val="none" w:color="FFFFFF" w:sz="0"/>
-            </w:tcBorders>
-            <w:tcMar>
-              <w:top w:type="dxa" w:w="50"/>
-              <w:left w:type="dxa" w:w="80"/>
-              <w:bottom w:type="dxa" w:w="50"/>
-              <w:right w:type="dxa" w:w="80"/>
-            </w:tcMar>
-          </w:tcPr>
-          <w:p>
-            <w:pPr>
-              <w:keepNext w:val="false"/>
-            </w:pPr>
-            <w:r>
-              <w:rPr>
-                <w:b w:val="false"/>
-                <w:bCs w:val="false"/>
-              </w:rPr>
-              <w:t xml:space="preserve">To be assigned</w:t>
-            </w:r>
-          </w:p>
-        </w:tc>
-        <w:tc>
-          <w:tcPr>
-            <w:tcW w:type="dxa" w:w="1300"/>
-            <w:tcBorders>
-              <w:top w:val="none" w:color="FFFFFF" w:sz="0"/>
-              <w:left w:val="none" w:color="FFFFFF" w:sz="0"/>
-              <w:bottom w:val="single" w:color="000000" w:sz="12"/>
-              <w:right w:val="none" w:color="FFFFFF" w:sz="0"/>
-            </w:tcBorders>
-            <w:tcMar>
-              <w:top w:type="dxa" w:w="50"/>
-              <w:left w:type="dxa" w:w="80"/>
-              <w:bottom w:type="dxa" w:w="50"/>
-              <w:right w:type="dxa" w:w="80"/>
-            </w:tcMar>
-          </w:tcPr>
-          <w:p>
-            <w:pPr>
-              <w:keepNext w:val="false"/>
-            </w:pPr>
-            <w:r>
-              <w:rPr>
-                <w:b w:val="false"/>
-                <w:bCs w:val="false"/>
-              </w:rPr>
-              <w:t xml:space="preserve">To be assigned</w:t>
-            </w:r>
-          </w:p>
-        </w:tc>
-        <w:tc>
-          <w:tcPr>
-            <w:tcW w:type="dxa" w:w="4760"/>
-            <w:tcBorders>
-              <w:top w:val="none" w:color="FFFFFF" w:sz="0"/>
-              <w:left w:val="none" w:color="FFFFFF" w:sz="0"/>
-              <w:bottom w:val="single" w:color="000000" w:sz="12"/>
-              <w:right w:val="none" w:color="FFFFFF" w:sz="0"/>
-            </w:tcBorders>
-            <w:tcMar>
-              <w:top w:type="dxa" w:w="50"/>
-              <w:left w:type="dxa" w:w="80"/>
-              <w:bottom w:type="dxa" w:w="50"/>
-              <w:right w:type="dxa" w:w="80"/>
-            </w:tcMar>
-          </w:tcPr>
-          <w:p>
-            <w:pPr>
-              <w:keepNext w:val="false"/>
-            </w:pPr>
-            <w:r>
-              <w:rPr>
-                <w:b w:val="false"/>
-                <w:bCs w:val="false"/>
-              </w:rPr>
-              <w:t xml:space="preserve">Schedule and milestones, reports and presentations, user testing with Deaf ASL users, documentation</w:t>
             </w:r>
           </w:p>
         </w:tc>

</xml_diff>